<commit_message>
docs: sync latest workspace overview and pricing demonstration
</commit_message>
<xml_diff>
--- a/项目说明书.docx
+++ b/项目说明书.docx
@@ -7,12 +7,16 @@
         <w:pStyle w:val="Title"/>
       </w:pPr>
       <w:r>
+        <w:rPr>
+          <w:rFonts w:ascii="微软雅黑" w:hAnsi="微软雅黑" w:eastAsia="微软雅黑" w:cs="微软雅黑"/>
+        </w:rPr>
         <w:t>PC Studio 项目说明书</w:t>
       </w:r>
     </w:p>
     <w:p>
       <w:r>
         <w:rPr>
+          <w:rFonts w:ascii="微软雅黑" w:hAnsi="微软雅黑" w:eastAsia="微软雅黑" w:cs="微软雅黑"/>
           <w:b/>
         </w:rPr>
         <w:t>华为 PC 门店营销工作台</w:t>
@@ -21,6 +25,7 @@
     <w:p>
       <w:r>
         <w:rPr>
+          <w:rFonts w:ascii="微软雅黑" w:hAnsi="微软雅黑" w:eastAsia="微软雅黑" w:cs="微软雅黑"/>
           <w:b w:val="0"/>
         </w:rPr>
         <w:t>深藏 blue 队  |  华为产业进阶赛道  |  2026 年 10 月 23 日</w:t>
@@ -29,6 +34,7 @@
     <w:p>
       <w:r>
         <w:rPr>
+          <w:rFonts w:ascii="微软雅黑" w:hAnsi="微软雅黑" w:eastAsia="微软雅黑" w:cs="微软雅黑"/>
           <w:b w:val="0"/>
         </w:rPr>
         <w:t>PC Studio 面向华为门店员工，把选产品、写图文、做配图、查依据和顾客跟进放进同一个工作台。员工可以从一句不完整的想法开始，由 Agent 引导补齐信息，产出适合目标平台的营销图文，并继续承接顾客咨询。</w:t>
@@ -39,6 +45,9 @@
         <w:pStyle w:val="Heading2"/>
       </w:pPr>
       <w:r>
+        <w:rPr>
+          <w:rFonts w:ascii="微软雅黑" w:hAnsi="微软雅黑" w:eastAsia="微软雅黑" w:cs="微软雅黑"/>
+        </w:rPr>
         <w:t>先看功能  再看优势</w:t>
       </w:r>
     </w:p>
@@ -82,6 +91,7 @@
             </w:pPr>
             <w:r>
               <w:rPr>
+                <w:rFonts w:ascii="微软雅黑" w:hAnsi="微软雅黑" w:eastAsia="微软雅黑" w:cs="微软雅黑"/>
                 <w:b/>
                 <w:color w:val="FFFFFF"/>
                 <w:sz w:val="18"/>
@@ -114,6 +124,7 @@
             </w:pPr>
             <w:r>
               <w:rPr>
+                <w:rFonts w:ascii="微软雅黑" w:hAnsi="微软雅黑" w:eastAsia="微软雅黑" w:cs="微软雅黑"/>
                 <w:b/>
                 <w:color w:val="FFFFFF"/>
                 <w:sz w:val="18"/>
@@ -150,6 +161,7 @@
             </w:pPr>
             <w:r>
               <w:rPr>
+                <w:rFonts w:ascii="微软雅黑" w:hAnsi="微软雅黑" w:eastAsia="微软雅黑" w:cs="微软雅黑"/>
                 <w:b w:val="0"/>
                 <w:sz w:val="18"/>
               </w:rPr>
@@ -180,6 +192,7 @@
             </w:pPr>
             <w:r>
               <w:rPr>
+                <w:rFonts w:ascii="微软雅黑" w:hAnsi="微软雅黑" w:eastAsia="微软雅黑" w:cs="微软雅黑"/>
                 <w:b w:val="0"/>
                 <w:sz w:val="18"/>
               </w:rPr>
@@ -216,6 +229,7 @@
             </w:pPr>
             <w:r>
               <w:rPr>
+                <w:rFonts w:ascii="微软雅黑" w:hAnsi="微软雅黑" w:eastAsia="微软雅黑" w:cs="微软雅黑"/>
                 <w:b w:val="0"/>
                 <w:sz w:val="18"/>
               </w:rPr>
@@ -247,6 +261,7 @@
             </w:pPr>
             <w:r>
               <w:rPr>
+                <w:rFonts w:ascii="微软雅黑" w:hAnsi="微软雅黑" w:eastAsia="微软雅黑" w:cs="微软雅黑"/>
                 <w:b w:val="0"/>
                 <w:sz w:val="18"/>
               </w:rPr>
@@ -282,6 +297,7 @@
             </w:pPr>
             <w:r>
               <w:rPr>
+                <w:rFonts w:ascii="微软雅黑" w:hAnsi="微软雅黑" w:eastAsia="微软雅黑" w:cs="微软雅黑"/>
                 <w:b w:val="0"/>
                 <w:sz w:val="18"/>
               </w:rPr>
@@ -312,6 +328,7 @@
             </w:pPr>
             <w:r>
               <w:rPr>
+                <w:rFonts w:ascii="微软雅黑" w:hAnsi="微软雅黑" w:eastAsia="微软雅黑" w:cs="微软雅黑"/>
                 <w:b w:val="0"/>
                 <w:sz w:val="18"/>
               </w:rPr>
@@ -348,6 +365,7 @@
             </w:pPr>
             <w:r>
               <w:rPr>
+                <w:rFonts w:ascii="微软雅黑" w:hAnsi="微软雅黑" w:eastAsia="微软雅黑" w:cs="微软雅黑"/>
                 <w:b w:val="0"/>
                 <w:sz w:val="18"/>
               </w:rPr>
@@ -379,6 +397,7 @@
             </w:pPr>
             <w:r>
               <w:rPr>
+                <w:rFonts w:ascii="微软雅黑" w:hAnsi="微软雅黑" w:eastAsia="微软雅黑" w:cs="微软雅黑"/>
                 <w:b w:val="0"/>
                 <w:sz w:val="18"/>
               </w:rPr>
@@ -414,6 +433,7 @@
             </w:pPr>
             <w:r>
               <w:rPr>
+                <w:rFonts w:ascii="微软雅黑" w:hAnsi="微软雅黑" w:eastAsia="微软雅黑" w:cs="微软雅黑"/>
                 <w:b w:val="0"/>
                 <w:sz w:val="18"/>
               </w:rPr>
@@ -444,6 +464,7 @@
             </w:pPr>
             <w:r>
               <w:rPr>
+                <w:rFonts w:ascii="微软雅黑" w:hAnsi="微软雅黑" w:eastAsia="微软雅黑" w:cs="微软雅黑"/>
                 <w:b w:val="0"/>
                 <w:sz w:val="18"/>
               </w:rPr>
@@ -458,12 +479,16 @@
         <w:pStyle w:val="Heading2"/>
       </w:pPr>
       <w:r>
+        <w:rPr>
+          <w:rFonts w:ascii="微软雅黑" w:hAnsi="微软雅黑" w:eastAsia="微软雅黑" w:cs="微软雅黑"/>
+        </w:rPr>
         <w:t>回应一线真正关心的三件事</w:t>
       </w:r>
     </w:p>
     <w:p>
       <w:r>
         <w:rPr>
+          <w:rFonts w:ascii="微软雅黑" w:hAnsi="微软雅黑" w:eastAsia="微软雅黑" w:cs="微软雅黑"/>
           <w:b w:val="0"/>
         </w:rPr>
         <w:t>内容要吸引人，素材要对应真实产品，操作要足够简单。我们以营销图文创作为主线，用平台表达、生图协作和知识引用提升内容可用性；成交助手把内容之后的咨询与跟进接起来。</w:t>
@@ -472,6 +497,7 @@
     <w:p>
       <w:r>
         <w:rPr>
+          <w:rFonts w:ascii="微软雅黑" w:hAnsi="微软雅黑" w:eastAsia="微软雅黑" w:cs="微软雅黑"/>
           <w:b w:val="0"/>
         </w:rPr>
         <w:t>阅读导航：第 2—6 页介绍五项优势与实现；第 7—9 页展示三组真实图文案例；第 10—12 页说明自研架构、赛题回应及部署边界。</w:t>
@@ -483,12 +509,16 @@
         <w:pageBreakBefore/>
       </w:pPr>
       <w:r>
+        <w:rPr>
+          <w:rFonts w:ascii="微软雅黑" w:hAnsi="微软雅黑" w:eastAsia="微软雅黑" w:cs="微软雅黑"/>
+        </w:rPr>
         <w:t>01  从一句想法开始创作</w:t>
       </w:r>
     </w:p>
     <w:p>
       <w:r>
         <w:rPr>
+          <w:rFonts w:ascii="微软雅黑" w:hAnsi="微软雅黑" w:eastAsia="微软雅黑" w:cs="微软雅黑"/>
           <w:b w:val="0"/>
         </w:rPr>
         <w:t>店员不必先把需求写完整。明确型号时，围绕已选产品展开；只有“出差办公”“开学购机”等场景时，先推荐候选并展示原因，再由员工选择。后续提问用于推进当前任务，已经确认的人群和型号应持续带入。</w:t>
@@ -501,6 +531,9 @@
         <w:jc w:val="center"/>
       </w:pPr>
       <w:r>
+        <w:rPr>
+          <w:rFonts w:ascii="微软雅黑" w:hAnsi="微软雅黑" w:eastAsia="微软雅黑" w:cs="微软雅黑"/>
+        </w:rPr>
         <w:drawing>
           <wp:inline xmlns:a="http://schemas.openxmlformats.org/drawingml/2006/main" xmlns:pic="http://schemas.openxmlformats.org/drawingml/2006/picture">
             <wp:extent cx="5940000" cy="1485000"/>
@@ -542,6 +575,7 @@
       </w:pPr>
       <w:r>
         <w:rPr>
+          <w:rFonts w:ascii="微软雅黑" w:hAnsi="微软雅黑" w:eastAsia="微软雅黑" w:cs="微软雅黑"/>
           <w:color w:val="5B6470"/>
           <w:sz w:val="16"/>
         </w:rPr>
@@ -553,6 +587,9 @@
         <w:pStyle w:val="Heading2"/>
       </w:pPr>
       <w:r>
+        <w:rPr>
+          <w:rFonts w:ascii="微软雅黑" w:hAnsi="微软雅黑" w:eastAsia="微软雅黑" w:cs="微软雅黑"/>
+        </w:rPr>
         <w:t>交互变化</w:t>
       </w:r>
     </w:p>
@@ -597,6 +634,7 @@
             </w:pPr>
             <w:r>
               <w:rPr>
+                <w:rFonts w:ascii="微软雅黑" w:hAnsi="微软雅黑" w:eastAsia="微软雅黑" w:cs="微软雅黑"/>
                 <w:b/>
                 <w:color w:val="FFFFFF"/>
                 <w:sz w:val="18"/>
@@ -629,6 +667,7 @@
             </w:pPr>
             <w:r>
               <w:rPr>
+                <w:rFonts w:ascii="微软雅黑" w:hAnsi="微软雅黑" w:eastAsia="微软雅黑" w:cs="微软雅黑"/>
                 <w:b/>
                 <w:color w:val="FFFFFF"/>
                 <w:sz w:val="18"/>
@@ -661,6 +700,7 @@
             </w:pPr>
             <w:r>
               <w:rPr>
+                <w:rFonts w:ascii="微软雅黑" w:hAnsi="微软雅黑" w:eastAsia="微软雅黑" w:cs="微软雅黑"/>
                 <w:b/>
                 <w:color w:val="FFFFFF"/>
                 <w:sz w:val="18"/>
@@ -697,6 +737,7 @@
             </w:pPr>
             <w:r>
               <w:rPr>
+                <w:rFonts w:ascii="微软雅黑" w:hAnsi="微软雅黑" w:eastAsia="微软雅黑" w:cs="微软雅黑"/>
                 <w:b w:val="0"/>
                 <w:sz w:val="18"/>
               </w:rPr>
@@ -727,6 +768,7 @@
             </w:pPr>
             <w:r>
               <w:rPr>
+                <w:rFonts w:ascii="微软雅黑" w:hAnsi="微软雅黑" w:eastAsia="微软雅黑" w:cs="微软雅黑"/>
                 <w:b w:val="0"/>
                 <w:sz w:val="18"/>
               </w:rPr>
@@ -757,6 +799,7 @@
             </w:pPr>
             <w:r>
               <w:rPr>
+                <w:rFonts w:ascii="微软雅黑" w:hAnsi="微软雅黑" w:eastAsia="微软雅黑" w:cs="微软雅黑"/>
                 <w:b w:val="0"/>
                 <w:sz w:val="18"/>
               </w:rPr>
@@ -793,6 +836,7 @@
             </w:pPr>
             <w:r>
               <w:rPr>
+                <w:rFonts w:ascii="微软雅黑" w:hAnsi="微软雅黑" w:eastAsia="微软雅黑" w:cs="微软雅黑"/>
                 <w:b w:val="0"/>
                 <w:sz w:val="18"/>
               </w:rPr>
@@ -824,6 +868,7 @@
             </w:pPr>
             <w:r>
               <w:rPr>
+                <w:rFonts w:ascii="微软雅黑" w:hAnsi="微软雅黑" w:eastAsia="微软雅黑" w:cs="微软雅黑"/>
                 <w:b w:val="0"/>
                 <w:sz w:val="18"/>
               </w:rPr>
@@ -855,6 +900,7 @@
             </w:pPr>
             <w:r>
               <w:rPr>
+                <w:rFonts w:ascii="微软雅黑" w:hAnsi="微软雅黑" w:eastAsia="微软雅黑" w:cs="微软雅黑"/>
                 <w:b w:val="0"/>
                 <w:sz w:val="18"/>
               </w:rPr>
@@ -890,6 +936,7 @@
             </w:pPr>
             <w:r>
               <w:rPr>
+                <w:rFonts w:ascii="微软雅黑" w:hAnsi="微软雅黑" w:eastAsia="微软雅黑" w:cs="微软雅黑"/>
                 <w:b w:val="0"/>
                 <w:sz w:val="18"/>
               </w:rPr>
@@ -920,6 +967,7 @@
             </w:pPr>
             <w:r>
               <w:rPr>
+                <w:rFonts w:ascii="微软雅黑" w:hAnsi="微软雅黑" w:eastAsia="微软雅黑" w:cs="微软雅黑"/>
                 <w:b w:val="0"/>
                 <w:sz w:val="18"/>
               </w:rPr>
@@ -950,6 +998,7 @@
             </w:pPr>
             <w:r>
               <w:rPr>
+                <w:rFonts w:ascii="微软雅黑" w:hAnsi="微软雅黑" w:eastAsia="微软雅黑" w:cs="微软雅黑"/>
                 <w:b w:val="0"/>
                 <w:sz w:val="18"/>
               </w:rPr>
@@ -964,12 +1013,16 @@
         <w:pStyle w:val="Heading2"/>
       </w:pPr>
       <w:r>
+        <w:rPr>
+          <w:rFonts w:ascii="微软雅黑" w:hAnsi="微软雅黑" w:eastAsia="微软雅黑" w:cs="微软雅黑"/>
+        </w:rPr>
         <w:t>实现方式</w:t>
       </w:r>
     </w:p>
     <w:p>
       <w:r>
         <w:rPr>
+          <w:rFonts w:ascii="微软雅黑" w:hAnsi="微软雅黑" w:eastAsia="微软雅黑" w:cs="微软雅黑"/>
           <w:b w:val="0"/>
         </w:rPr>
         <w:t>主 Agent 读取会话消息和已确认任务状态，先分析新输入，再判断信息缺口。规划模型选择追问、推荐、生成、修改或成交辅助等动作；需要确认时可返回选择项与补充输入。服务端保存消息、任务和产物，为同一会话续写提供上下文。</w:t>
@@ -980,12 +1033,16 @@
         <w:pStyle w:val="Heading2"/>
       </w:pPr>
       <w:r>
+        <w:rPr>
+          <w:rFonts w:ascii="微软雅黑" w:hAnsi="微软雅黑" w:eastAsia="微软雅黑" w:cs="微软雅黑"/>
+        </w:rPr>
         <w:t>为什么比前置表单更省力</w:t>
       </w:r>
     </w:p>
     <w:p>
       <w:r>
         <w:rPr>
+          <w:rFonts w:ascii="微软雅黑" w:hAnsi="微软雅黑" w:eastAsia="微软雅黑" w:cs="微软雅黑"/>
           <w:b w:val="0"/>
         </w:rPr>
         <w:t>员工只需确认当前最关键的选择。已经在首句出现的“大学生”“出差办公”等信息应直接复用；不知道选哪款时，由 Agent 给出有资料支持的建议，避免把推荐责任重新交回员工。统一工作台界面见第 5 页图 3。</w:t>
@@ -994,6 +1051,7 @@
     <w:p>
       <w:r>
         <w:rPr>
+          <w:rFonts w:ascii="微软雅黑" w:hAnsi="微软雅黑" w:eastAsia="微软雅黑" w:cs="微软雅黑"/>
           <w:b w:val="0"/>
         </w:rPr>
         <w:t>工程入口：taskAgent.cjs、llmClient.cjs、sessionStore.cjs。会话持久化已具备；长对话摘要质量、故障恢复后的状态一致性仍需要持续回归验证。</w:t>
@@ -1005,12 +1063,16 @@
         <w:pageBreakBefore/>
       </w:pPr>
       <w:r>
+        <w:rPr>
+          <w:rFonts w:ascii="微软雅黑" w:hAnsi="微软雅黑" w:eastAsia="微软雅黑" w:cs="微软雅黑"/>
+        </w:rPr>
         <w:t>02  同一产品适配不同平台</w:t>
       </w:r>
     </w:p>
     <w:p>
       <w:r>
         <w:rPr>
+          <w:rFonts w:ascii="微软雅黑" w:hAnsi="微软雅黑" w:eastAsia="微软雅黑" w:cs="微软雅黑"/>
           <w:b w:val="0"/>
         </w:rPr>
         <w:t>平台 Skills 把“发到哪里”转化为具体写法。产品事实保持一致，内容角度、段落结构、语气、配图计划和行动引导随平台变化，减少员工拿到稿件后再手工改成平台风格的工作。</w:t>
@@ -1057,6 +1119,7 @@
             </w:pPr>
             <w:r>
               <w:rPr>
+                <w:rFonts w:ascii="微软雅黑" w:hAnsi="微软雅黑" w:eastAsia="微软雅黑" w:cs="微软雅黑"/>
                 <w:b/>
                 <w:color w:val="FFFFFF"/>
                 <w:sz w:val="18"/>
@@ -1089,6 +1152,7 @@
             </w:pPr>
             <w:r>
               <w:rPr>
+                <w:rFonts w:ascii="微软雅黑" w:hAnsi="微软雅黑" w:eastAsia="微软雅黑" w:cs="微软雅黑"/>
                 <w:b/>
                 <w:color w:val="FFFFFF"/>
                 <w:sz w:val="18"/>
@@ -1121,6 +1185,7 @@
             </w:pPr>
             <w:r>
               <w:rPr>
+                <w:rFonts w:ascii="微软雅黑" w:hAnsi="微软雅黑" w:eastAsia="微软雅黑" w:cs="微软雅黑"/>
                 <w:b/>
                 <w:color w:val="FFFFFF"/>
                 <w:sz w:val="18"/>
@@ -1157,6 +1222,7 @@
             </w:pPr>
             <w:r>
               <w:rPr>
+                <w:rFonts w:ascii="微软雅黑" w:hAnsi="微软雅黑" w:eastAsia="微软雅黑" w:cs="微软雅黑"/>
                 <w:b w:val="0"/>
                 <w:sz w:val="18"/>
               </w:rPr>
@@ -1187,6 +1253,7 @@
             </w:pPr>
             <w:r>
               <w:rPr>
+                <w:rFonts w:ascii="微软雅黑" w:hAnsi="微软雅黑" w:eastAsia="微软雅黑" w:cs="微软雅黑"/>
                 <w:b w:val="0"/>
                 <w:sz w:val="18"/>
               </w:rPr>
@@ -1217,6 +1284,7 @@
             </w:pPr>
             <w:r>
               <w:rPr>
+                <w:rFonts w:ascii="微软雅黑" w:hAnsi="微软雅黑" w:eastAsia="微软雅黑" w:cs="微软雅黑"/>
                 <w:b w:val="0"/>
                 <w:sz w:val="18"/>
               </w:rPr>
@@ -1253,6 +1321,7 @@
             </w:pPr>
             <w:r>
               <w:rPr>
+                <w:rFonts w:ascii="微软雅黑" w:hAnsi="微软雅黑" w:eastAsia="微软雅黑" w:cs="微软雅黑"/>
                 <w:b w:val="0"/>
                 <w:sz w:val="18"/>
               </w:rPr>
@@ -1284,6 +1353,7 @@
             </w:pPr>
             <w:r>
               <w:rPr>
+                <w:rFonts w:ascii="微软雅黑" w:hAnsi="微软雅黑" w:eastAsia="微软雅黑" w:cs="微软雅黑"/>
                 <w:b w:val="0"/>
                 <w:sz w:val="18"/>
               </w:rPr>
@@ -1315,6 +1385,7 @@
             </w:pPr>
             <w:r>
               <w:rPr>
+                <w:rFonts w:ascii="微软雅黑" w:hAnsi="微软雅黑" w:eastAsia="微软雅黑" w:cs="微软雅黑"/>
                 <w:b w:val="0"/>
                 <w:sz w:val="18"/>
               </w:rPr>
@@ -1350,6 +1421,7 @@
             </w:pPr>
             <w:r>
               <w:rPr>
+                <w:rFonts w:ascii="微软雅黑" w:hAnsi="微软雅黑" w:eastAsia="微软雅黑" w:cs="微软雅黑"/>
                 <w:b w:val="0"/>
                 <w:sz w:val="18"/>
               </w:rPr>
@@ -1380,6 +1452,7 @@
             </w:pPr>
             <w:r>
               <w:rPr>
+                <w:rFonts w:ascii="微软雅黑" w:hAnsi="微软雅黑" w:eastAsia="微软雅黑" w:cs="微软雅黑"/>
                 <w:b w:val="0"/>
                 <w:sz w:val="18"/>
               </w:rPr>
@@ -1410,6 +1483,7 @@
             </w:pPr>
             <w:r>
               <w:rPr>
+                <w:rFonts w:ascii="微软雅黑" w:hAnsi="微软雅黑" w:eastAsia="微软雅黑" w:cs="微软雅黑"/>
                 <w:b w:val="0"/>
                 <w:sz w:val="18"/>
               </w:rPr>
@@ -1446,6 +1520,7 @@
             </w:pPr>
             <w:r>
               <w:rPr>
+                <w:rFonts w:ascii="微软雅黑" w:hAnsi="微软雅黑" w:eastAsia="微软雅黑" w:cs="微软雅黑"/>
                 <w:b w:val="0"/>
                 <w:sz w:val="18"/>
               </w:rPr>
@@ -1477,6 +1552,7 @@
             </w:pPr>
             <w:r>
               <w:rPr>
+                <w:rFonts w:ascii="微软雅黑" w:hAnsi="微软雅黑" w:eastAsia="微软雅黑" w:cs="微软雅黑"/>
                 <w:b w:val="0"/>
                 <w:sz w:val="18"/>
               </w:rPr>
@@ -1508,6 +1584,7 @@
             </w:pPr>
             <w:r>
               <w:rPr>
+                <w:rFonts w:ascii="微软雅黑" w:hAnsi="微软雅黑" w:eastAsia="微软雅黑" w:cs="微软雅黑"/>
                 <w:b w:val="0"/>
                 <w:sz w:val="18"/>
               </w:rPr>
@@ -1543,6 +1620,7 @@
             </w:pPr>
             <w:r>
               <w:rPr>
+                <w:rFonts w:ascii="微软雅黑" w:hAnsi="微软雅黑" w:eastAsia="微软雅黑" w:cs="微软雅黑"/>
                 <w:b w:val="0"/>
                 <w:sz w:val="18"/>
               </w:rPr>
@@ -1573,6 +1651,7 @@
             </w:pPr>
             <w:r>
               <w:rPr>
+                <w:rFonts w:ascii="微软雅黑" w:hAnsi="微软雅黑" w:eastAsia="微软雅黑" w:cs="微软雅黑"/>
                 <w:b w:val="0"/>
                 <w:sz w:val="18"/>
               </w:rPr>
@@ -1603,6 +1682,7 @@
             </w:pPr>
             <w:r>
               <w:rPr>
+                <w:rFonts w:ascii="微软雅黑" w:hAnsi="微软雅黑" w:eastAsia="微软雅黑" w:cs="微软雅黑"/>
                 <w:b w:val="0"/>
                 <w:sz w:val="18"/>
               </w:rPr>
@@ -1639,6 +1719,7 @@
             </w:pPr>
             <w:r>
               <w:rPr>
+                <w:rFonts w:ascii="微软雅黑" w:hAnsi="微软雅黑" w:eastAsia="微软雅黑" w:cs="微软雅黑"/>
                 <w:b w:val="0"/>
                 <w:sz w:val="18"/>
               </w:rPr>
@@ -1670,6 +1751,7 @@
             </w:pPr>
             <w:r>
               <w:rPr>
+                <w:rFonts w:ascii="微软雅黑" w:hAnsi="微软雅黑" w:eastAsia="微软雅黑" w:cs="微软雅黑"/>
                 <w:b w:val="0"/>
                 <w:sz w:val="18"/>
               </w:rPr>
@@ -1701,6 +1783,7 @@
             </w:pPr>
             <w:r>
               <w:rPr>
+                <w:rFonts w:ascii="微软雅黑" w:hAnsi="微软雅黑" w:eastAsia="微软雅黑" w:cs="微软雅黑"/>
                 <w:b w:val="0"/>
                 <w:sz w:val="18"/>
               </w:rPr>
@@ -1715,12 +1798,16 @@
         <w:pStyle w:val="Heading2"/>
       </w:pPr>
       <w:r>
+        <w:rPr>
+          <w:rFonts w:ascii="微软雅黑" w:hAnsi="微软雅黑" w:eastAsia="微软雅黑" w:cs="微软雅黑"/>
+        </w:rPr>
         <w:t>规则如何进入生成</w:t>
       </w:r>
     </w:p>
     <w:p>
       <w:r>
         <w:rPr>
+          <w:rFonts w:ascii="微软雅黑" w:hAnsi="微软雅黑" w:eastAsia="微软雅黑" w:cs="微软雅黑"/>
           <w:b w:val="0"/>
         </w:rPr>
         <w:t>平台规则来自根目录 SKILL.md，copywritingSkill.cjs 和 platformStrategies.cjs 根据本次平台加载对应内容，并用于策划、写作与审稿。模型先决定选题角度、读者关注点与段落安排，再输出正文；图片计划也应承接该角度。</w:t>
@@ -1731,12 +1818,16 @@
         <w:pStyle w:val="Heading2"/>
       </w:pPr>
       <w:r>
+        <w:rPr>
+          <w:rFonts w:ascii="微软雅黑" w:hAnsi="微软雅黑" w:eastAsia="微软雅黑" w:cs="微软雅黑"/>
+        </w:rPr>
         <w:t>真实输出中的可见差别</w:t>
       </w:r>
     </w:p>
     <w:p>
       <w:r>
         <w:rPr>
+          <w:rFonts w:ascii="微软雅黑" w:hAnsi="微软雅黑" w:eastAsia="微软雅黑" w:cs="微软雅黑"/>
           <w:b w:val="0"/>
         </w:rPr>
         <w:t>小红书案例以“出差装包时，我会先看它有多重”为标题，末尾询问读者最在意重量、屏幕还是接口，并带主题标签。公众号案例则以“装进包里和落座之后都要想一想”为主张，沿赶路、阅读、会议连接逐段解释，且不带话题标签。两篇原文节选见第 7、8 页。</w:t>
@@ -1745,6 +1836,7 @@
     <w:p>
       <w:r>
         <w:rPr>
+          <w:rFonts w:ascii="微软雅黑" w:hAnsi="微软雅黑" w:eastAsia="微软雅黑" w:cs="微软雅黑"/>
           <w:b w:val="0"/>
         </w:rPr>
         <w:t>这两组记录的产品不同，只用于说明实际表达形态，不能作为控制变量的平台效果实验。下一步应固定型号、受众与目标进行跨平台盲评，重点检查开头、结构与语气是否真的不同。</w:t>
@@ -1755,12 +1847,16 @@
         <w:pStyle w:val="Heading2"/>
       </w:pPr>
       <w:r>
+        <w:rPr>
+          <w:rFonts w:ascii="微软雅黑" w:hAnsi="微软雅黑" w:eastAsia="微软雅黑" w:cs="微软雅黑"/>
+        </w:rPr>
         <w:t>让事实约束留在后台</w:t>
       </w:r>
     </w:p>
     <w:p>
       <w:r>
         <w:rPr>
+          <w:rFonts w:ascii="微软雅黑" w:hAnsi="微软雅黑" w:eastAsia="微软雅黑" w:cs="微软雅黑"/>
           <w:b w:val="0"/>
         </w:rPr>
         <w:t>不编造续航、价格或体验，是创作规则；正文用准确表述和引用角标承接依据，不机械堆叠“资料未提供”“实际受测量方法影响”等防御性话语。涉及具体版本和系统差异时保留必要条件，不虚构亲身长期使用经历。</w:t>
@@ -1772,12 +1868,16 @@
         <w:pageBreakBefore/>
       </w:pPr>
       <w:r>
+        <w:rPr>
+          <w:rFonts w:ascii="微软雅黑" w:hAnsi="微软雅黑" w:eastAsia="微软雅黑" w:cs="微软雅黑"/>
+        </w:rPr>
         <w:t>03  生图子 Agent 协作完成配图</w:t>
       </w:r>
     </w:p>
     <w:p>
       <w:r>
         <w:rPr>
+          <w:rFonts w:ascii="微软雅黑" w:hAnsi="微软雅黑" w:eastAsia="微软雅黑" w:cs="微软雅黑"/>
           <w:b w:val="0"/>
         </w:rPr>
         <w:t>员工描述一次需求，主 Agent 就把已确认的产品、受众、平台、视觉要求与配图计划交给生图子 Agent。图片需要服务段落内容：封面建立产品识别，内文图回应携带、阅读、会议等场景。多张图通过场景、光线和构图形成变化。</w:t>
@@ -1790,6 +1890,9 @@
         <w:jc w:val="center"/>
       </w:pPr>
       <w:r>
+        <w:rPr>
+          <w:rFonts w:ascii="微软雅黑" w:hAnsi="微软雅黑" w:eastAsia="微软雅黑" w:cs="微软雅黑"/>
+        </w:rPr>
         <w:drawing>
           <wp:inline xmlns:a="http://schemas.openxmlformats.org/drawingml/2006/main" xmlns:pic="http://schemas.openxmlformats.org/drawingml/2006/picture">
             <wp:extent cx="2304000" cy="2304000"/>
@@ -1831,6 +1934,7 @@
       </w:pPr>
       <w:r>
         <w:rPr>
+          <w:rFonts w:ascii="微软雅黑" w:hAnsi="微软雅黑" w:eastAsia="微软雅黑" w:cs="微软雅黑"/>
           <w:color w:val="5B6470"/>
           <w:sz w:val="16"/>
         </w:rPr>
@@ -1842,6 +1946,9 @@
         <w:pStyle w:val="Heading2"/>
       </w:pPr>
       <w:r>
+        <w:rPr>
+          <w:rFonts w:ascii="微软雅黑" w:hAnsi="微软雅黑" w:eastAsia="微软雅黑" w:cs="微软雅黑"/>
+        </w:rPr>
         <w:t>当前实现的两条生图路径</w:t>
       </w:r>
     </w:p>
@@ -1886,6 +1993,7 @@
             </w:pPr>
             <w:r>
               <w:rPr>
+                <w:rFonts w:ascii="微软雅黑" w:hAnsi="微软雅黑" w:eastAsia="微软雅黑" w:cs="微软雅黑"/>
                 <w:b/>
                 <w:color w:val="FFFFFF"/>
                 <w:sz w:val="18"/>
@@ -1918,6 +2026,7 @@
             </w:pPr>
             <w:r>
               <w:rPr>
+                <w:rFonts w:ascii="微软雅黑" w:hAnsi="微软雅黑" w:eastAsia="微软雅黑" w:cs="微软雅黑"/>
                 <w:b/>
                 <w:color w:val="FFFFFF"/>
                 <w:sz w:val="18"/>
@@ -1950,6 +2059,7 @@
             </w:pPr>
             <w:r>
               <w:rPr>
+                <w:rFonts w:ascii="微软雅黑" w:hAnsi="微软雅黑" w:eastAsia="微软雅黑" w:cs="微软雅黑"/>
                 <w:b/>
                 <w:color w:val="FFFFFF"/>
                 <w:sz w:val="18"/>
@@ -1986,6 +2096,7 @@
             </w:pPr>
             <w:r>
               <w:rPr>
+                <w:rFonts w:ascii="微软雅黑" w:hAnsi="微软雅黑" w:eastAsia="微软雅黑" w:cs="微软雅黑"/>
                 <w:b w:val="0"/>
                 <w:sz w:val="18"/>
               </w:rPr>
@@ -2016,6 +2127,7 @@
             </w:pPr>
             <w:r>
               <w:rPr>
+                <w:rFonts w:ascii="微软雅黑" w:hAnsi="微软雅黑" w:eastAsia="微软雅黑" w:cs="微软雅黑"/>
                 <w:b w:val="0"/>
                 <w:sz w:val="18"/>
               </w:rPr>
@@ -2046,6 +2158,7 @@
             </w:pPr>
             <w:r>
               <w:rPr>
+                <w:rFonts w:ascii="微软雅黑" w:hAnsi="微软雅黑" w:eastAsia="微软雅黑" w:cs="微软雅黑"/>
                 <w:b w:val="0"/>
                 <w:sz w:val="18"/>
               </w:rPr>
@@ -2082,6 +2195,7 @@
             </w:pPr>
             <w:r>
               <w:rPr>
+                <w:rFonts w:ascii="微软雅黑" w:hAnsi="微软雅黑" w:eastAsia="微软雅黑" w:cs="微软雅黑"/>
                 <w:b w:val="0"/>
                 <w:sz w:val="18"/>
               </w:rPr>
@@ -2113,6 +2227,7 @@
             </w:pPr>
             <w:r>
               <w:rPr>
+                <w:rFonts w:ascii="微软雅黑" w:hAnsi="微软雅黑" w:eastAsia="微软雅黑" w:cs="微软雅黑"/>
                 <w:b w:val="0"/>
                 <w:sz w:val="18"/>
               </w:rPr>
@@ -2144,6 +2259,7 @@
             </w:pPr>
             <w:r>
               <w:rPr>
+                <w:rFonts w:ascii="微软雅黑" w:hAnsi="微软雅黑" w:eastAsia="微软雅黑" w:cs="微软雅黑"/>
                 <w:b w:val="0"/>
                 <w:sz w:val="18"/>
               </w:rPr>
@@ -2158,12 +2274,16 @@
         <w:pStyle w:val="Heading2"/>
       </w:pPr>
       <w:r>
+        <w:rPr>
+          <w:rFonts w:ascii="微软雅黑" w:hAnsi="微软雅黑" w:eastAsia="微软雅黑" w:cs="微软雅黑"/>
+        </w:rPr>
         <w:t>工程职责与失败处理</w:t>
       </w:r>
     </w:p>
     <w:p>
       <w:r>
         <w:rPr>
+          <w:rFonts w:ascii="微软雅黑" w:hAnsi="微软雅黑" w:eastAsia="微软雅黑" w:cs="微软雅黑"/>
           <w:b w:val="0"/>
         </w:rPr>
         <w:t>主流程负责检索和准备产品资料、素材与图文计划；子 Agent 负责素材处理、调用图片服务、合成或编辑、保存产物并回传图片元数据。接口预留使图片能力可以由独立成员维护，再接入统一任务。</w:t>
@@ -2172,6 +2292,7 @@
     <w:p>
       <w:r>
         <w:rPr>
+          <w:rFonts w:ascii="微软雅黑" w:hAnsi="微软雅黑" w:eastAsia="微软雅黑" w:cs="微软雅黑"/>
           <w:b w:val="0"/>
         </w:rPr>
         <w:t>图片数量受任务计划和后端上限共同限制。单张失败、超时或素材处理失败时，按已有回退逻辑使用官方素材并记录告警；请求多张不代表每张都生成成功。凭证与图片服务配置仅保留在后端。</w:t>
@@ -2180,6 +2301,7 @@
     <w:p>
       <w:r>
         <w:rPr>
+          <w:rFonts w:ascii="微软雅黑" w:hAnsi="微软雅黑" w:eastAsia="微软雅黑" w:cs="微软雅黑"/>
           <w:b w:val="0"/>
         </w:rPr>
         <w:t>实现位置：services/api/src/agent/imageAgent/。图 2 的会话记录模式为 ai_reference_edit，不将其描述为抠图合成结果。</w:t>
@@ -2191,12 +2313,16 @@
         <w:pageBreakBefore/>
       </w:pPr>
       <w:r>
+        <w:rPr>
+          <w:rFonts w:ascii="微软雅黑" w:hAnsi="微软雅黑" w:eastAsia="微软雅黑" w:cs="微软雅黑"/>
+        </w:rPr>
         <w:t>04  学产品和查依据在同一处完成</w:t>
       </w:r>
     </w:p>
     <w:p>
       <w:r>
         <w:rPr>
+          <w:rFonts w:ascii="微软雅黑" w:hAnsi="微软雅黑" w:eastAsia="微软雅黑" w:cs="微软雅黑"/>
           <w:b w:val="0"/>
         </w:rPr>
         <w:t>门店员工既是内容作者，也是产品讲解者。PC Studio 将产品线速览、产品知识库和内容创作连接起来：先理解定位与适用任务，创作时调用资料，生成后点击正文角标回到对应知识库条目。</w:t>
@@ -2209,6 +2335,9 @@
         <w:jc w:val="center"/>
       </w:pPr>
       <w:r>
+        <w:rPr>
+          <w:rFonts w:ascii="微软雅黑" w:hAnsi="微软雅黑" w:eastAsia="微软雅黑" w:cs="微软雅黑"/>
+        </w:rPr>
         <w:drawing>
           <wp:inline xmlns:a="http://schemas.openxmlformats.org/drawingml/2006/main" xmlns:pic="http://schemas.openxmlformats.org/drawingml/2006/picture">
             <wp:extent cx="3478292" cy="3311999"/>
@@ -2250,6 +2379,7 @@
       </w:pPr>
       <w:r>
         <w:rPr>
+          <w:rFonts w:ascii="微软雅黑" w:hAnsi="微软雅黑" w:eastAsia="微软雅黑" w:cs="微软雅黑"/>
           <w:color w:val="5B6470"/>
           <w:sz w:val="16"/>
         </w:rPr>
@@ -2261,12 +2391,16 @@
         <w:pStyle w:val="Heading2"/>
       </w:pPr>
       <w:r>
+        <w:rPr>
+          <w:rFonts w:ascii="微软雅黑" w:hAnsi="微软雅黑" w:eastAsia="微软雅黑" w:cs="微软雅黑"/>
+        </w:rPr>
         <w:t>一条产品事实的使用路径</w:t>
       </w:r>
     </w:p>
     <w:p>
       <w:r>
         <w:rPr>
+          <w:rFonts w:ascii="微软雅黑" w:hAnsi="微软雅黑" w:eastAsia="微软雅黑" w:cs="微软雅黑"/>
           <w:b w:val="0"/>
         </w:rPr>
         <w:t>官方公开资料整理为本地知识条目 → 检索本次型号相关证据 → 模型用已获支持的事实写作 → 后端把证据标记转换为引用编号 → 员工点击角标查看对应产品知识库。</w:t>
@@ -2313,6 +2447,7 @@
             </w:pPr>
             <w:r>
               <w:rPr>
+                <w:rFonts w:ascii="微软雅黑" w:hAnsi="微软雅黑" w:eastAsia="微软雅黑" w:cs="微软雅黑"/>
                 <w:b/>
                 <w:color w:val="FFFFFF"/>
                 <w:sz w:val="18"/>
@@ -2345,6 +2480,7 @@
             </w:pPr>
             <w:r>
               <w:rPr>
+                <w:rFonts w:ascii="微软雅黑" w:hAnsi="微软雅黑" w:eastAsia="微软雅黑" w:cs="微软雅黑"/>
                 <w:b/>
                 <w:color w:val="FFFFFF"/>
                 <w:sz w:val="18"/>
@@ -2377,6 +2513,7 @@
             </w:pPr>
             <w:r>
               <w:rPr>
+                <w:rFonts w:ascii="微软雅黑" w:hAnsi="微软雅黑" w:eastAsia="微软雅黑" w:cs="微软雅黑"/>
                 <w:b/>
                 <w:color w:val="FFFFFF"/>
                 <w:sz w:val="18"/>
@@ -2413,6 +2550,7 @@
             </w:pPr>
             <w:r>
               <w:rPr>
+                <w:rFonts w:ascii="微软雅黑" w:hAnsi="微软雅黑" w:eastAsia="微软雅黑" w:cs="微软雅黑"/>
                 <w:b w:val="0"/>
                 <w:sz w:val="18"/>
               </w:rPr>
@@ -2443,6 +2581,7 @@
             </w:pPr>
             <w:r>
               <w:rPr>
+                <w:rFonts w:ascii="微软雅黑" w:hAnsi="微软雅黑" w:eastAsia="微软雅黑" w:cs="微软雅黑"/>
                 <w:b w:val="0"/>
                 <w:sz w:val="18"/>
               </w:rPr>
@@ -2473,6 +2612,7 @@
             </w:pPr>
             <w:r>
               <w:rPr>
+                <w:rFonts w:ascii="微软雅黑" w:hAnsi="微软雅黑" w:eastAsia="微软雅黑" w:cs="微软雅黑"/>
                 <w:b w:val="0"/>
                 <w:sz w:val="18"/>
               </w:rPr>
@@ -2509,6 +2649,7 @@
             </w:pPr>
             <w:r>
               <w:rPr>
+                <w:rFonts w:ascii="微软雅黑" w:hAnsi="微软雅黑" w:eastAsia="微软雅黑" w:cs="微软雅黑"/>
                 <w:b w:val="0"/>
                 <w:sz w:val="18"/>
               </w:rPr>
@@ -2540,6 +2681,7 @@
             </w:pPr>
             <w:r>
               <w:rPr>
+                <w:rFonts w:ascii="微软雅黑" w:hAnsi="微软雅黑" w:eastAsia="微软雅黑" w:cs="微软雅黑"/>
                 <w:b w:val="0"/>
                 <w:sz w:val="18"/>
               </w:rPr>
@@ -2571,6 +2713,7 @@
             </w:pPr>
             <w:r>
               <w:rPr>
+                <w:rFonts w:ascii="微软雅黑" w:hAnsi="微软雅黑" w:eastAsia="微软雅黑" w:cs="微软雅黑"/>
                 <w:b w:val="0"/>
                 <w:sz w:val="18"/>
               </w:rPr>
@@ -2606,6 +2749,7 @@
             </w:pPr>
             <w:r>
               <w:rPr>
+                <w:rFonts w:ascii="微软雅黑" w:hAnsi="微软雅黑" w:eastAsia="微软雅黑" w:cs="微软雅黑"/>
                 <w:b w:val="0"/>
                 <w:sz w:val="18"/>
               </w:rPr>
@@ -2636,6 +2780,7 @@
             </w:pPr>
             <w:r>
               <w:rPr>
+                <w:rFonts w:ascii="微软雅黑" w:hAnsi="微软雅黑" w:eastAsia="微软雅黑" w:cs="微软雅黑"/>
                 <w:b w:val="0"/>
                 <w:sz w:val="18"/>
               </w:rPr>
@@ -2666,6 +2811,7 @@
             </w:pPr>
             <w:r>
               <w:rPr>
+                <w:rFonts w:ascii="微软雅黑" w:hAnsi="微软雅黑" w:eastAsia="微软雅黑" w:cs="微软雅黑"/>
                 <w:b w:val="0"/>
                 <w:sz w:val="18"/>
               </w:rPr>
@@ -2702,6 +2848,7 @@
             </w:pPr>
             <w:r>
               <w:rPr>
+                <w:rFonts w:ascii="微软雅黑" w:hAnsi="微软雅黑" w:eastAsia="微软雅黑" w:cs="微软雅黑"/>
                 <w:b w:val="0"/>
                 <w:sz w:val="18"/>
               </w:rPr>
@@ -2733,6 +2880,7 @@
             </w:pPr>
             <w:r>
               <w:rPr>
+                <w:rFonts w:ascii="微软雅黑" w:hAnsi="微软雅黑" w:eastAsia="微软雅黑" w:cs="微软雅黑"/>
                 <w:b w:val="0"/>
                 <w:sz w:val="18"/>
               </w:rPr>
@@ -2764,6 +2912,7 @@
             </w:pPr>
             <w:r>
               <w:rPr>
+                <w:rFonts w:ascii="微软雅黑" w:hAnsi="微软雅黑" w:eastAsia="微软雅黑" w:cs="微软雅黑"/>
                 <w:b w:val="0"/>
                 <w:sz w:val="18"/>
               </w:rPr>
@@ -2776,6 +2925,7 @@
     <w:p>
       <w:r>
         <w:rPr>
+          <w:rFonts w:ascii="微软雅黑" w:hAnsi="微软雅黑" w:eastAsia="微软雅黑" w:cs="微软雅黑"/>
           <w:b w:val="0"/>
         </w:rPr>
         <w:t>后端 contentCitations.cjs 依据本次证据建立正文引用；前端 knowledgeNavigation.jsx 打开知识库条目。跳转目标由系统控制，减少让模型自由编造链接的风险。当前跳转到条目层级，不宣称已逐句高亮原始资料。</w:t>
@@ -2787,12 +2937,16 @@
         <w:pageBreakBefore/>
       </w:pPr>
       <w:r>
+        <w:rPr>
+          <w:rFonts w:ascii="微软雅黑" w:hAnsi="微软雅黑" w:eastAsia="微软雅黑" w:cs="微软雅黑"/>
+        </w:rPr>
         <w:t>05  从顾客咨询延伸到成交跟进</w:t>
       </w:r>
     </w:p>
     <w:p>
       <w:r>
         <w:rPr>
+          <w:rFonts w:ascii="微软雅黑" w:hAnsi="微软雅黑" w:eastAsia="微软雅黑" w:cs="微软雅黑"/>
           <w:b w:val="0"/>
         </w:rPr>
         <w:t>同一对话入口也可以描述顾客预算、用途和顾虑，获得推荐依据、讲解话术、异议回应及第 1、3、7 天的跟进草稿。员工确认需要持续跟进后，再补齐工单信息，沉淀为客户工单。</w:t>
@@ -2803,434 +2957,39 @@
         <w:pStyle w:val="Heading2"/>
       </w:pPr>
       <w:r>
+        <w:rPr>
+          <w:rFonts w:ascii="微软雅黑" w:hAnsi="微软雅黑" w:eastAsia="微软雅黑" w:cs="微软雅黑"/>
+        </w:rPr>
         <w:t>真实成交辅助案例</w:t>
       </w:r>
     </w:p>
     <w:p>
       <w:r>
         <w:rPr>
+          <w:rFonts w:ascii="微软雅黑" w:hAnsi="微软雅黑" w:eastAsia="微软雅黑" w:cs="微软雅黑"/>
           <w:b w:val="0"/>
         </w:rPr>
-        <w:t>输入摘要：顾客预算 6000—8000 元，经常出差，处理 PPT、Excel、视频会议和投影；担心公司软件、Excel 插件兼容，也在比较线上价格，希望下周前换机。顾客尚未留联系方式。</w:t>
+        <w:t>顾客预算 6000—8000 元，经常出差，使用 PPT、Excel、视频会议与投影，顾虑软件插件兼容和渠道价格。选定 MateBook 14（鸿蒙版）后，系统沿用客户信息准备成交建议。</w:t>
       </w:r>
     </w:p>
     <w:p>
       <w:r>
         <w:rPr>
+          <w:rFonts w:ascii="微软雅黑" w:hAnsi="微软雅黑" w:eastAsia="微软雅黑" w:cs="微软雅黑"/>
           <w:b w:val="0"/>
         </w:rPr>
-        <w:t>运行结果优先核对软件与插件条件，再安排具体配置、报价和交付验证。客户选择 MateBook 14（鸿蒙版）后，继续围绕该型号生成成交建议，而不是重新收集软文发布平台。</w:t>
+        <w:t>第 1 天补齐软件与插件条件；第 3 天核对同配置价格和权益；第 7 天按购买状态收口。文案围绕顾客顾虑生成，由员工审核发送；无联系许可不主动触达，已购转使用帮助，明确拒绝则暂停。</w:t>
       </w:r>
     </w:p>
-    <w:tbl>
-      <w:tblPr>
-        <w:tblW w:type="auto" w:w="0"/>
-        <w:jc w:val="center"/>
-        <w:tblLayout w:type="fixed"/>
-        <w:tblLook w:firstColumn="1" w:firstRow="1" w:lastColumn="0" w:lastRow="0" w:noHBand="0" w:noVBand="1" w:val="04A0"/>
-      </w:tblPr>
-      <w:tblGrid>
-        <w:gridCol w:w="1247"/>
-        <w:gridCol w:w="4819"/>
-        <w:gridCol w:w="3628"/>
-      </w:tblGrid>
-      <w:tr>
-        <w:trPr>
-          <w:cantSplit/>
-          <w:tblHeader/>
-        </w:trPr>
-        <w:tc>
-          <w:tcPr>
-            <w:tcW w:type="dxa" w:w="1247"/>
-            <w:vAlign w:val="center"/>
-            <w:tcBorders>
-              <w:top w:val="single" w:sz="4" w:color="D9D9D9"/>
-              <w:left w:val="single" w:sz="4" w:color="D9D9D9"/>
-              <w:bottom w:val="single" w:sz="4" w:color="D9D9D9"/>
-              <w:right w:val="single" w:sz="4" w:color="D9D9D9"/>
-            </w:tcBorders>
-            <w:tcMar>
-              <w:top w:w="90" w:type="dxa"/>
-              <w:bottom w:w="90" w:type="dxa"/>
-              <w:left w:w="110" w:type="dxa"/>
-              <w:right w:w="110" w:type="dxa"/>
-            </w:tcMar>
-            <w:shd w:fill="253E56"/>
-          </w:tcPr>
-          <w:p>
-            <w:pPr>
-              <w:spacing w:after="40" w:line="276" w:lineRule="auto"/>
-            </w:pPr>
-            <w:r>
-              <w:rPr>
-                <w:b/>
-                <w:color w:val="FFFFFF"/>
-                <w:sz w:val="18"/>
-              </w:rPr>
-              <w:t>阶段</w:t>
-            </w:r>
-          </w:p>
-        </w:tc>
-        <w:tc>
-          <w:tcPr>
-            <w:tcW w:type="dxa" w:w="4819"/>
-            <w:vAlign w:val="center"/>
-            <w:tcBorders>
-              <w:top w:val="single" w:sz="4" w:color="D9D9D9"/>
-              <w:left w:val="single" w:sz="4" w:color="D9D9D9"/>
-              <w:bottom w:val="single" w:sz="4" w:color="D9D9D9"/>
-              <w:right w:val="single" w:sz="4" w:color="D9D9D9"/>
-            </w:tcBorders>
-            <w:tcMar>
-              <w:top w:w="90" w:type="dxa"/>
-              <w:bottom w:w="90" w:type="dxa"/>
-              <w:left w:w="110" w:type="dxa"/>
-              <w:right w:w="110" w:type="dxa"/>
-            </w:tcMar>
-            <w:shd w:fill="253E56"/>
-          </w:tcPr>
-          <w:p>
-            <w:pPr>
-              <w:spacing w:after="40" w:line="276" w:lineRule="auto"/>
-            </w:pPr>
-            <w:r>
-              <w:rPr>
-                <w:b/>
-                <w:color w:val="FFFFFF"/>
-                <w:sz w:val="18"/>
-              </w:rPr>
-              <w:t>本次记录中的跟进重点</w:t>
-            </w:r>
-          </w:p>
-        </w:tc>
-        <w:tc>
-          <w:tcPr>
-            <w:tcW w:type="dxa" w:w="3628"/>
-            <w:vAlign w:val="center"/>
-            <w:tcBorders>
-              <w:top w:val="single" w:sz="4" w:color="D9D9D9"/>
-              <w:left w:val="single" w:sz="4" w:color="D9D9D9"/>
-              <w:bottom w:val="single" w:sz="4" w:color="D9D9D9"/>
-              <w:right w:val="single" w:sz="4" w:color="D9D9D9"/>
-            </w:tcBorders>
-            <w:tcMar>
-              <w:top w:w="90" w:type="dxa"/>
-              <w:bottom w:w="90" w:type="dxa"/>
-              <w:left w:w="110" w:type="dxa"/>
-              <w:right w:w="110" w:type="dxa"/>
-            </w:tcMar>
-            <w:shd w:fill="253E56"/>
-          </w:tcPr>
-          <w:p>
-            <w:pPr>
-              <w:spacing w:after="40" w:line="276" w:lineRule="auto"/>
-            </w:pPr>
-            <w:r>
-              <w:rPr>
-                <w:b/>
-                <w:color w:val="FFFFFF"/>
-                <w:sz w:val="18"/>
-              </w:rPr>
-              <w:t>动作边界</w:t>
-            </w:r>
-          </w:p>
-        </w:tc>
-      </w:tr>
-      <w:tr>
-        <w:trPr>
-          <w:cantSplit/>
-        </w:trPr>
-        <w:tc>
-          <w:tcPr>
-            <w:tcW w:type="dxa" w:w="1247"/>
-            <w:vAlign w:val="center"/>
-            <w:tcBorders>
-              <w:top w:val="single" w:sz="4" w:color="D9D9D9"/>
-              <w:left w:val="single" w:sz="4" w:color="D9D9D9"/>
-              <w:bottom w:val="single" w:sz="4" w:color="D9D9D9"/>
-              <w:right w:val="single" w:sz="4" w:color="D9D9D9"/>
-            </w:tcBorders>
-            <w:tcMar>
-              <w:top w:w="90" w:type="dxa"/>
-              <w:bottom w:w="90" w:type="dxa"/>
-              <w:left w:w="110" w:type="dxa"/>
-              <w:right w:w="110" w:type="dxa"/>
-            </w:tcMar>
-          </w:tcPr>
-          <w:p>
-            <w:pPr>
-              <w:spacing w:after="40" w:line="276" w:lineRule="auto"/>
-            </w:pPr>
-            <w:r>
-              <w:rPr>
-                <w:b w:val="0"/>
-                <w:sz w:val="18"/>
-              </w:rPr>
-              <w:t>第 1 天</w:t>
-            </w:r>
-          </w:p>
-        </w:tc>
-        <w:tc>
-          <w:tcPr>
-            <w:tcW w:type="dxa" w:w="4819"/>
-            <w:vAlign w:val="center"/>
-            <w:tcBorders>
-              <w:top w:val="single" w:sz="4" w:color="D9D9D9"/>
-              <w:left w:val="single" w:sz="4" w:color="D9D9D9"/>
-              <w:bottom w:val="single" w:sz="4" w:color="D9D9D9"/>
-              <w:right w:val="single" w:sz="4" w:color="D9D9D9"/>
-            </w:tcBorders>
-            <w:tcMar>
-              <w:top w:w="90" w:type="dxa"/>
-              <w:bottom w:w="90" w:type="dxa"/>
-              <w:left w:w="110" w:type="dxa"/>
-              <w:right w:w="110" w:type="dxa"/>
-            </w:tcMar>
-          </w:tcPr>
-          <w:p>
-            <w:pPr>
-              <w:spacing w:after="40" w:line="276" w:lineRule="auto"/>
-            </w:pPr>
-            <w:r>
-              <w:rPr>
-                <w:b w:val="0"/>
-                <w:sz w:val="18"/>
-              </w:rPr>
-              <w:t>补齐必用软件和插件名称、版本</w:t>
-            </w:r>
-          </w:p>
-        </w:tc>
-        <w:tc>
-          <w:tcPr>
-            <w:tcW w:type="dxa" w:w="3628"/>
-            <w:vAlign w:val="center"/>
-            <w:tcBorders>
-              <w:top w:val="single" w:sz="4" w:color="D9D9D9"/>
-              <w:left w:val="single" w:sz="4" w:color="D9D9D9"/>
-              <w:bottom w:val="single" w:sz="4" w:color="D9D9D9"/>
-              <w:right w:val="single" w:sz="4" w:color="D9D9D9"/>
-            </w:tcBorders>
-            <w:tcMar>
-              <w:top w:w="90" w:type="dxa"/>
-              <w:bottom w:w="90" w:type="dxa"/>
-              <w:left w:w="110" w:type="dxa"/>
-              <w:right w:w="110" w:type="dxa"/>
-            </w:tcMar>
-          </w:tcPr>
-          <w:p>
-            <w:pPr>
-              <w:spacing w:after="40" w:line="276" w:lineRule="auto"/>
-            </w:pPr>
-            <w:r>
-              <w:rPr>
-                <w:b w:val="0"/>
-                <w:sz w:val="18"/>
-              </w:rPr>
-              <w:t>无联系方式或联系许可时，不主动触达</w:t>
-            </w:r>
-          </w:p>
-        </w:tc>
-      </w:tr>
-      <w:tr>
-        <w:trPr>
-          <w:cantSplit/>
-        </w:trPr>
-        <w:tc>
-          <w:tcPr>
-            <w:tcW w:type="dxa" w:w="1247"/>
-            <w:vAlign w:val="center"/>
-            <w:tcBorders>
-              <w:top w:val="single" w:sz="4" w:color="D9D9D9"/>
-              <w:left w:val="single" w:sz="4" w:color="D9D9D9"/>
-              <w:bottom w:val="single" w:sz="4" w:color="D9D9D9"/>
-              <w:right w:val="single" w:sz="4" w:color="D9D9D9"/>
-            </w:tcBorders>
-            <w:tcMar>
-              <w:top w:w="90" w:type="dxa"/>
-              <w:bottom w:w="90" w:type="dxa"/>
-              <w:left w:w="110" w:type="dxa"/>
-              <w:right w:w="110" w:type="dxa"/>
-            </w:tcMar>
-            <w:shd w:fill="F5F7FA"/>
-          </w:tcPr>
-          <w:p>
-            <w:pPr>
-              <w:spacing w:after="40" w:line="276" w:lineRule="auto"/>
-            </w:pPr>
-            <w:r>
-              <w:rPr>
-                <w:b w:val="0"/>
-                <w:sz w:val="18"/>
-              </w:rPr>
-              <w:t>第 3 天</w:t>
-            </w:r>
-          </w:p>
-        </w:tc>
-        <w:tc>
-          <w:tcPr>
-            <w:tcW w:type="dxa" w:w="4819"/>
-            <w:vAlign w:val="center"/>
-            <w:tcBorders>
-              <w:top w:val="single" w:sz="4" w:color="D9D9D9"/>
-              <w:left w:val="single" w:sz="4" w:color="D9D9D9"/>
-              <w:bottom w:val="single" w:sz="4" w:color="D9D9D9"/>
-              <w:right w:val="single" w:sz="4" w:color="D9D9D9"/>
-            </w:tcBorders>
-            <w:tcMar>
-              <w:top w:w="90" w:type="dxa"/>
-              <w:bottom w:w="90" w:type="dxa"/>
-              <w:left w:w="110" w:type="dxa"/>
-              <w:right w:w="110" w:type="dxa"/>
-            </w:tcMar>
-            <w:shd w:fill="F5F7FA"/>
-          </w:tcPr>
-          <w:p>
-            <w:pPr>
-              <w:spacing w:after="40" w:line="276" w:lineRule="auto"/>
-            </w:pPr>
-            <w:r>
-              <w:rPr>
-                <w:b w:val="0"/>
-                <w:sz w:val="18"/>
-              </w:rPr>
-              <w:t>核对所选配置的官网参考价、门店报价与权益</w:t>
-            </w:r>
-          </w:p>
-        </w:tc>
-        <w:tc>
-          <w:tcPr>
-            <w:tcW w:type="dxa" w:w="3628"/>
-            <w:vAlign w:val="center"/>
-            <w:tcBorders>
-              <w:top w:val="single" w:sz="4" w:color="D9D9D9"/>
-              <w:left w:val="single" w:sz="4" w:color="D9D9D9"/>
-              <w:bottom w:val="single" w:sz="4" w:color="D9D9D9"/>
-              <w:right w:val="single" w:sz="4" w:color="D9D9D9"/>
-            </w:tcBorders>
-            <w:tcMar>
-              <w:top w:w="90" w:type="dxa"/>
-              <w:bottom w:w="90" w:type="dxa"/>
-              <w:left w:w="110" w:type="dxa"/>
-              <w:right w:w="110" w:type="dxa"/>
-            </w:tcMar>
-            <w:shd w:fill="F5F7FA"/>
-          </w:tcPr>
-          <w:p>
-            <w:pPr>
-              <w:spacing w:after="40" w:line="276" w:lineRule="auto"/>
-            </w:pPr>
-            <w:r>
-              <w:rPr>
-                <w:b w:val="0"/>
-                <w:sz w:val="18"/>
-              </w:rPr>
-              <w:t>对齐同型号、配置、系统与套装再比较</w:t>
-            </w:r>
-          </w:p>
-        </w:tc>
-      </w:tr>
-      <w:tr>
-        <w:trPr>
-          <w:cantSplit/>
-        </w:trPr>
-        <w:tc>
-          <w:tcPr>
-            <w:tcW w:type="dxa" w:w="1247"/>
-            <w:vAlign w:val="center"/>
-            <w:tcBorders>
-              <w:top w:val="single" w:sz="4" w:color="D9D9D9"/>
-              <w:left w:val="single" w:sz="4" w:color="D9D9D9"/>
-              <w:bottom w:val="single" w:sz="4" w:color="D9D9D9"/>
-              <w:right w:val="single" w:sz="4" w:color="D9D9D9"/>
-            </w:tcBorders>
-            <w:tcMar>
-              <w:top w:w="90" w:type="dxa"/>
-              <w:bottom w:w="90" w:type="dxa"/>
-              <w:left w:w="110" w:type="dxa"/>
-              <w:right w:w="110" w:type="dxa"/>
-            </w:tcMar>
-          </w:tcPr>
-          <w:p>
-            <w:pPr>
-              <w:spacing w:after="40" w:line="276" w:lineRule="auto"/>
-            </w:pPr>
-            <w:r>
-              <w:rPr>
-                <w:b w:val="0"/>
-                <w:sz w:val="18"/>
-              </w:rPr>
-              <w:t>第 7 天</w:t>
-            </w:r>
-          </w:p>
-        </w:tc>
-        <w:tc>
-          <w:tcPr>
-            <w:tcW w:type="dxa" w:w="4819"/>
-            <w:vAlign w:val="center"/>
-            <w:tcBorders>
-              <w:top w:val="single" w:sz="4" w:color="D9D9D9"/>
-              <w:left w:val="single" w:sz="4" w:color="D9D9D9"/>
-              <w:bottom w:val="single" w:sz="4" w:color="D9D9D9"/>
-              <w:right w:val="single" w:sz="4" w:color="D9D9D9"/>
-            </w:tcBorders>
-            <w:tcMar>
-              <w:top w:w="90" w:type="dxa"/>
-              <w:bottom w:w="90" w:type="dxa"/>
-              <w:left w:w="110" w:type="dxa"/>
-              <w:right w:w="110" w:type="dxa"/>
-            </w:tcMar>
-          </w:tcPr>
-          <w:p>
-            <w:pPr>
-              <w:spacing w:after="40" w:line="276" w:lineRule="auto"/>
-            </w:pPr>
-            <w:r>
-              <w:rPr>
-                <w:b w:val="0"/>
-                <w:sz w:val="18"/>
-              </w:rPr>
-              <w:t>根据已购、仍在比较或暂不购买的状态收口</w:t>
-            </w:r>
-          </w:p>
-        </w:tc>
-        <w:tc>
-          <w:tcPr>
-            <w:tcW w:type="dxa" w:w="3628"/>
-            <w:vAlign w:val="center"/>
-            <w:tcBorders>
-              <w:top w:val="single" w:sz="4" w:color="D9D9D9"/>
-              <w:left w:val="single" w:sz="4" w:color="D9D9D9"/>
-              <w:bottom w:val="single" w:sz="4" w:color="D9D9D9"/>
-              <w:right w:val="single" w:sz="4" w:color="D9D9D9"/>
-            </w:tcBorders>
-            <w:tcMar>
-              <w:top w:w="90" w:type="dxa"/>
-              <w:bottom w:w="90" w:type="dxa"/>
-              <w:left w:w="110" w:type="dxa"/>
-              <w:right w:w="110" w:type="dxa"/>
-            </w:tcMar>
-          </w:tcPr>
-          <w:p>
-            <w:pPr>
-              <w:spacing w:after="40" w:line="276" w:lineRule="auto"/>
-            </w:pPr>
-            <w:r>
-              <w:rPr>
-                <w:b w:val="0"/>
-                <w:sz w:val="18"/>
-              </w:rPr>
-              <w:t>已购转使用帮助；拒绝或持续未回复则暂停</w:t>
-            </w:r>
-          </w:p>
-        </w:tc>
-      </w:tr>
-    </w:tbl>
     <w:p>
       <w:pPr>
         <w:pStyle w:val="Heading2"/>
       </w:pPr>
       <w:r>
-        <w:t>比价与跟进界面</w:t>
+        <w:rPr>
+          <w:rFonts w:ascii="微软雅黑" w:hAnsi="微软雅黑" w:eastAsia="微软雅黑" w:cs="微软雅黑"/>
+        </w:rPr>
+        <w:t>最新比价界面与核算逻辑</w:t>
       </w:r>
     </w:p>
     <w:p>
@@ -3240,9 +2999,12 @@
         <w:jc w:val="center"/>
       </w:pPr>
       <w:r>
+        <w:rPr>
+          <w:rFonts w:ascii="微软雅黑" w:hAnsi="微软雅黑" w:eastAsia="微软雅黑" w:cs="微软雅黑"/>
+        </w:rPr>
         <w:drawing>
           <wp:inline xmlns:a="http://schemas.openxmlformats.org/drawingml/2006/main" xmlns:pic="http://schemas.openxmlformats.org/drawingml/2006/picture">
-            <wp:extent cx="3248816" cy="2412000"/>
+            <wp:extent cx="5089471" cy="3240000"/>
             <wp:docPr id="4" name="Picture 4"/>
             <wp:cNvGraphicFramePr>
               <a:graphicFrameLocks noChangeAspect="1"/>
@@ -3251,7 +3013,7 @@
               <a:graphicData uri="http://schemas.openxmlformats.org/drawingml/2006/picture">
                 <pic:pic>
                   <pic:nvPicPr>
-                    <pic:cNvPr id="0" name="比价与跟进真实界面.png"/>
+                    <pic:cNvPr id="0" name="最新比价界面.png"/>
                     <pic:cNvPicPr/>
                   </pic:nvPicPr>
                   <pic:blipFill>
@@ -3263,7 +3025,7 @@
                   <pic:spPr>
                     <a:xfrm>
                       <a:off x="0" y="0"/>
-                      <a:ext cx="3248816" cy="2412000"/>
+                      <a:ext cx="5089471" cy="3240000"/>
                     </a:xfrm>
                     <a:prstGeom prst="rect"/>
                   </pic:spPr>
@@ -3281,26 +3043,38 @@
       </w:pPr>
       <w:r>
         <w:rPr>
+          <w:rFonts w:ascii="微软雅黑" w:hAnsi="微软雅黑" w:eastAsia="微软雅黑" w:cs="微软雅黑"/>
           <w:color w:val="5B6470"/>
           <w:sz w:val="16"/>
         </w:rPr>
-        <w:t>图 4  价格规划与跟进话术界面局部  来自项目已有测试截图</w:t>
+        <w:t>图 4  2026 年 10 月 23 日当前界面  同配置公开查询结果  局部截图</w:t>
       </w:r>
     </w:p>
     <w:p>
       <w:r>
         <w:rPr>
+          <w:rFonts w:ascii="微软雅黑" w:hAnsi="微软雅黑" w:eastAsia="微软雅黑" w:cs="微软雅黑"/>
           <w:b w:val="0"/>
         </w:rPr>
-        <w:t>价格服务按带日期与来源的官网公开快照筛选配置和预算；门店优惠组合由规则处理。跟进阶段框架由系统规定，具体文案结合客户顾虑生成，由店员审核后使用，不会自动发送。</w:t>
+        <w:t>打开比价或切换配置，自动查询商城商品页与教育专区并匹配配置。本例 16GB／512GB 公开售价 ¥5,899；历史价单列，教育优惠金额未取得时不当作已确认优惠，门店实报价可另行录入。</w:t>
       </w:r>
     </w:p>
     <w:p>
       <w:r>
         <w:rPr>
+          <w:rFonts w:ascii="微软雅黑" w:hAnsi="微软雅黑" w:eastAsia="微软雅黑" w:cs="微软雅黑"/>
           <w:b w:val="0"/>
         </w:rPr>
-        <w:t>案例记录：session_1792740427362_2d38ee。该记录已生成方案与跟进草稿；价格卡快照与文案对有效报价的判断仍存在口径不一致，不能据此承诺实时最低价或认定整个比价交互已通过回归。</w:t>
+        <w:t>国补属于条件试算：本例演示勾选后，按 15% 且上限 ¥1,500 预计为 ¥5,014.15，仍待当地政策与商品资格核实。</w:t>
+      </w:r>
+    </w:p>
+    <w:p>
+      <w:r>
+        <w:rPr>
+          <w:rFonts w:ascii="微软雅黑" w:hAnsi="微软雅黑" w:eastAsia="微软雅黑" w:cs="微软雅黑"/>
+          <w:b w:val="0"/>
+        </w:rPr>
+        <w:t>案例 session_1792740427362_2d38ee。本次验证公开查询与条件试算；历史成交文案未重新生成，其旧报价判断不代表最新查询结论。</w:t>
       </w:r>
     </w:p>
     <w:p>
@@ -3309,12 +3083,16 @@
         <w:pageBreakBefore/>
       </w:pPr>
       <w:r>
+        <w:rPr>
+          <w:rFonts w:ascii="微软雅黑" w:hAnsi="微软雅黑" w:eastAsia="微软雅黑" w:cs="微软雅黑"/>
+        </w:rPr>
         <w:t>06  案例一  出差办公的小红书图文</w:t>
       </w:r>
     </w:p>
     <w:p>
       <w:r>
         <w:rPr>
+          <w:rFonts w:ascii="微软雅黑" w:hAnsi="微软雅黑" w:eastAsia="微软雅黑" w:cs="微软雅黑"/>
           <w:b w:val="0"/>
         </w:rPr>
         <w:t>任务起点：员工只说明“想写一篇适合出差办公人群的软文，推荐几款便携的华为电脑”。在候选推荐后选择 HUAWEI MateBook 14 酷睿 Ultra，并确认小红书平台。</w:t>
@@ -3323,6 +3101,7 @@
     <w:p>
       <w:r>
         <w:rPr>
+          <w:rFonts w:ascii="微软雅黑" w:hAnsi="微软雅黑" w:eastAsia="微软雅黑" w:cs="微软雅黑"/>
           <w:b/>
         </w:rPr>
         <w:t>实际生成标题：出差装包时，我会先看它有多重</w:t>
@@ -3335,6 +3114,9 @@
         <w:jc w:val="center"/>
       </w:pPr>
       <w:r>
+        <w:rPr>
+          <w:rFonts w:ascii="微软雅黑" w:hAnsi="微软雅黑" w:eastAsia="微软雅黑" w:cs="微软雅黑"/>
+        </w:rPr>
         <w:drawing>
           <wp:inline xmlns:a="http://schemas.openxmlformats.org/drawingml/2006/main" xmlns:pic="http://schemas.openxmlformats.org/drawingml/2006/picture">
             <wp:extent cx="2448000" cy="2448000"/>
@@ -3376,6 +3158,7 @@
       </w:pPr>
       <w:r>
         <w:rPr>
+          <w:rFonts w:ascii="微软雅黑" w:hAnsi="微软雅黑" w:eastAsia="微软雅黑" w:cs="微软雅黑"/>
           <w:color w:val="5B6470"/>
           <w:sz w:val="16"/>
         </w:rPr>
@@ -3387,12 +3170,16 @@
         <w:pStyle w:val="Heading2"/>
       </w:pPr>
       <w:r>
+        <w:rPr>
+          <w:rFonts w:ascii="微软雅黑" w:hAnsi="微软雅黑" w:eastAsia="微软雅黑" w:cs="微软雅黑"/>
+        </w:rPr>
         <w:t>真实输出节选</w:t>
       </w:r>
     </w:p>
     <w:p>
       <w:r>
         <w:rPr>
+          <w:rFonts w:ascii="微软雅黑" w:hAnsi="微软雅黑" w:eastAsia="微软雅黑" w:cs="微软雅黑"/>
           <w:b w:val="0"/>
         </w:rPr>
         <w:t>出差前收包，文件、水杯、充电器一样样放进去，留给电脑的位置又紧了些。经常背着电脑赶路，我会先把随身重量放在前面。</w:t>
@@ -3401,6 +3188,7 @@
     <w:p>
       <w:r>
         <w:rPr>
+          <w:rFonts w:ascii="微软雅黑" w:hAnsi="微软雅黑" w:eastAsia="微软雅黑" w:cs="微软雅黑"/>
           <w:b w:val="0"/>
         </w:rPr>
         <w:t>从家门口到车站，再从车站转去酒店，电脑也要跟着一路挪地方。HUAWEI MateBook 14 酷睿 Ultra机身重量约1.31千克。[1] 对需要把电脑和其他物品一起背走的人，这个数字是把它放进出差候选名单的一个理由。</w:t>
@@ -3409,6 +3197,7 @@
     <w:p>
       <w:r>
         <w:rPr>
+          <w:rFonts w:ascii="微软雅黑" w:hAnsi="微软雅黑" w:eastAsia="微软雅黑" w:cs="微软雅黑"/>
           <w:b w:val="0"/>
         </w:rPr>
         <w:t>互动结尾：你出差选电脑时，最先考虑的是重量、屏幕还是接口？</w:t>
@@ -3419,12 +3208,16 @@
         <w:pStyle w:val="Heading2"/>
       </w:pPr>
       <w:r>
+        <w:rPr>
+          <w:rFonts w:ascii="微软雅黑" w:hAnsi="微软雅黑" w:eastAsia="微软雅黑" w:cs="微软雅黑"/>
+        </w:rPr>
         <w:t>本例说明了什么</w:t>
       </w:r>
     </w:p>
     <w:p>
       <w:r>
         <w:rPr>
+          <w:rFonts w:ascii="微软雅黑" w:hAnsi="微软雅黑" w:eastAsia="微软雅黑" w:cs="微软雅黑"/>
           <w:b w:val="0"/>
         </w:rPr>
         <w:t>从“没有明确型号”进入产品推荐再进入创作；正文把装包、赶路、查看方案和接屏等动作与产品特性联系起来，附知识库引用和主题标签。图片记录含多张参考编辑场景图，本页展示封面之一。</w:t>
@@ -3433,6 +3226,7 @@
     <w:p>
       <w:r>
         <w:rPr>
+          <w:rFonts w:ascii="微软雅黑" w:hAnsi="微软雅黑" w:eastAsia="微软雅黑" w:cs="微软雅黑"/>
           <w:b w:val="0"/>
         </w:rPr>
         <w:t>事实与图片来源：华为官网 MateBook 14 2024 产品页及对应本地产品事实条目。</w:t>
@@ -3441,6 +3235,7 @@
     <w:p>
       <w:r>
         <w:rPr>
+          <w:rFonts w:ascii="微软雅黑" w:hAnsi="微软雅黑" w:eastAsia="微软雅黑" w:cs="微软雅黑"/>
           <w:b w:val="0"/>
         </w:rPr>
         <w:t>运行依据：session_1792722870251_126c16；文本模型 gpt-5.6-sol。记录状态 warning；文本、事实与平台自动检查通过，无阻断项，图片仍待人工核验。以上为原文节选。</w:t>
@@ -3452,12 +3247,16 @@
         <w:pageBreakBefore/>
       </w:pPr>
       <w:r>
+        <w:rPr>
+          <w:rFonts w:ascii="微软雅黑" w:hAnsi="微软雅黑" w:eastAsia="微软雅黑" w:cs="微软雅黑"/>
+        </w:rPr>
         <w:t>07  案例二  出差办公的公众号文章</w:t>
       </w:r>
     </w:p>
     <w:p>
       <w:r>
         <w:rPr>
+          <w:rFonts w:ascii="微软雅黑" w:hAnsi="微软雅黑" w:eastAsia="微软雅黑" w:cs="微软雅黑"/>
           <w:b w:val="0"/>
         </w:rPr>
         <w:t>任务起点同为出差办公场景，员工选择 HUAWEI MateBook D 14 2024，并把平台定为微信公众号。</w:t>
@@ -3466,6 +3265,7 @@
     <w:p>
       <w:r>
         <w:rPr>
+          <w:rFonts w:ascii="微软雅黑" w:hAnsi="微软雅黑" w:eastAsia="微软雅黑" w:cs="微软雅黑"/>
           <w:b/>
         </w:rPr>
         <w:t>实际生成标题：出差选电脑，装进包里和落座之后都要想一想</w:t>
@@ -3478,6 +3278,9 @@
         <w:jc w:val="center"/>
       </w:pPr>
       <w:r>
+        <w:rPr>
+          <w:rFonts w:ascii="微软雅黑" w:hAnsi="微软雅黑" w:eastAsia="微软雅黑" w:cs="微软雅黑"/>
+        </w:rPr>
         <w:drawing>
           <wp:inline xmlns:a="http://schemas.openxmlformats.org/drawingml/2006/main" xmlns:pic="http://schemas.openxmlformats.org/drawingml/2006/picture">
             <wp:extent cx="2448000" cy="2448000"/>
@@ -3519,6 +3322,7 @@
       </w:pPr>
       <w:r>
         <w:rPr>
+          <w:rFonts w:ascii="微软雅黑" w:hAnsi="微软雅黑" w:eastAsia="微软雅黑" w:cs="微软雅黑"/>
           <w:color w:val="5B6470"/>
           <w:sz w:val="16"/>
         </w:rPr>
@@ -3530,12 +3334,16 @@
         <w:pStyle w:val="Heading2"/>
       </w:pPr>
       <w:r>
+        <w:rPr>
+          <w:rFonts w:ascii="微软雅黑" w:hAnsi="微软雅黑" w:eastAsia="微软雅黑" w:cs="微软雅黑"/>
+        </w:rPr>
         <w:t>真实输出节选</w:t>
       </w:r>
     </w:p>
     <w:p>
       <w:r>
         <w:rPr>
+          <w:rFonts w:ascii="微软雅黑" w:hAnsi="微软雅黑" w:eastAsia="微软雅黑" w:cs="微软雅黑"/>
           <w:b w:val="0"/>
         </w:rPr>
         <w:t>行李箱里少带一件衣服很容易，电脑却很难落下。给经常出差的人选电脑，既要想到一路背着它的自己，也要想到抵达后打开文档、准备开会的那一刻。</w:t>
@@ -3544,6 +3352,7 @@
     <w:p>
       <w:r>
         <w:rPr>
+          <w:rFonts w:ascii="微软雅黑" w:hAnsi="微软雅黑" w:eastAsia="微软雅黑" w:cs="微软雅黑"/>
           <w:b w:val="0"/>
         </w:rPr>
         <w:t>出发前收拾背包，电脑、随行的文件和洗漱用品，一件件放进去。等到进站、换乘，再走到酒店，这只包会跟着你走过不少路。站在门店选机的那几分钟，值得把这些动作也一起想一遍。HUAWEI MateBook D 14 2024，就是可以沿着这趟行程来考虑的一款电脑。</w:t>
@@ -3554,12 +3363,16 @@
         <w:pStyle w:val="Heading2"/>
       </w:pPr>
       <w:r>
+        <w:rPr>
+          <w:rFonts w:ascii="微软雅黑" w:hAnsi="微软雅黑" w:eastAsia="微软雅黑" w:cs="微软雅黑"/>
+        </w:rPr>
         <w:t>本例说明了什么</w:t>
       </w:r>
     </w:p>
     <w:p>
       <w:r>
         <w:rPr>
+          <w:rFonts w:ascii="微软雅黑" w:hAnsi="微软雅黑" w:eastAsia="微软雅黑" w:cs="微软雅黑"/>
           <w:b w:val="0"/>
         </w:rPr>
         <w:t>文章沿“装包—落座阅读—会议连接”的逻辑展开，逐段解释重量、屏幕比例和 HDMI 与使用习惯的关系。与小红书案例相比，篇幅和论述更完整，结尾邀请讨论，不带主题标签；型号不同，不能直接归因于平台规则。</w:t>
@@ -3568,6 +3381,7 @@
     <w:p>
       <w:r>
         <w:rPr>
+          <w:rFonts w:ascii="微软雅黑" w:hAnsi="微软雅黑" w:eastAsia="微软雅黑" w:cs="微软雅黑"/>
           <w:b w:val="0"/>
         </w:rPr>
         <w:t>事实与图片来源：华为官网 MateBook D 14 2024 第 13 代酷睿产品页及对应本地产品事实条目。</w:t>
@@ -3576,6 +3390,7 @@
     <w:p>
       <w:r>
         <w:rPr>
+          <w:rFonts w:ascii="微软雅黑" w:hAnsi="微软雅黑" w:eastAsia="微软雅黑" w:cs="微软雅黑"/>
           <w:b w:val="0"/>
         </w:rPr>
         <w:t>运行依据：session_1792722861421_a8c81e；文本模型 gpt-5.6-sol。记录状态 warning；文本、事实与平台自动检查通过，无阻断项，图片仍待人工核验。以上为原文节选。</w:t>
@@ -3587,12 +3402,16 @@
         <w:pageBreakBefore/>
       </w:pPr>
       <w:r>
+        <w:rPr>
+          <w:rFonts w:ascii="微软雅黑" w:hAnsi="微软雅黑" w:eastAsia="微软雅黑" w:cs="微软雅黑"/>
+        </w:rPr>
         <w:t>08  案例三  大学新生的开学购机内容</w:t>
       </w:r>
     </w:p>
     <w:p>
       <w:r>
         <w:rPr>
+          <w:rFonts w:ascii="微软雅黑" w:hAnsi="微软雅黑" w:eastAsia="微软雅黑" w:cs="微软雅黑"/>
           <w:b w:val="0"/>
         </w:rPr>
         <w:t>任务起点：为准备开学购机的大学新生生成小红书图文，考虑学习、携带与续航。最终记录对应 HUAWEI MateBook Pro S。</w:t>
@@ -3601,6 +3420,7 @@
     <w:p>
       <w:r>
         <w:rPr>
+          <w:rFonts w:ascii="微软雅黑" w:hAnsi="微软雅黑" w:eastAsia="微软雅黑" w:cs="微软雅黑"/>
           <w:b/>
         </w:rPr>
         <w:t>实际生成标题：新生买电脑，学习携带续航怎么选？</w:t>
@@ -3613,6 +3433,9 @@
         <w:jc w:val="center"/>
       </w:pPr>
       <w:r>
+        <w:rPr>
+          <w:rFonts w:ascii="微软雅黑" w:hAnsi="微软雅黑" w:eastAsia="微软雅黑" w:cs="微软雅黑"/>
+        </w:rPr>
         <w:drawing>
           <wp:inline xmlns:a="http://schemas.openxmlformats.org/drawingml/2006/main" xmlns:pic="http://schemas.openxmlformats.org/drawingml/2006/picture">
             <wp:extent cx="2448000" cy="2448000"/>
@@ -3654,6 +3477,7 @@
       </w:pPr>
       <w:r>
         <w:rPr>
+          <w:rFonts w:ascii="微软雅黑" w:hAnsi="微软雅黑" w:eastAsia="微软雅黑" w:cs="微软雅黑"/>
           <w:color w:val="5B6470"/>
           <w:sz w:val="16"/>
         </w:rPr>
@@ -3665,12 +3489,16 @@
         <w:pStyle w:val="Heading2"/>
       </w:pPr>
       <w:r>
+        <w:rPr>
+          <w:rFonts w:ascii="微软雅黑" w:hAnsi="微软雅黑" w:eastAsia="微软雅黑" w:cs="微软雅黑"/>
+        </w:rPr>
         <w:t>真实输出节选</w:t>
       </w:r>
     </w:p>
     <w:p>
       <w:r>
         <w:rPr>
+          <w:rFonts w:ascii="微软雅黑" w:hAnsi="微软雅黑" w:eastAsia="微软雅黑" w:cs="微软雅黑"/>
           <w:b w:val="0"/>
         </w:rPr>
         <w:t>课件要看，课本要背，连着上课还得考虑充电。开学第一台电脑，我建议先顺着自己的课表想一遍，再决定哪些特点最重要。</w:t>
@@ -3679,6 +3507,7 @@
     <w:p>
       <w:r>
         <w:rPr>
+          <w:rFonts w:ascii="微软雅黑" w:hAnsi="微软雅黑" w:eastAsia="微软雅黑" w:cs="微软雅黑"/>
           <w:b w:val="0"/>
         </w:rPr>
         <w:t>📚 如果你经常在教室看课件、去图书馆读长文档，HUAWEI MateBook Pro S 的屏幕值得放进比较范围。</w:t>
@@ -3691,12 +3520,16 @@
         <w:pStyle w:val="Heading2"/>
       </w:pPr>
       <w:r>
+        <w:rPr>
+          <w:rFonts w:ascii="微软雅黑" w:hAnsi="微软雅黑" w:eastAsia="微软雅黑" w:cs="微软雅黑"/>
+        </w:rPr>
         <w:t>本例说明了什么</w:t>
       </w:r>
     </w:p>
     <w:p>
       <w:r>
         <w:rPr>
+          <w:rFonts w:ascii="微软雅黑" w:hAnsi="微软雅黑" w:eastAsia="微软雅黑" w:cs="微软雅黑"/>
           <w:b w:val="0"/>
         </w:rPr>
         <w:t>已有输出按课件阅读、往返教室、充电安排组织，形成学习与携带的场景联系；图片记录同时含一张生成图与官方素材。历史正文仍有较多防御性说明，本例用于证明真实场景覆盖和发现改进点，不将其包装为最新风格规则的最佳成品。</w:t>
@@ -3705,6 +3538,7 @@
     <w:p>
       <w:r>
         <w:rPr>
+          <w:rFonts w:ascii="微软雅黑" w:hAnsi="微软雅黑" w:eastAsia="微软雅黑" w:cs="微软雅黑"/>
           <w:b w:val="0"/>
         </w:rPr>
         <w:t>事实与图片来源：华为官网 MateBook Pro S 产品页及对应本地产品事实条目。</w:t>
@@ -3713,6 +3547,7 @@
     <w:p>
       <w:r>
         <w:rPr>
+          <w:rFonts w:ascii="微软雅黑" w:hAnsi="微软雅黑" w:eastAsia="微软雅黑" w:cs="微软雅黑"/>
           <w:b w:val="0"/>
         </w:rPr>
         <w:t>运行依据：session_1792719464141_eb772a；文本模型 gpt-5.6-sol。记录状态 warning；文本、事实与平台自动检查通过，无阻断项，图片仍待人工核验。以上为原文节选。</w:t>
@@ -3724,12 +3559,16 @@
         <w:pageBreakBefore/>
       </w:pPr>
       <w:r>
+        <w:rPr>
+          <w:rFonts w:ascii="微软雅黑" w:hAnsi="微软雅黑" w:eastAsia="微软雅黑" w:cs="微软雅黑"/>
+        </w:rPr>
         <w:t>09  自研 Agent 如何支撑产品体验</w:t>
       </w:r>
     </w:p>
     <w:p>
       <w:r>
         <w:rPr>
+          <w:rFonts w:ascii="微软雅黑" w:hAnsi="微软雅黑" w:eastAsia="微软雅黑" w:cs="微软雅黑"/>
           <w:b w:val="0"/>
         </w:rPr>
         <w:t>PC Studio 的自研部分是面向门店营销业务的 Agent 编排与运行环境。底层文本和图片模型通过服务接口调用；我们围绕业务设计任务状态、上下文、工具、平台 Skills、子 Agent 协作、核验与失败追踪。</w:t>
@@ -3742,6 +3581,9 @@
         <w:jc w:val="center"/>
       </w:pPr>
       <w:r>
+        <w:rPr>
+          <w:rFonts w:ascii="微软雅黑" w:hAnsi="微软雅黑" w:eastAsia="微软雅黑" w:cs="微软雅黑"/>
+        </w:rPr>
         <w:drawing>
           <wp:inline xmlns:a="http://schemas.openxmlformats.org/drawingml/2006/main" xmlns:pic="http://schemas.openxmlformats.org/drawingml/2006/picture">
             <wp:extent cx="5940000" cy="1485000"/>
@@ -3783,6 +3625,7 @@
       </w:pPr>
       <w:r>
         <w:rPr>
+          <w:rFonts w:ascii="微软雅黑" w:hAnsi="微软雅黑" w:eastAsia="微软雅黑" w:cs="微软雅黑"/>
           <w:color w:val="5B6470"/>
           <w:sz w:val="16"/>
         </w:rPr>
@@ -3830,6 +3673,7 @@
             </w:pPr>
             <w:r>
               <w:rPr>
+                <w:rFonts w:ascii="微软雅黑" w:hAnsi="微软雅黑" w:eastAsia="微软雅黑" w:cs="微软雅黑"/>
                 <w:b/>
                 <w:color w:val="FFFFFF"/>
                 <w:sz w:val="18"/>
@@ -3862,6 +3706,7 @@
             </w:pPr>
             <w:r>
               <w:rPr>
+                <w:rFonts w:ascii="微软雅黑" w:hAnsi="微软雅黑" w:eastAsia="微软雅黑" w:cs="微软雅黑"/>
                 <w:b/>
                 <w:color w:val="FFFFFF"/>
                 <w:sz w:val="18"/>
@@ -3894,6 +3739,7 @@
             </w:pPr>
             <w:r>
               <w:rPr>
+                <w:rFonts w:ascii="微软雅黑" w:hAnsi="微软雅黑" w:eastAsia="微软雅黑" w:cs="微软雅黑"/>
                 <w:b/>
                 <w:color w:val="FFFFFF"/>
                 <w:sz w:val="18"/>
@@ -3930,6 +3776,7 @@
             </w:pPr>
             <w:r>
               <w:rPr>
+                <w:rFonts w:ascii="微软雅黑" w:hAnsi="微软雅黑" w:eastAsia="微软雅黑" w:cs="微软雅黑"/>
                 <w:b w:val="0"/>
                 <w:sz w:val="18"/>
               </w:rPr>
@@ -3960,6 +3807,7 @@
             </w:pPr>
             <w:r>
               <w:rPr>
+                <w:rFonts w:ascii="微软雅黑" w:hAnsi="微软雅黑" w:eastAsia="微软雅黑" w:cs="微软雅黑"/>
                 <w:b w:val="0"/>
                 <w:sz w:val="18"/>
               </w:rPr>
@@ -3990,6 +3838,7 @@
             </w:pPr>
             <w:r>
               <w:rPr>
+                <w:rFonts w:ascii="微软雅黑" w:hAnsi="微软雅黑" w:eastAsia="微软雅黑" w:cs="微软雅黑"/>
                 <w:b w:val="0"/>
                 <w:sz w:val="18"/>
               </w:rPr>
@@ -4026,6 +3875,7 @@
             </w:pPr>
             <w:r>
               <w:rPr>
+                <w:rFonts w:ascii="微软雅黑" w:hAnsi="微软雅黑" w:eastAsia="微软雅黑" w:cs="微软雅黑"/>
                 <w:b w:val="0"/>
                 <w:sz w:val="18"/>
               </w:rPr>
@@ -4057,6 +3907,7 @@
             </w:pPr>
             <w:r>
               <w:rPr>
+                <w:rFonts w:ascii="微软雅黑" w:hAnsi="微软雅黑" w:eastAsia="微软雅黑" w:cs="微软雅黑"/>
                 <w:b w:val="0"/>
                 <w:sz w:val="18"/>
               </w:rPr>
@@ -4088,6 +3939,7 @@
             </w:pPr>
             <w:r>
               <w:rPr>
+                <w:rFonts w:ascii="微软雅黑" w:hAnsi="微软雅黑" w:eastAsia="微软雅黑" w:cs="微软雅黑"/>
                 <w:b w:val="0"/>
                 <w:sz w:val="18"/>
               </w:rPr>
@@ -4123,6 +3975,7 @@
             </w:pPr>
             <w:r>
               <w:rPr>
+                <w:rFonts w:ascii="微软雅黑" w:hAnsi="微软雅黑" w:eastAsia="微软雅黑" w:cs="微软雅黑"/>
                 <w:b w:val="0"/>
                 <w:sz w:val="18"/>
               </w:rPr>
@@ -4153,6 +4006,7 @@
             </w:pPr>
             <w:r>
               <w:rPr>
+                <w:rFonts w:ascii="微软雅黑" w:hAnsi="微软雅黑" w:eastAsia="微软雅黑" w:cs="微软雅黑"/>
                 <w:b w:val="0"/>
                 <w:sz w:val="18"/>
               </w:rPr>
@@ -4183,6 +4037,7 @@
             </w:pPr>
             <w:r>
               <w:rPr>
+                <w:rFonts w:ascii="微软雅黑" w:hAnsi="微软雅黑" w:eastAsia="微软雅黑" w:cs="微软雅黑"/>
                 <w:b w:val="0"/>
                 <w:sz w:val="18"/>
               </w:rPr>
@@ -4219,6 +4074,7 @@
             </w:pPr>
             <w:r>
               <w:rPr>
+                <w:rFonts w:ascii="微软雅黑" w:hAnsi="微软雅黑" w:eastAsia="微软雅黑" w:cs="微软雅黑"/>
                 <w:b w:val="0"/>
                 <w:sz w:val="18"/>
               </w:rPr>
@@ -4250,10 +4106,11 @@
             </w:pPr>
             <w:r>
               <w:rPr>
+                <w:rFonts w:ascii="微软雅黑" w:hAnsi="微软雅黑" w:eastAsia="微软雅黑" w:cs="微软雅黑"/>
                 <w:b w:val="0"/>
                 <w:sz w:val="18"/>
               </w:rPr>
-              <w:t>检索本地产品依据，组织官网资料及价格快照</w:t>
+              <w:t>检索产品依据，同配置查询商城公开价格，保留历史参考</w:t>
             </w:r>
           </w:p>
         </w:tc>
@@ -4281,6 +4138,7 @@
             </w:pPr>
             <w:r>
               <w:rPr>
+                <w:rFonts w:ascii="微软雅黑" w:hAnsi="微软雅黑" w:eastAsia="微软雅黑" w:cs="微软雅黑"/>
                 <w:b w:val="0"/>
                 <w:sz w:val="18"/>
               </w:rPr>
@@ -4316,6 +4174,7 @@
             </w:pPr>
             <w:r>
               <w:rPr>
+                <w:rFonts w:ascii="微软雅黑" w:hAnsi="微软雅黑" w:eastAsia="微软雅黑" w:cs="微软雅黑"/>
                 <w:b w:val="0"/>
                 <w:sz w:val="18"/>
               </w:rPr>
@@ -4346,6 +4205,7 @@
             </w:pPr>
             <w:r>
               <w:rPr>
+                <w:rFonts w:ascii="微软雅黑" w:hAnsi="微软雅黑" w:eastAsia="微软雅黑" w:cs="微软雅黑"/>
                 <w:b w:val="0"/>
                 <w:sz w:val="18"/>
               </w:rPr>
@@ -4376,6 +4236,7 @@
             </w:pPr>
             <w:r>
               <w:rPr>
+                <w:rFonts w:ascii="微软雅黑" w:hAnsi="微软雅黑" w:eastAsia="微软雅黑" w:cs="微软雅黑"/>
                 <w:b w:val="0"/>
                 <w:sz w:val="18"/>
               </w:rPr>
@@ -4412,6 +4273,7 @@
             </w:pPr>
             <w:r>
               <w:rPr>
+                <w:rFonts w:ascii="微软雅黑" w:hAnsi="微软雅黑" w:eastAsia="微软雅黑" w:cs="微软雅黑"/>
                 <w:b w:val="0"/>
                 <w:sz w:val="18"/>
               </w:rPr>
@@ -4443,6 +4305,7 @@
             </w:pPr>
             <w:r>
               <w:rPr>
+                <w:rFonts w:ascii="微软雅黑" w:hAnsi="微软雅黑" w:eastAsia="微软雅黑" w:cs="微软雅黑"/>
                 <w:b w:val="0"/>
                 <w:sz w:val="18"/>
               </w:rPr>
@@ -4474,6 +4337,7 @@
             </w:pPr>
             <w:r>
               <w:rPr>
+                <w:rFonts w:ascii="微软雅黑" w:hAnsi="微软雅黑" w:eastAsia="微软雅黑" w:cs="微软雅黑"/>
                 <w:b w:val="0"/>
                 <w:sz w:val="18"/>
               </w:rPr>
@@ -4488,12 +4352,16 @@
         <w:pStyle w:val="Heading2"/>
       </w:pPr>
       <w:r>
+        <w:rPr>
+          <w:rFonts w:ascii="微软雅黑" w:hAnsi="微软雅黑" w:eastAsia="微软雅黑" w:cs="微软雅黑"/>
+        </w:rPr>
         <w:t>规范落在不同层</w:t>
       </w:r>
     </w:p>
     <w:p>
       <w:r>
         <w:rPr>
+          <w:rFonts w:ascii="微软雅黑" w:hAnsi="微软雅黑" w:eastAsia="微软雅黑" w:cs="微软雅黑"/>
           <w:b w:val="0"/>
         </w:rPr>
         <w:t>系统提示词决定模型如何理解和规划，SKILL.md 与平台策略规定表达方式，编排代码决定可执行动作与状态变化，验证代码检查输出结构、证据和引用。规则文件需要被运行时代码加载才会影响业务；单独新增 AGENTS.md 并不能替代这些执行机制。</w:t>
@@ -4504,12 +4372,16 @@
         <w:pStyle w:val="Heading2"/>
       </w:pPr>
       <w:r>
+        <w:rPr>
+          <w:rFonts w:ascii="微软雅黑" w:hAnsi="微软雅黑" w:eastAsia="微软雅黑" w:cs="微软雅黑"/>
+        </w:rPr>
         <w:t>追踪一条失败请求</w:t>
       </w:r>
     </w:p>
     <w:p>
       <w:r>
         <w:rPr>
+          <w:rFonts w:ascii="微软雅黑" w:hAnsi="微软雅黑" w:eastAsia="微软雅黑" w:cs="微软雅黑"/>
           <w:b w:val="0"/>
         </w:rPr>
         <w:t>会话记录位于 data/sessions，生成任务记录位于 data/generation-jobs，运行日志位于 data/run-logs。结合会话 ID 和请求标识查看失败阶段、上游状态和模型调用记录，可区分鉴权、额度、超时、结构解析、内容核验与图片处理失败。</w:t>
@@ -4518,6 +4390,7 @@
     <w:p>
       <w:r>
         <w:rPr>
+          <w:rFonts w:ascii="微软雅黑" w:hAnsi="微软雅黑" w:eastAsia="微软雅黑" w:cs="微软雅黑"/>
           <w:b w:val="0"/>
         </w:rPr>
         <w:t>这些机制构成当前 harness：管理模型的上下文、执行、工具与结果。上下文压缩、恢复质量和长期经验学习仍需专项评测，不将持久化聊天记录等同于自动学习。</w:t>
@@ -4529,12 +4402,16 @@
         <w:pageBreakBefore/>
       </w:pPr>
       <w:r>
+        <w:rPr>
+          <w:rFonts w:ascii="微软雅黑" w:hAnsi="微软雅黑" w:eastAsia="微软雅黑" w:cs="微软雅黑"/>
+        </w:rPr>
         <w:t>10  对照赛题要求的产品回应</w:t>
       </w:r>
     </w:p>
     <w:p>
       <w:r>
         <w:rPr>
+          <w:rFonts w:ascii="微软雅黑" w:hAnsi="微软雅黑" w:eastAsia="微软雅黑" w:cs="微软雅黑"/>
           <w:b w:val="0"/>
         </w:rPr>
         <w:t>主办方初赛反馈强调：素材对应真实产品、内容吸引人、操作简单并减少门店员工工作量。说明书以这三点组织产品价值，成交辅助作为图文创作之后的业务延伸。</w:t>
@@ -4581,6 +4458,7 @@
             </w:pPr>
             <w:r>
               <w:rPr>
+                <w:rFonts w:ascii="微软雅黑" w:hAnsi="微软雅黑" w:eastAsia="微软雅黑" w:cs="微软雅黑"/>
                 <w:b/>
                 <w:color w:val="FFFFFF"/>
                 <w:sz w:val="18"/>
@@ -4613,6 +4491,7 @@
             </w:pPr>
             <w:r>
               <w:rPr>
+                <w:rFonts w:ascii="微软雅黑" w:hAnsi="微软雅黑" w:eastAsia="微软雅黑" w:cs="微软雅黑"/>
                 <w:b/>
                 <w:color w:val="FFFFFF"/>
                 <w:sz w:val="18"/>
@@ -4645,6 +4524,7 @@
             </w:pPr>
             <w:r>
               <w:rPr>
+                <w:rFonts w:ascii="微软雅黑" w:hAnsi="微软雅黑" w:eastAsia="微软雅黑" w:cs="微软雅黑"/>
                 <w:b/>
                 <w:color w:val="FFFFFF"/>
                 <w:sz w:val="18"/>
@@ -4681,6 +4561,7 @@
             </w:pPr>
             <w:r>
               <w:rPr>
+                <w:rFonts w:ascii="微软雅黑" w:hAnsi="微软雅黑" w:eastAsia="微软雅黑" w:cs="微软雅黑"/>
                 <w:b w:val="0"/>
                 <w:sz w:val="18"/>
               </w:rPr>
@@ -4711,6 +4592,7 @@
             </w:pPr>
             <w:r>
               <w:rPr>
+                <w:rFonts w:ascii="微软雅黑" w:hAnsi="微软雅黑" w:eastAsia="微软雅黑" w:cs="微软雅黑"/>
                 <w:b w:val="0"/>
                 <w:sz w:val="18"/>
               </w:rPr>
@@ -4741,6 +4623,7 @@
             </w:pPr>
             <w:r>
               <w:rPr>
+                <w:rFonts w:ascii="微软雅黑" w:hAnsi="微软雅黑" w:eastAsia="微软雅黑" w:cs="微软雅黑"/>
                 <w:b w:val="0"/>
                 <w:sz w:val="18"/>
               </w:rPr>
@@ -4777,6 +4660,7 @@
             </w:pPr>
             <w:r>
               <w:rPr>
+                <w:rFonts w:ascii="微软雅黑" w:hAnsi="微软雅黑" w:eastAsia="微软雅黑" w:cs="微软雅黑"/>
                 <w:b w:val="0"/>
                 <w:sz w:val="18"/>
               </w:rPr>
@@ -4808,6 +4692,7 @@
             </w:pPr>
             <w:r>
               <w:rPr>
+                <w:rFonts w:ascii="微软雅黑" w:hAnsi="微软雅黑" w:eastAsia="微软雅黑" w:cs="微软雅黑"/>
                 <w:b w:val="0"/>
                 <w:sz w:val="18"/>
               </w:rPr>
@@ -4839,6 +4724,7 @@
             </w:pPr>
             <w:r>
               <w:rPr>
+                <w:rFonts w:ascii="微软雅黑" w:hAnsi="微软雅黑" w:eastAsia="微软雅黑" w:cs="微软雅黑"/>
                 <w:b w:val="0"/>
                 <w:sz w:val="18"/>
               </w:rPr>
@@ -4874,6 +4760,7 @@
             </w:pPr>
             <w:r>
               <w:rPr>
+                <w:rFonts w:ascii="微软雅黑" w:hAnsi="微软雅黑" w:eastAsia="微软雅黑" w:cs="微软雅黑"/>
                 <w:b w:val="0"/>
                 <w:sz w:val="18"/>
               </w:rPr>
@@ -4904,6 +4791,7 @@
             </w:pPr>
             <w:r>
               <w:rPr>
+                <w:rFonts w:ascii="微软雅黑" w:hAnsi="微软雅黑" w:eastAsia="微软雅黑" w:cs="微软雅黑"/>
                 <w:b w:val="0"/>
                 <w:sz w:val="18"/>
               </w:rPr>
@@ -4934,6 +4822,7 @@
             </w:pPr>
             <w:r>
               <w:rPr>
+                <w:rFonts w:ascii="微软雅黑" w:hAnsi="微软雅黑" w:eastAsia="微软雅黑" w:cs="微软雅黑"/>
                 <w:b w:val="0"/>
                 <w:sz w:val="18"/>
               </w:rPr>
@@ -4970,6 +4859,7 @@
             </w:pPr>
             <w:r>
               <w:rPr>
+                <w:rFonts w:ascii="微软雅黑" w:hAnsi="微软雅黑" w:eastAsia="微软雅黑" w:cs="微软雅黑"/>
                 <w:b w:val="0"/>
                 <w:sz w:val="18"/>
               </w:rPr>
@@ -5001,6 +4891,7 @@
             </w:pPr>
             <w:r>
               <w:rPr>
+                <w:rFonts w:ascii="微软雅黑" w:hAnsi="微软雅黑" w:eastAsia="微软雅黑" w:cs="微软雅黑"/>
                 <w:b w:val="0"/>
                 <w:sz w:val="18"/>
               </w:rPr>
@@ -5032,6 +4923,7 @@
             </w:pPr>
             <w:r>
               <w:rPr>
+                <w:rFonts w:ascii="微软雅黑" w:hAnsi="微软雅黑" w:eastAsia="微软雅黑" w:cs="微软雅黑"/>
                 <w:b w:val="0"/>
                 <w:sz w:val="18"/>
               </w:rPr>
@@ -5067,6 +4959,7 @@
             </w:pPr>
             <w:r>
               <w:rPr>
+                <w:rFonts w:ascii="微软雅黑" w:hAnsi="微软雅黑" w:eastAsia="微软雅黑" w:cs="微软雅黑"/>
                 <w:b w:val="0"/>
                 <w:sz w:val="18"/>
               </w:rPr>
@@ -5097,6 +4990,7 @@
             </w:pPr>
             <w:r>
               <w:rPr>
+                <w:rFonts w:ascii="微软雅黑" w:hAnsi="微软雅黑" w:eastAsia="微软雅黑" w:cs="微软雅黑"/>
                 <w:b w:val="0"/>
                 <w:sz w:val="18"/>
               </w:rPr>
@@ -5127,6 +5021,7 @@
             </w:pPr>
             <w:r>
               <w:rPr>
+                <w:rFonts w:ascii="微软雅黑" w:hAnsi="微软雅黑" w:eastAsia="微软雅黑" w:cs="微软雅黑"/>
                 <w:b w:val="0"/>
                 <w:sz w:val="18"/>
               </w:rPr>
@@ -5163,6 +5058,7 @@
             </w:pPr>
             <w:r>
               <w:rPr>
+                <w:rFonts w:ascii="微软雅黑" w:hAnsi="微软雅黑" w:eastAsia="微软雅黑" w:cs="微软雅黑"/>
                 <w:b w:val="0"/>
                 <w:sz w:val="18"/>
               </w:rPr>
@@ -5194,6 +5090,7 @@
             </w:pPr>
             <w:r>
               <w:rPr>
+                <w:rFonts w:ascii="微软雅黑" w:hAnsi="微软雅黑" w:eastAsia="微软雅黑" w:cs="微软雅黑"/>
                 <w:b w:val="0"/>
                 <w:sz w:val="18"/>
               </w:rPr>
@@ -5225,6 +5122,7 @@
             </w:pPr>
             <w:r>
               <w:rPr>
+                <w:rFonts w:ascii="微软雅黑" w:hAnsi="微软雅黑" w:eastAsia="微软雅黑" w:cs="微软雅黑"/>
                 <w:b w:val="0"/>
                 <w:sz w:val="18"/>
               </w:rPr>
@@ -5260,6 +5158,7 @@
             </w:pPr>
             <w:r>
               <w:rPr>
+                <w:rFonts w:ascii="微软雅黑" w:hAnsi="微软雅黑" w:eastAsia="微软雅黑" w:cs="微软雅黑"/>
                 <w:b w:val="0"/>
                 <w:sz w:val="18"/>
               </w:rPr>
@@ -5290,6 +5189,7 @@
             </w:pPr>
             <w:r>
               <w:rPr>
+                <w:rFonts w:ascii="微软雅黑" w:hAnsi="微软雅黑" w:eastAsia="微软雅黑" w:cs="微软雅黑"/>
                 <w:b w:val="0"/>
                 <w:sz w:val="18"/>
               </w:rPr>
@@ -5320,6 +5220,7 @@
             </w:pPr>
             <w:r>
               <w:rPr>
+                <w:rFonts w:ascii="微软雅黑" w:hAnsi="微软雅黑" w:eastAsia="微软雅黑" w:cs="微软雅黑"/>
                 <w:b w:val="0"/>
                 <w:sz w:val="18"/>
               </w:rPr>
@@ -5334,12 +5235,16 @@
         <w:pStyle w:val="Heading2"/>
       </w:pPr>
       <w:r>
+        <w:rPr>
+          <w:rFonts w:ascii="微软雅黑" w:hAnsi="微软雅黑" w:eastAsia="微软雅黑" w:cs="微软雅黑"/>
+        </w:rPr>
         <w:t>真实案例覆盖与验证口径</w:t>
       </w:r>
     </w:p>
     <w:p>
       <w:r>
         <w:rPr>
+          <w:rFonts w:ascii="微软雅黑" w:hAnsi="微软雅黑" w:eastAsia="微软雅黑" w:cs="微软雅黑"/>
           <w:b w:val="0"/>
         </w:rPr>
         <w:t>本说明书提供三组已保存的图文产物，覆盖出差办公与开学购机两类场景、小红书与公众号两个平台，另补一组成交辅助。三组记录的型号、事实、平台、合规检查均为 pass，模型审稿通过，无阻断项；总体 warning 来自本地快照与图片待人工核验。自动检查结果不等于人工评测准确率或真实传播效果。</w:t>
@@ -5348,9 +5253,10 @@
     <w:p>
       <w:r>
         <w:rPr>
+          <w:rFonts w:ascii="微软雅黑" w:hAnsi="微软雅黑" w:eastAsia="微软雅黑" w:cs="微软雅黑"/>
           <w:b w:val="0"/>
         </w:rPr>
-        <w:t>本次工作核对文档、代码和历史产物，并检查说明书排版；没有重新发起付费模型调用，也没有重跑完整业务验收。现有截图均标明测试来源或局部范围，不把历史测试界面宣称为当前版本的逐项验收。</w:t>
+        <w:t>本次核对文档、代码与历史产物，并在当前界面验证商城公开查价及补贴条件试算，检查说明书排版。没有重新发起付费模型生成，也未重跑完整业务验收；历史案例与最新比价截图分别注明来源。</w:t>
       </w:r>
     </w:p>
     <w:p>
@@ -5358,12 +5264,16 @@
         <w:pStyle w:val="Heading2"/>
       </w:pPr>
       <w:r>
+        <w:rPr>
+          <w:rFonts w:ascii="微软雅黑" w:hAnsi="微软雅黑" w:eastAsia="微软雅黑" w:cs="微软雅黑"/>
+        </w:rPr>
         <w:t>资料来源与赛题口径</w:t>
       </w:r>
     </w:p>
     <w:p>
       <w:r>
         <w:rPr>
+          <w:rFonts w:ascii="微软雅黑" w:hAnsi="微软雅黑" w:eastAsia="微软雅黑" w:cs="微软雅黑"/>
           <w:b w:val="0"/>
         </w:rPr>
         <w:t>当前运行以本地华为 PC v7 知识库为静态事实来源，结合华为官方素材和 VMall 信息，运行时不依赖 ima 云检索。手册 v4 对 ima 及图片来源有原始评分约定，后续反馈鼓励自主生图等创新；提交材料应明确这一区别，由主办方确认最终适用口径。</w:t>
@@ -5372,6 +5282,7 @@
     <w:p>
       <w:r>
         <w:rPr>
+          <w:rFonts w:ascii="微软雅黑" w:hAnsi="微软雅黑" w:eastAsia="微软雅黑" w:cs="微软雅黑"/>
           <w:b w:val="0"/>
         </w:rPr>
         <w:t>依据：赛题手册 v4 第 2—5 页的作品与平台要求、第 8 页的案例要求、第 9 页的评分项；以及主办方初赛反馈。</w:t>
@@ -5383,6 +5294,9 @@
         <w:pageBreakBefore/>
       </w:pPr>
       <w:r>
+        <w:rPr>
+          <w:rFonts w:ascii="微软雅黑" w:hAnsi="微软雅黑" w:eastAsia="微软雅黑" w:cs="微软雅黑"/>
+        </w:rPr>
         <w:t>11  部署使用与当前边界</w:t>
       </w:r>
     </w:p>
@@ -5391,12 +5305,16 @@
         <w:pStyle w:val="Heading2"/>
       </w:pPr>
       <w:r>
+        <w:rPr>
+          <w:rFonts w:ascii="微软雅黑" w:hAnsi="微软雅黑" w:eastAsia="微软雅黑" w:cs="微软雅黑"/>
+        </w:rPr>
         <w:t>本地启动</w:t>
       </w:r>
     </w:p>
     <w:p>
       <w:r>
         <w:rPr>
+          <w:rFonts w:ascii="微软雅黑" w:hAnsi="微软雅黑" w:eastAsia="微软雅黑" w:cs="微软雅黑"/>
           <w:b w:val="0"/>
         </w:rPr>
         <w:t>运行环境为 Node.js。首次启动分别安装 services/api 和 apps/web 的依赖；后端需要配置文本模型与图片服务，再打开前端工作台。以下命令在项目根目录执行。</w:t>
@@ -5442,6 +5360,7 @@
             </w:pPr>
             <w:r>
               <w:rPr>
+                <w:rFonts w:ascii="微软雅黑" w:hAnsi="微软雅黑" w:eastAsia="微软雅黑" w:cs="微软雅黑"/>
                 <w:b/>
                 <w:color w:val="FFFFFF"/>
                 <w:sz w:val="18"/>
@@ -5474,6 +5393,7 @@
             </w:pPr>
             <w:r>
               <w:rPr>
+                <w:rFonts w:ascii="微软雅黑" w:hAnsi="微软雅黑" w:eastAsia="微软雅黑" w:cs="微软雅黑"/>
                 <w:b/>
                 <w:color w:val="FFFFFF"/>
                 <w:sz w:val="18"/>
@@ -5510,6 +5430,7 @@
             </w:pPr>
             <w:r>
               <w:rPr>
+                <w:rFonts w:ascii="微软雅黑" w:hAnsi="微软雅黑" w:eastAsia="微软雅黑" w:cs="微软雅黑"/>
                 <w:b w:val="0"/>
                 <w:sz w:val="18"/>
               </w:rPr>
@@ -5540,6 +5461,7 @@
             </w:pPr>
             <w:r>
               <w:rPr>
+                <w:rFonts w:ascii="微软雅黑" w:hAnsi="微软雅黑" w:eastAsia="微软雅黑" w:cs="微软雅黑"/>
                 <w:b w:val="0"/>
                 <w:sz w:val="18"/>
               </w:rPr>
@@ -5576,6 +5498,7 @@
             </w:pPr>
             <w:r>
               <w:rPr>
+                <w:rFonts w:ascii="微软雅黑" w:hAnsi="微软雅黑" w:eastAsia="微软雅黑" w:cs="微软雅黑"/>
                 <w:b w:val="0"/>
                 <w:sz w:val="18"/>
               </w:rPr>
@@ -5607,6 +5530,7 @@
             </w:pPr>
             <w:r>
               <w:rPr>
+                <w:rFonts w:ascii="微软雅黑" w:hAnsi="微软雅黑" w:eastAsia="微软雅黑" w:cs="微软雅黑"/>
                 <w:b w:val="0"/>
                 <w:sz w:val="18"/>
               </w:rPr>
@@ -5642,6 +5566,7 @@
             </w:pPr>
             <w:r>
               <w:rPr>
+                <w:rFonts w:ascii="微软雅黑" w:hAnsi="微软雅黑" w:eastAsia="微软雅黑" w:cs="微软雅黑"/>
                 <w:b w:val="0"/>
                 <w:sz w:val="18"/>
               </w:rPr>
@@ -5672,6 +5597,7 @@
             </w:pPr>
             <w:r>
               <w:rPr>
+                <w:rFonts w:ascii="微软雅黑" w:hAnsi="微软雅黑" w:eastAsia="微软雅黑" w:cs="微软雅黑"/>
                 <w:b w:val="0"/>
                 <w:sz w:val="18"/>
               </w:rPr>
@@ -5708,6 +5634,7 @@
             </w:pPr>
             <w:r>
               <w:rPr>
+                <w:rFonts w:ascii="微软雅黑" w:hAnsi="微软雅黑" w:eastAsia="微软雅黑" w:cs="微软雅黑"/>
                 <w:b w:val="0"/>
                 <w:sz w:val="18"/>
               </w:rPr>
@@ -5739,6 +5666,7 @@
             </w:pPr>
             <w:r>
               <w:rPr>
+                <w:rFonts w:ascii="微软雅黑" w:hAnsi="微软雅黑" w:eastAsia="微软雅黑" w:cs="微软雅黑"/>
                 <w:b w:val="0"/>
                 <w:sz w:val="18"/>
               </w:rPr>
@@ -5774,6 +5702,7 @@
             </w:pPr>
             <w:r>
               <w:rPr>
+                <w:rFonts w:ascii="微软雅黑" w:hAnsi="微软雅黑" w:eastAsia="微软雅黑" w:cs="微软雅黑"/>
                 <w:b w:val="0"/>
                 <w:sz w:val="18"/>
               </w:rPr>
@@ -5804,6 +5733,7 @@
             </w:pPr>
             <w:r>
               <w:rPr>
+                <w:rFonts w:ascii="微软雅黑" w:hAnsi="微软雅黑" w:eastAsia="微软雅黑" w:cs="微软雅黑"/>
                 <w:b w:val="0"/>
                 <w:sz w:val="18"/>
               </w:rPr>
@@ -5840,6 +5770,7 @@
             </w:pPr>
             <w:r>
               <w:rPr>
+                <w:rFonts w:ascii="微软雅黑" w:hAnsi="微软雅黑" w:eastAsia="微软雅黑" w:cs="微软雅黑"/>
                 <w:b w:val="0"/>
                 <w:sz w:val="18"/>
               </w:rPr>
@@ -5871,6 +5802,7 @@
             </w:pPr>
             <w:r>
               <w:rPr>
+                <w:rFonts w:ascii="微软雅黑" w:hAnsi="微软雅黑" w:eastAsia="微软雅黑" w:cs="微软雅黑"/>
                 <w:b w:val="0"/>
                 <w:sz w:val="18"/>
               </w:rPr>
@@ -5885,12 +5817,16 @@
         <w:pStyle w:val="Heading2"/>
       </w:pPr>
       <w:r>
+        <w:rPr>
+          <w:rFonts w:ascii="微软雅黑" w:hAnsi="微软雅黑" w:eastAsia="微软雅黑" w:cs="微软雅黑"/>
+        </w:rPr>
         <w:t>建议演示路径</w:t>
       </w:r>
     </w:p>
     <w:p>
       <w:r>
         <w:rPr>
+          <w:rFonts w:ascii="微软雅黑" w:hAnsi="微软雅黑" w:eastAsia="微软雅黑" w:cs="微软雅黑"/>
           <w:b w:val="0"/>
         </w:rPr>
         <w:t>新建对话，输入一个场景 → 查看候选与推荐依据 → 选定型号和平台 → 查看正文与场景配图 → 点击事实角标查看知识库 → 在同一入口描述客户咨询 → 查看成交方案和 1／3／7 天草稿 → 按需建立工单。</w:t>
@@ -5901,12 +5837,16 @@
         <w:pStyle w:val="Heading2"/>
       </w:pPr>
       <w:r>
+        <w:rPr>
+          <w:rFonts w:ascii="微软雅黑" w:hAnsi="微软雅黑" w:eastAsia="微软雅黑" w:cs="微软雅黑"/>
+        </w:rPr>
         <w:t>已知边界与下一步</w:t>
       </w:r>
     </w:p>
     <w:p>
       <w:r>
         <w:rPr>
+          <w:rFonts w:ascii="微软雅黑" w:hAnsi="微软雅黑" w:eastAsia="微软雅黑" w:cs="微软雅黑"/>
           <w:b w:val="0"/>
         </w:rPr>
         <w:t>内容质量：以固定任务对照评测平台差异、自然度与可发布性；把第 9 页的防御性话语作为回归样例，验证风格规则在成品中生效。</w:t>
@@ -5915,14 +5855,16 @@
     <w:p>
       <w:r>
         <w:rPr>
+          <w:rFonts w:ascii="微软雅黑" w:hAnsi="微软雅黑" w:eastAsia="微软雅黑" w:cs="微软雅黑"/>
           <w:b w:val="0"/>
         </w:rPr>
-        <w:t>事实与价格：资料有抓取日期和版本差异；动态报价、库存和权益以具体 SKU 的最新官方信息及门店确认为准。需统一价格卡与生成话术的证据状态。</w:t>
+        <w:t>事实与价格：公开查询按配置匹配；教育优惠金额、库存及个人权益可能无法取得。补贴属于条件试算，门店价需录入；历史生成话术不随最新查价自动重写。</w:t>
       </w:r>
     </w:p>
     <w:p>
       <w:r>
         <w:rPr>
+          <w:rFonts w:ascii="微软雅黑" w:hAnsi="微软雅黑" w:eastAsia="微软雅黑" w:cs="微软雅黑"/>
           <w:b w:val="0"/>
         </w:rPr>
         <w:t>图片与稳定性：参考编辑可能改变外观或添加多余文字，发布前需审核；多图保留进度、超时与回退。“选这款继续比价”应列入发布前交互回归。</w:t>
@@ -5931,6 +5873,7 @@
     <w:p>
       <w:r>
         <w:rPr>
+          <w:rFonts w:ascii="微软雅黑" w:hAnsi="微软雅黑" w:eastAsia="微软雅黑" w:cs="微软雅黑"/>
           <w:b w:val="0"/>
         </w:rPr>
         <w:t>数据与安全：凭证仅在后端，不进入截图和仓库；客户工单在确认联系意愿后录入必要信息；日志避免保留敏感凭证与无关个人资料。跟进草稿由员工审核发送。</w:t>
@@ -5957,6 +5900,7 @@
     </w:pPr>
     <w:r>
       <w:rPr>
+        <w:rFonts w:ascii="微软雅黑" w:hAnsi="微软雅黑" w:eastAsia="微软雅黑" w:cs="微软雅黑"/>
         <w:sz w:val="16"/>
       </w:rPr>
       <w:t xml:space="preserve">深藏 blue 队   ·   项目说明书   |   </w:t>
@@ -5974,6 +5918,7 @@
     </w:pPr>
     <w:r>
       <w:rPr>
+        <w:rFonts w:ascii="微软雅黑" w:hAnsi="微软雅黑" w:eastAsia="微软雅黑" w:cs="微软雅黑"/>
         <w:sz w:val="16"/>
       </w:rPr>
       <w:t>PC STUDIO    华为 PC 门店营销工作台</w:t>
@@ -6190,7 +6135,7 @@
   <w:docDefaults>
     <w:rPrDefault>
       <w:rPr>
-        <w:rFonts w:asciiTheme="minorHAnsi" w:eastAsiaTheme="minorEastAsia" w:hAnsiTheme="minorHAnsi" w:cstheme="minorBidi"/>
+        <w:rFonts w:ascii="微软雅黑" w:hAnsi="微软雅黑" w:eastAsia="微软雅黑" w:cs="微软雅黑"/>
         <w:sz w:val="22"/>
         <w:szCs w:val="22"/>
         <w:lang w:val="en-US" w:eastAsia="en-US" w:bidi="ar-SA"/>
@@ -6350,7 +6295,7 @@
       <w:spacing w:after="120" w:line="283" w:lineRule="auto"/>
     </w:pPr>
     <w:rPr>
-      <w:rFonts w:ascii="Microsoft YaHei" w:hAnsi="Microsoft YaHei" w:eastAsia="微软雅黑"/>
+      <w:rFonts w:ascii="微软雅黑" w:hAnsi="微软雅黑" w:eastAsia="微软雅黑" w:cs="微软雅黑"/>
       <w:color w:val="000000"/>
       <w:sz w:val="21"/>
     </w:rPr>
@@ -6369,6 +6314,9 @@
       </w:tabs>
       <w:spacing w:after="0" w:line="240" w:lineRule="auto"/>
     </w:pPr>
+    <w:rPr>
+      <w:rFonts w:ascii="微软雅黑" w:hAnsi="微软雅黑" w:eastAsia="微软雅黑" w:cs="微软雅黑"/>
+    </w:rPr>
   </w:style>
   <w:style w:type="character" w:customStyle="1" w:styleId="HeaderChar">
     <w:name w:val="Header Char"/>
@@ -6376,6 +6324,9 @@
     <w:link w:val="Header"/>
     <w:uiPriority w:val="99"/>
     <w:rsid w:val="00E618BF"/>
+    <w:rPr>
+      <w:rFonts w:ascii="微软雅黑" w:hAnsi="微软雅黑" w:eastAsia="微软雅黑" w:cs="微软雅黑"/>
+    </w:rPr>
   </w:style>
   <w:style w:type="paragraph" w:styleId="Footer">
     <w:name w:val="footer"/>
@@ -6391,6 +6342,9 @@
       </w:tabs>
       <w:spacing w:after="0" w:line="240" w:lineRule="auto"/>
     </w:pPr>
+    <w:rPr>
+      <w:rFonts w:ascii="微软雅黑" w:hAnsi="微软雅黑" w:eastAsia="微软雅黑" w:cs="微软雅黑"/>
+    </w:rPr>
   </w:style>
   <w:style w:type="character" w:customStyle="1" w:styleId="FooterChar">
     <w:name w:val="Footer Char"/>
@@ -6398,6 +6352,9 @@
     <w:link w:val="Footer"/>
     <w:uiPriority w:val="99"/>
     <w:rsid w:val="00E618BF"/>
+    <w:rPr>
+      <w:rFonts w:ascii="微软雅黑" w:hAnsi="微软雅黑" w:eastAsia="微软雅黑" w:cs="微软雅黑"/>
+    </w:rPr>
   </w:style>
   <w:style w:type="paragraph" w:styleId="Heading1">
     <w:name w:val="heading 1"/>
@@ -6414,7 +6371,7 @@
       <w:outlineLvl w:val="0"/>
     </w:pPr>
     <w:rPr>
-      <w:rFonts w:asciiTheme="majorHAnsi" w:eastAsiaTheme="majorEastAsia" w:hAnsiTheme="majorHAnsi" w:cstheme="majorBidi" w:ascii="Microsoft YaHei" w:hAnsi="Microsoft YaHei" w:eastAsia="微软雅黑"/>
+      <w:rFonts w:ascii="微软雅黑" w:hAnsi="微软雅黑" w:eastAsia="微软雅黑" w:cs="微软雅黑"/>
       <w:b/>
       <w:bCs/>
       <w:color w:val="000000"/>
@@ -6438,7 +6395,7 @@
       <w:outlineLvl w:val="1"/>
     </w:pPr>
     <w:rPr>
-      <w:rFonts w:asciiTheme="majorHAnsi" w:eastAsiaTheme="majorEastAsia" w:hAnsiTheme="majorHAnsi" w:cstheme="majorBidi" w:ascii="Microsoft YaHei" w:hAnsi="Microsoft YaHei" w:eastAsia="微软雅黑"/>
+      <w:rFonts w:ascii="微软雅黑" w:hAnsi="微软雅黑" w:eastAsia="微软雅黑" w:cs="微软雅黑"/>
       <w:b/>
       <w:bCs/>
       <w:color w:val="000000"/>
@@ -6462,7 +6419,7 @@
       <w:outlineLvl w:val="2"/>
     </w:pPr>
     <w:rPr>
-      <w:rFonts w:asciiTheme="majorHAnsi" w:eastAsiaTheme="majorEastAsia" w:hAnsiTheme="majorHAnsi" w:cstheme="majorBidi" w:ascii="Microsoft YaHei" w:hAnsi="Microsoft YaHei" w:eastAsia="微软雅黑"/>
+      <w:rFonts w:ascii="微软雅黑" w:hAnsi="微软雅黑" w:eastAsia="微软雅黑" w:cs="微软雅黑"/>
       <w:b/>
       <w:bCs/>
       <w:color w:val="000000"/>
@@ -6486,7 +6443,7 @@
       <w:outlineLvl w:val="3"/>
     </w:pPr>
     <w:rPr>
-      <w:rFonts w:asciiTheme="majorHAnsi" w:eastAsiaTheme="majorEastAsia" w:hAnsiTheme="majorHAnsi" w:cstheme="majorBidi"/>
+      <w:rFonts w:ascii="微软雅黑" w:hAnsi="微软雅黑" w:eastAsia="微软雅黑" w:cs="微软雅黑"/>
       <w:b/>
       <w:bCs/>
       <w:i/>
@@ -6511,7 +6468,7 @@
       <w:outlineLvl w:val="4"/>
     </w:pPr>
     <w:rPr>
-      <w:rFonts w:asciiTheme="majorHAnsi" w:eastAsiaTheme="majorEastAsia" w:hAnsiTheme="majorHAnsi" w:cstheme="majorBidi"/>
+      <w:rFonts w:ascii="微软雅黑" w:hAnsi="微软雅黑" w:eastAsia="微软雅黑" w:cs="微软雅黑"/>
       <w:color w:val="243F60" w:themeColor="accent1" w:themeShade="7F"/>
     </w:rPr>
   </w:style>
@@ -6532,7 +6489,7 @@
       <w:outlineLvl w:val="5"/>
     </w:pPr>
     <w:rPr>
-      <w:rFonts w:asciiTheme="majorHAnsi" w:eastAsiaTheme="majorEastAsia" w:hAnsiTheme="majorHAnsi" w:cstheme="majorBidi"/>
+      <w:rFonts w:ascii="微软雅黑" w:hAnsi="微软雅黑" w:eastAsia="微软雅黑" w:cs="微软雅黑"/>
       <w:i/>
       <w:iCs/>
       <w:color w:val="243F60" w:themeColor="accent1" w:themeShade="7F"/>
@@ -6555,7 +6512,7 @@
       <w:outlineLvl w:val="6"/>
     </w:pPr>
     <w:rPr>
-      <w:rFonts w:asciiTheme="majorHAnsi" w:eastAsiaTheme="majorEastAsia" w:hAnsiTheme="majorHAnsi" w:cstheme="majorBidi"/>
+      <w:rFonts w:ascii="微软雅黑" w:hAnsi="微软雅黑" w:eastAsia="微软雅黑" w:cs="微软雅黑"/>
       <w:i/>
       <w:iCs/>
       <w:color w:val="404040" w:themeColor="text1" w:themeTint="BF"/>
@@ -6578,7 +6535,7 @@
       <w:outlineLvl w:val="7"/>
     </w:pPr>
     <w:rPr>
-      <w:rFonts w:asciiTheme="majorHAnsi" w:eastAsiaTheme="majorEastAsia" w:hAnsiTheme="majorHAnsi" w:cstheme="majorBidi"/>
+      <w:rFonts w:ascii="微软雅黑" w:hAnsi="微软雅黑" w:eastAsia="微软雅黑" w:cs="微软雅黑"/>
       <w:color w:val="4F81BD" w:themeColor="accent1"/>
       <w:sz w:val="20"/>
       <w:szCs w:val="20"/>
@@ -6601,7 +6558,7 @@
       <w:outlineLvl w:val="8"/>
     </w:pPr>
     <w:rPr>
-      <w:rFonts w:asciiTheme="majorHAnsi" w:eastAsiaTheme="majorEastAsia" w:hAnsiTheme="majorHAnsi" w:cstheme="majorBidi"/>
+      <w:rFonts w:ascii="微软雅黑" w:hAnsi="微软雅黑" w:eastAsia="微软雅黑" w:cs="微软雅黑"/>
       <w:i/>
       <w:iCs/>
       <w:color w:val="404040" w:themeColor="text1" w:themeTint="BF"/>
@@ -6614,12 +6571,18 @@
     <w:uiPriority w:val="1"/>
     <w:semiHidden/>
     <w:unhideWhenUsed/>
+    <w:rPr>
+      <w:rFonts w:ascii="微软雅黑" w:hAnsi="微软雅黑" w:eastAsia="微软雅黑" w:cs="微软雅黑"/>
+    </w:rPr>
   </w:style>
   <w:style w:type="table" w:default="1" w:styleId="TableNormal">
     <w:name w:val="Normal Table"/>
     <w:uiPriority w:val="99"/>
     <w:semiHidden/>
     <w:unhideWhenUsed/>
+    <w:rPr>
+      <w:rFonts w:ascii="微软雅黑" w:hAnsi="微软雅黑" w:eastAsia="微软雅黑" w:cs="微软雅黑"/>
+    </w:rPr>
     <w:tblPr>
       <w:tblInd w:w="0" w:type="dxa"/>
       <w:tblCellMar>
@@ -6635,6 +6598,9 @@
     <w:uiPriority w:val="99"/>
     <w:semiHidden/>
     <w:unhideWhenUsed/>
+    <w:rPr>
+      <w:rFonts w:ascii="微软雅黑" w:hAnsi="微软雅黑" w:eastAsia="微软雅黑" w:cs="微软雅黑"/>
+    </w:rPr>
   </w:style>
   <w:style w:type="paragraph" w:styleId="NoSpacing">
     <w:name w:val="No Spacing"/>
@@ -6644,6 +6610,9 @@
     <w:pPr>
       <w:spacing w:after="0" w:line="240" w:lineRule="auto"/>
     </w:pPr>
+    <w:rPr>
+      <w:rFonts w:ascii="微软雅黑" w:hAnsi="微软雅黑" w:eastAsia="微软雅黑" w:cs="微软雅黑"/>
+    </w:rPr>
   </w:style>
   <w:style w:type="character" w:customStyle="1" w:styleId="Heading1Char">
     <w:name w:val="Heading 1 Char"/>
@@ -6652,7 +6621,7 @@
     <w:uiPriority w:val="9"/>
     <w:rsid w:val="00FC693F"/>
     <w:rPr>
-      <w:rFonts w:asciiTheme="majorHAnsi" w:eastAsiaTheme="majorEastAsia" w:hAnsiTheme="majorHAnsi" w:cstheme="majorBidi"/>
+      <w:rFonts w:ascii="微软雅黑" w:hAnsi="微软雅黑" w:eastAsia="微软雅黑" w:cs="微软雅黑"/>
       <w:b/>
       <w:bCs/>
       <w:color w:val="365F91" w:themeColor="accent1" w:themeShade="BF"/>
@@ -6667,7 +6636,7 @@
     <w:uiPriority w:val="9"/>
     <w:rsid w:val="00FC693F"/>
     <w:rPr>
-      <w:rFonts w:asciiTheme="majorHAnsi" w:eastAsiaTheme="majorEastAsia" w:hAnsiTheme="majorHAnsi" w:cstheme="majorBidi"/>
+      <w:rFonts w:ascii="微软雅黑" w:hAnsi="微软雅黑" w:eastAsia="微软雅黑" w:cs="微软雅黑"/>
       <w:b/>
       <w:bCs/>
       <w:color w:val="4F81BD" w:themeColor="accent1"/>
@@ -6682,7 +6651,7 @@
     <w:uiPriority w:val="9"/>
     <w:rsid w:val="00FC693F"/>
     <w:rPr>
-      <w:rFonts w:asciiTheme="majorHAnsi" w:eastAsiaTheme="majorEastAsia" w:hAnsiTheme="majorHAnsi" w:cstheme="majorBidi"/>
+      <w:rFonts w:ascii="微软雅黑" w:hAnsi="微软雅黑" w:eastAsia="微软雅黑" w:cs="微软雅黑"/>
       <w:b/>
       <w:bCs/>
       <w:color w:val="4F81BD" w:themeColor="accent1"/>
@@ -6701,7 +6670,7 @@
       <w:contextualSpacing/>
     </w:pPr>
     <w:rPr>
-      <w:rFonts w:asciiTheme="majorHAnsi" w:eastAsiaTheme="majorEastAsia" w:hAnsiTheme="majorHAnsi" w:cstheme="majorBidi" w:ascii="Microsoft YaHei" w:hAnsi="Microsoft YaHei" w:eastAsia="微软雅黑"/>
+      <w:rFonts w:ascii="微软雅黑" w:hAnsi="微软雅黑" w:eastAsia="微软雅黑" w:cs="微软雅黑"/>
       <w:color w:val="000000"/>
       <w:spacing w:val="5"/>
       <w:kern w:val="28"/>
@@ -6716,7 +6685,7 @@
     <w:uiPriority w:val="10"/>
     <w:rsid w:val="00FC693F"/>
     <w:rPr>
-      <w:rFonts w:asciiTheme="majorHAnsi" w:eastAsiaTheme="majorEastAsia" w:hAnsiTheme="majorHAnsi" w:cstheme="majorBidi"/>
+      <w:rFonts w:ascii="微软雅黑" w:hAnsi="微软雅黑" w:eastAsia="微软雅黑" w:cs="微软雅黑"/>
       <w:color w:val="17365D" w:themeColor="text2" w:themeShade="BF"/>
       <w:spacing w:val="5"/>
       <w:kern w:val="28"/>
@@ -6739,7 +6708,7 @@
       <w:spacing w:after="120" w:line="283" w:lineRule="auto"/>
     </w:pPr>
     <w:rPr>
-      <w:rFonts w:asciiTheme="majorHAnsi" w:eastAsiaTheme="majorEastAsia" w:hAnsiTheme="majorHAnsi" w:cstheme="majorBidi" w:ascii="Microsoft YaHei" w:hAnsi="Microsoft YaHei" w:eastAsia="微软雅黑"/>
+      <w:rFonts w:ascii="微软雅黑" w:hAnsi="微软雅黑" w:eastAsia="微软雅黑" w:cs="微软雅黑"/>
       <w:i/>
       <w:iCs/>
       <w:color w:val="000000"/>
@@ -6755,7 +6724,7 @@
     <w:uiPriority w:val="11"/>
     <w:rsid w:val="00FC693F"/>
     <w:rPr>
-      <w:rFonts w:asciiTheme="majorHAnsi" w:eastAsiaTheme="majorEastAsia" w:hAnsiTheme="majorHAnsi" w:cstheme="majorBidi"/>
+      <w:rFonts w:ascii="微软雅黑" w:hAnsi="微软雅黑" w:eastAsia="微软雅黑" w:cs="微软雅黑"/>
       <w:i/>
       <w:iCs/>
       <w:color w:val="4F81BD" w:themeColor="accent1"/>
@@ -6774,6 +6743,9 @@
       <w:ind w:left="720"/>
       <w:contextualSpacing/>
     </w:pPr>
+    <w:rPr>
+      <w:rFonts w:ascii="微软雅黑" w:hAnsi="微软雅黑" w:eastAsia="微软雅黑" w:cs="微软雅黑"/>
+    </w:rPr>
   </w:style>
   <w:style w:type="paragraph" w:styleId="BodyText">
     <w:name w:val="Body Text"/>
@@ -6785,6 +6757,9 @@
     <w:pPr>
       <w:spacing w:after="120"/>
     </w:pPr>
+    <w:rPr>
+      <w:rFonts w:ascii="微软雅黑" w:hAnsi="微软雅黑" w:eastAsia="微软雅黑" w:cs="微软雅黑"/>
+    </w:rPr>
   </w:style>
   <w:style w:type="character" w:customStyle="1" w:styleId="BodyTextChar">
     <w:name w:val="Body Text Char"/>
@@ -6792,6 +6767,9 @@
     <w:link w:val="BodyText"/>
     <w:uiPriority w:val="99"/>
     <w:rsid w:val="00AA1D8D"/>
+    <w:rPr>
+      <w:rFonts w:ascii="微软雅黑" w:hAnsi="微软雅黑" w:eastAsia="微软雅黑" w:cs="微软雅黑"/>
+    </w:rPr>
   </w:style>
   <w:style w:type="paragraph" w:styleId="BodyText2">
     <w:name w:val="Body Text 2"/>
@@ -6803,6 +6781,9 @@
     <w:pPr>
       <w:spacing w:after="120" w:line="480" w:lineRule="auto"/>
     </w:pPr>
+    <w:rPr>
+      <w:rFonts w:ascii="微软雅黑" w:hAnsi="微软雅黑" w:eastAsia="微软雅黑" w:cs="微软雅黑"/>
+    </w:rPr>
   </w:style>
   <w:style w:type="character" w:customStyle="1" w:styleId="BodyText2Char">
     <w:name w:val="Body Text 2 Char"/>
@@ -6810,6 +6791,9 @@
     <w:link w:val="BodyText2"/>
     <w:uiPriority w:val="99"/>
     <w:rsid w:val="00AA1D8D"/>
+    <w:rPr>
+      <w:rFonts w:ascii="微软雅黑" w:hAnsi="微软雅黑" w:eastAsia="微软雅黑" w:cs="微软雅黑"/>
+    </w:rPr>
   </w:style>
   <w:style w:type="paragraph" w:styleId="BodyText3">
     <w:name w:val="Body Text 3"/>
@@ -6822,6 +6806,7 @@
       <w:spacing w:after="120"/>
     </w:pPr>
     <w:rPr>
+      <w:rFonts w:ascii="微软雅黑" w:hAnsi="微软雅黑" w:eastAsia="微软雅黑" w:cs="微软雅黑"/>
       <w:sz w:val="16"/>
       <w:szCs w:val="16"/>
     </w:rPr>
@@ -6833,6 +6818,7 @@
     <w:uiPriority w:val="99"/>
     <w:rsid w:val="00AA1D8D"/>
     <w:rPr>
+      <w:rFonts w:ascii="微软雅黑" w:hAnsi="微软雅黑" w:eastAsia="微软雅黑" w:cs="微软雅黑"/>
       <w:sz w:val="16"/>
       <w:szCs w:val="16"/>
     </w:rPr>
@@ -6847,6 +6833,9 @@
       <w:ind w:left="360" w:hanging="360"/>
       <w:contextualSpacing/>
     </w:pPr>
+    <w:rPr>
+      <w:rFonts w:ascii="微软雅黑" w:hAnsi="微软雅黑" w:eastAsia="微软雅黑" w:cs="微软雅黑"/>
+    </w:rPr>
   </w:style>
   <w:style w:type="paragraph" w:styleId="List2">
     <w:name w:val="List 2"/>
@@ -6858,6 +6847,9 @@
       <w:ind w:left="720" w:hanging="360"/>
       <w:contextualSpacing/>
     </w:pPr>
+    <w:rPr>
+      <w:rFonts w:ascii="微软雅黑" w:hAnsi="微软雅黑" w:eastAsia="微软雅黑" w:cs="微软雅黑"/>
+    </w:rPr>
   </w:style>
   <w:style w:type="paragraph" w:styleId="List3">
     <w:name w:val="List 3"/>
@@ -6869,6 +6861,9 @@
       <w:ind w:left="1080" w:hanging="360"/>
       <w:contextualSpacing/>
     </w:pPr>
+    <w:rPr>
+      <w:rFonts w:ascii="微软雅黑" w:hAnsi="微软雅黑" w:eastAsia="微软雅黑" w:cs="微软雅黑"/>
+    </w:rPr>
   </w:style>
   <w:style w:type="paragraph" w:styleId="ListBullet">
     <w:name w:val="List Bullet"/>
@@ -6882,6 +6877,9 @@
       </w:numPr>
       <w:contextualSpacing/>
     </w:pPr>
+    <w:rPr>
+      <w:rFonts w:ascii="微软雅黑" w:hAnsi="微软雅黑" w:eastAsia="微软雅黑" w:cs="微软雅黑"/>
+    </w:rPr>
   </w:style>
   <w:style w:type="paragraph" w:styleId="ListBullet2">
     <w:name w:val="List Bullet 2"/>
@@ -6895,6 +6893,9 @@
       </w:numPr>
       <w:contextualSpacing/>
     </w:pPr>
+    <w:rPr>
+      <w:rFonts w:ascii="微软雅黑" w:hAnsi="微软雅黑" w:eastAsia="微软雅黑" w:cs="微软雅黑"/>
+    </w:rPr>
   </w:style>
   <w:style w:type="paragraph" w:styleId="ListBullet3">
     <w:name w:val="List Bullet 3"/>
@@ -6908,6 +6909,9 @@
       </w:numPr>
       <w:contextualSpacing/>
     </w:pPr>
+    <w:rPr>
+      <w:rFonts w:ascii="微软雅黑" w:hAnsi="微软雅黑" w:eastAsia="微软雅黑" w:cs="微软雅黑"/>
+    </w:rPr>
   </w:style>
   <w:style w:type="paragraph" w:styleId="ListNumber">
     <w:name w:val="List Number"/>
@@ -6921,6 +6925,9 @@
       </w:numPr>
       <w:contextualSpacing/>
     </w:pPr>
+    <w:rPr>
+      <w:rFonts w:ascii="微软雅黑" w:hAnsi="微软雅黑" w:eastAsia="微软雅黑" w:cs="微软雅黑"/>
+    </w:rPr>
   </w:style>
   <w:style w:type="paragraph" w:styleId="ListNumber2">
     <w:name w:val="List Number 2"/>
@@ -6934,6 +6941,9 @@
       </w:numPr>
       <w:contextualSpacing/>
     </w:pPr>
+    <w:rPr>
+      <w:rFonts w:ascii="微软雅黑" w:hAnsi="微软雅黑" w:eastAsia="微软雅黑" w:cs="微软雅黑"/>
+    </w:rPr>
   </w:style>
   <w:style w:type="paragraph" w:styleId="ListNumber3">
     <w:name w:val="List Number 3"/>
@@ -6947,6 +6957,9 @@
       </w:numPr>
       <w:contextualSpacing/>
     </w:pPr>
+    <w:rPr>
+      <w:rFonts w:ascii="微软雅黑" w:hAnsi="微软雅黑" w:eastAsia="微软雅黑" w:cs="微软雅黑"/>
+    </w:rPr>
   </w:style>
   <w:style w:type="paragraph" w:styleId="ListContinue">
     <w:name w:val="List Continue"/>
@@ -6959,6 +6972,9 @@
       <w:ind w:left="360"/>
       <w:contextualSpacing/>
     </w:pPr>
+    <w:rPr>
+      <w:rFonts w:ascii="微软雅黑" w:hAnsi="微软雅黑" w:eastAsia="微软雅黑" w:cs="微软雅黑"/>
+    </w:rPr>
   </w:style>
   <w:style w:type="paragraph" w:styleId="ListContinue2">
     <w:name w:val="List Continue 2"/>
@@ -6971,6 +6987,9 @@
       <w:ind w:left="720"/>
       <w:contextualSpacing/>
     </w:pPr>
+    <w:rPr>
+      <w:rFonts w:ascii="微软雅黑" w:hAnsi="微软雅黑" w:eastAsia="微软雅黑" w:cs="微软雅黑"/>
+    </w:rPr>
   </w:style>
   <w:style w:type="paragraph" w:styleId="ListContinue3">
     <w:name w:val="List Continue 3"/>
@@ -6983,6 +7002,9 @@
       <w:ind w:left="1080"/>
       <w:contextualSpacing/>
     </w:pPr>
+    <w:rPr>
+      <w:rFonts w:ascii="微软雅黑" w:hAnsi="微软雅黑" w:eastAsia="微软雅黑" w:cs="微软雅黑"/>
+    </w:rPr>
   </w:style>
   <w:style w:type="paragraph" w:styleId="MacroText">
     <w:name w:val="macro"/>
@@ -7002,7 +7024,7 @@
       </w:tabs>
     </w:pPr>
     <w:rPr>
-      <w:rFonts w:ascii="Courier" w:hAnsi="Courier"/>
+      <w:rFonts w:ascii="微软雅黑" w:hAnsi="微软雅黑" w:eastAsia="微软雅黑" w:cs="微软雅黑"/>
       <w:sz w:val="20"/>
       <w:szCs w:val="20"/>
     </w:rPr>
@@ -7014,7 +7036,7 @@
     <w:uiPriority w:val="99"/>
     <w:rsid w:val="0029639D"/>
     <w:rPr>
-      <w:rFonts w:ascii="Courier" w:hAnsi="Courier"/>
+      <w:rFonts w:ascii="微软雅黑" w:hAnsi="微软雅黑" w:eastAsia="微软雅黑" w:cs="微软雅黑"/>
       <w:sz w:val="20"/>
       <w:szCs w:val="20"/>
     </w:rPr>
@@ -7028,6 +7050,7 @@
     <w:qFormat/>
     <w:rsid w:val="00FC693F"/>
     <w:rPr>
+      <w:rFonts w:ascii="微软雅黑" w:hAnsi="微软雅黑" w:eastAsia="微软雅黑" w:cs="微软雅黑"/>
       <w:i/>
       <w:iCs/>
       <w:color w:val="000000" w:themeColor="text1"/>
@@ -7040,6 +7063,7 @@
     <w:uiPriority w:val="29"/>
     <w:rsid w:val="00FC693F"/>
     <w:rPr>
+      <w:rFonts w:ascii="微软雅黑" w:hAnsi="微软雅黑" w:eastAsia="微软雅黑" w:cs="微软雅黑"/>
       <w:i/>
       <w:iCs/>
       <w:color w:val="000000" w:themeColor="text1"/>
@@ -7053,7 +7077,7 @@
     <w:semiHidden/>
     <w:rsid w:val="00FC693F"/>
     <w:rPr>
-      <w:rFonts w:asciiTheme="majorHAnsi" w:eastAsiaTheme="majorEastAsia" w:hAnsiTheme="majorHAnsi" w:cstheme="majorBidi"/>
+      <w:rFonts w:ascii="微软雅黑" w:hAnsi="微软雅黑" w:eastAsia="微软雅黑" w:cs="微软雅黑"/>
       <w:b/>
       <w:bCs/>
       <w:i/>
@@ -7069,7 +7093,7 @@
     <w:semiHidden/>
     <w:rsid w:val="00FC693F"/>
     <w:rPr>
-      <w:rFonts w:asciiTheme="majorHAnsi" w:eastAsiaTheme="majorEastAsia" w:hAnsiTheme="majorHAnsi" w:cstheme="majorBidi"/>
+      <w:rFonts w:ascii="微软雅黑" w:hAnsi="微软雅黑" w:eastAsia="微软雅黑" w:cs="微软雅黑"/>
       <w:color w:val="243F60" w:themeColor="accent1" w:themeShade="7F"/>
     </w:rPr>
   </w:style>
@@ -7081,7 +7105,7 @@
     <w:semiHidden/>
     <w:rsid w:val="00FC693F"/>
     <w:rPr>
-      <w:rFonts w:asciiTheme="majorHAnsi" w:eastAsiaTheme="majorEastAsia" w:hAnsiTheme="majorHAnsi" w:cstheme="majorBidi"/>
+      <w:rFonts w:ascii="微软雅黑" w:hAnsi="微软雅黑" w:eastAsia="微软雅黑" w:cs="微软雅黑"/>
       <w:i/>
       <w:iCs/>
       <w:color w:val="243F60" w:themeColor="accent1" w:themeShade="7F"/>
@@ -7095,7 +7119,7 @@
     <w:semiHidden/>
     <w:rsid w:val="00FC693F"/>
     <w:rPr>
-      <w:rFonts w:asciiTheme="majorHAnsi" w:eastAsiaTheme="majorEastAsia" w:hAnsiTheme="majorHAnsi" w:cstheme="majorBidi"/>
+      <w:rFonts w:ascii="微软雅黑" w:hAnsi="微软雅黑" w:eastAsia="微软雅黑" w:cs="微软雅黑"/>
       <w:i/>
       <w:iCs/>
       <w:color w:val="404040" w:themeColor="text1" w:themeTint="BF"/>
@@ -7109,7 +7133,7 @@
     <w:semiHidden/>
     <w:rsid w:val="00FC693F"/>
     <w:rPr>
-      <w:rFonts w:asciiTheme="majorHAnsi" w:eastAsiaTheme="majorEastAsia" w:hAnsiTheme="majorHAnsi" w:cstheme="majorBidi"/>
+      <w:rFonts w:ascii="微软雅黑" w:hAnsi="微软雅黑" w:eastAsia="微软雅黑" w:cs="微软雅黑"/>
       <w:color w:val="4F81BD" w:themeColor="accent1"/>
       <w:sz w:val="20"/>
       <w:szCs w:val="20"/>
@@ -7123,7 +7147,7 @@
     <w:semiHidden/>
     <w:rsid w:val="00FC693F"/>
     <w:rPr>
-      <w:rFonts w:asciiTheme="majorHAnsi" w:eastAsiaTheme="majorEastAsia" w:hAnsiTheme="majorHAnsi" w:cstheme="majorBidi"/>
+      <w:rFonts w:ascii="微软雅黑" w:hAnsi="微软雅黑" w:eastAsia="微软雅黑" w:cs="微软雅黑"/>
       <w:i/>
       <w:iCs/>
       <w:color w:val="404040" w:themeColor="text1" w:themeTint="BF"/>
@@ -7144,6 +7168,7 @@
       <w:spacing w:line="240" w:lineRule="auto"/>
     </w:pPr>
     <w:rPr>
+      <w:rFonts w:ascii="微软雅黑" w:hAnsi="微软雅黑" w:eastAsia="微软雅黑" w:cs="微软雅黑"/>
       <w:b/>
       <w:bCs/>
       <w:color w:val="4F81BD" w:themeColor="accent1"/>
@@ -7158,6 +7183,7 @@
     <w:qFormat/>
     <w:rsid w:val="00FC693F"/>
     <w:rPr>
+      <w:rFonts w:ascii="微软雅黑" w:hAnsi="微软雅黑" w:eastAsia="微软雅黑" w:cs="微软雅黑"/>
       <w:b/>
       <w:bCs/>
     </w:rPr>
@@ -7169,6 +7195,7 @@
     <w:qFormat/>
     <w:rsid w:val="00FC693F"/>
     <w:rPr>
+      <w:rFonts w:ascii="微软雅黑" w:hAnsi="微软雅黑" w:eastAsia="微软雅黑" w:cs="微软雅黑"/>
       <w:i/>
       <w:iCs/>
     </w:rPr>
@@ -7186,6 +7213,7 @@
       <w:ind w:left="936" w:right="936"/>
     </w:pPr>
     <w:rPr>
+      <w:rFonts w:ascii="微软雅黑" w:hAnsi="微软雅黑" w:eastAsia="微软雅黑" w:cs="微软雅黑"/>
       <w:b/>
       <w:bCs/>
       <w:i/>
@@ -7200,6 +7228,7 @@
     <w:uiPriority w:val="30"/>
     <w:rsid w:val="00FC693F"/>
     <w:rPr>
+      <w:rFonts w:ascii="微软雅黑" w:hAnsi="微软雅黑" w:eastAsia="微软雅黑" w:cs="微软雅黑"/>
       <w:b/>
       <w:bCs/>
       <w:i/>
@@ -7214,6 +7243,7 @@
     <w:qFormat/>
     <w:rsid w:val="00FC693F"/>
     <w:rPr>
+      <w:rFonts w:ascii="微软雅黑" w:hAnsi="微软雅黑" w:eastAsia="微软雅黑" w:cs="微软雅黑"/>
       <w:i/>
       <w:iCs/>
       <w:color w:val="808080" w:themeColor="text1" w:themeTint="7F"/>
@@ -7226,6 +7256,7 @@
     <w:qFormat/>
     <w:rsid w:val="00FC693F"/>
     <w:rPr>
+      <w:rFonts w:ascii="微软雅黑" w:hAnsi="微软雅黑" w:eastAsia="微软雅黑" w:cs="微软雅黑"/>
       <w:b/>
       <w:bCs/>
       <w:i/>
@@ -7240,6 +7271,7 @@
     <w:qFormat/>
     <w:rsid w:val="00FC693F"/>
     <w:rPr>
+      <w:rFonts w:ascii="微软雅黑" w:hAnsi="微软雅黑" w:eastAsia="微软雅黑" w:cs="微软雅黑"/>
       <w:smallCaps/>
       <w:color w:val="C0504D" w:themeColor="accent2"/>
       <w:u w:val="single"/>
@@ -7252,6 +7284,7 @@
     <w:qFormat/>
     <w:rsid w:val="00FC693F"/>
     <w:rPr>
+      <w:rFonts w:ascii="微软雅黑" w:hAnsi="微软雅黑" w:eastAsia="微软雅黑" w:cs="微软雅黑"/>
       <w:b/>
       <w:bCs/>
       <w:smallCaps/>
@@ -7267,6 +7300,7 @@
     <w:qFormat/>
     <w:rsid w:val="00FC693F"/>
     <w:rPr>
+      <w:rFonts w:ascii="微软雅黑" w:hAnsi="微软雅黑" w:eastAsia="微软雅黑" w:cs="微软雅黑"/>
       <w:b/>
       <w:bCs/>
       <w:smallCaps/>
@@ -7285,6 +7319,9 @@
     <w:pPr>
       <w:outlineLvl w:val="9"/>
     </w:pPr>
+    <w:rPr>
+      <w:rFonts w:ascii="微软雅黑" w:hAnsi="微软雅黑" w:eastAsia="微软雅黑" w:cs="微软雅黑"/>
+    </w:rPr>
   </w:style>
   <w:style w:type="table" w:styleId="TableGrid">
     <w:name w:val="Table Grid"/>
@@ -7294,6 +7331,9 @@
     <w:pPr>
       <w:spacing w:after="0" w:line="240" w:lineRule="auto"/>
     </w:pPr>
+    <w:rPr>
+      <w:rFonts w:ascii="微软雅黑" w:hAnsi="微软雅黑" w:eastAsia="微软雅黑" w:cs="微软雅黑"/>
+    </w:rPr>
     <w:tblPr>
       <w:tblInd w:w="0" w:type="dxa"/>
       <w:tblBorders>
@@ -7321,6 +7361,7 @@
       <w:spacing w:after="0" w:line="240" w:lineRule="auto"/>
     </w:pPr>
     <w:rPr>
+      <w:rFonts w:ascii="微软雅黑" w:hAnsi="微软雅黑" w:eastAsia="微软雅黑" w:cs="微软雅黑"/>
       <w:color w:val="000000" w:themeColor="text1" w:themeShade="BF"/>
     </w:rPr>
     <w:tblPr>
@@ -7424,6 +7465,7 @@
       <w:spacing w:after="0" w:line="240" w:lineRule="auto"/>
     </w:pPr>
     <w:rPr>
+      <w:rFonts w:ascii="微软雅黑" w:hAnsi="微软雅黑" w:eastAsia="微软雅黑" w:cs="微软雅黑"/>
       <w:color w:val="365F91" w:themeColor="accent1" w:themeShade="BF"/>
     </w:rPr>
     <w:tblPr>
@@ -7527,6 +7569,7 @@
       <w:spacing w:after="0" w:line="240" w:lineRule="auto"/>
     </w:pPr>
     <w:rPr>
+      <w:rFonts w:ascii="微软雅黑" w:hAnsi="微软雅黑" w:eastAsia="微软雅黑" w:cs="微软雅黑"/>
       <w:color w:val="943634" w:themeColor="accent2" w:themeShade="BF"/>
     </w:rPr>
     <w:tblPr>
@@ -7630,6 +7673,7 @@
       <w:spacing w:after="0" w:line="240" w:lineRule="auto"/>
     </w:pPr>
     <w:rPr>
+      <w:rFonts w:ascii="微软雅黑" w:hAnsi="微软雅黑" w:eastAsia="微软雅黑" w:cs="微软雅黑"/>
       <w:color w:val="76923C" w:themeColor="accent3" w:themeShade="BF"/>
     </w:rPr>
     <w:tblPr>
@@ -7733,6 +7777,7 @@
       <w:spacing w:after="0" w:line="240" w:lineRule="auto"/>
     </w:pPr>
     <w:rPr>
+      <w:rFonts w:ascii="微软雅黑" w:hAnsi="微软雅黑" w:eastAsia="微软雅黑" w:cs="微软雅黑"/>
       <w:color w:val="5F497A" w:themeColor="accent4" w:themeShade="BF"/>
     </w:rPr>
     <w:tblPr>
@@ -7836,6 +7881,7 @@
       <w:spacing w:after="0" w:line="240" w:lineRule="auto"/>
     </w:pPr>
     <w:rPr>
+      <w:rFonts w:ascii="微软雅黑" w:hAnsi="微软雅黑" w:eastAsia="微软雅黑" w:cs="微软雅黑"/>
       <w:color w:val="31849B" w:themeColor="accent5" w:themeShade="BF"/>
     </w:rPr>
     <w:tblPr>
@@ -7939,6 +7985,7 @@
       <w:spacing w:after="0" w:line="240" w:lineRule="auto"/>
     </w:pPr>
     <w:rPr>
+      <w:rFonts w:ascii="微软雅黑" w:hAnsi="微软雅黑" w:eastAsia="微软雅黑" w:cs="微软雅黑"/>
       <w:color w:val="E36C0A" w:themeColor="accent6" w:themeShade="BF"/>
     </w:rPr>
     <w:tblPr>
@@ -8041,6 +8088,9 @@
     <w:pPr>
       <w:spacing w:after="0" w:line="240" w:lineRule="auto"/>
     </w:pPr>
+    <w:rPr>
+      <w:rFonts w:ascii="微软雅黑" w:hAnsi="微软雅黑" w:eastAsia="微软雅黑" w:cs="微软雅黑"/>
+    </w:rPr>
     <w:tblPr>
       <w:tblStyleRowBandSize w:val="1"/>
       <w:tblStyleColBandSize w:val="1"/>
@@ -8133,6 +8183,9 @@
     <w:pPr>
       <w:spacing w:after="0" w:line="240" w:lineRule="auto"/>
     </w:pPr>
+    <w:rPr>
+      <w:rFonts w:ascii="微软雅黑" w:hAnsi="微软雅黑" w:eastAsia="微软雅黑" w:cs="微软雅黑"/>
+    </w:rPr>
     <w:tblPr>
       <w:tblStyleRowBandSize w:val="1"/>
       <w:tblStyleColBandSize w:val="1"/>
@@ -8225,6 +8278,9 @@
     <w:pPr>
       <w:spacing w:after="0" w:line="240" w:lineRule="auto"/>
     </w:pPr>
+    <w:rPr>
+      <w:rFonts w:ascii="微软雅黑" w:hAnsi="微软雅黑" w:eastAsia="微软雅黑" w:cs="微软雅黑"/>
+    </w:rPr>
     <w:tblPr>
       <w:tblStyleRowBandSize w:val="1"/>
       <w:tblStyleColBandSize w:val="1"/>
@@ -8317,6 +8373,9 @@
     <w:pPr>
       <w:spacing w:after="0" w:line="240" w:lineRule="auto"/>
     </w:pPr>
+    <w:rPr>
+      <w:rFonts w:ascii="微软雅黑" w:hAnsi="微软雅黑" w:eastAsia="微软雅黑" w:cs="微软雅黑"/>
+    </w:rPr>
     <w:tblPr>
       <w:tblStyleRowBandSize w:val="1"/>
       <w:tblStyleColBandSize w:val="1"/>
@@ -8409,6 +8468,9 @@
     <w:pPr>
       <w:spacing w:after="0" w:line="240" w:lineRule="auto"/>
     </w:pPr>
+    <w:rPr>
+      <w:rFonts w:ascii="微软雅黑" w:hAnsi="微软雅黑" w:eastAsia="微软雅黑" w:cs="微软雅黑"/>
+    </w:rPr>
     <w:tblPr>
       <w:tblStyleRowBandSize w:val="1"/>
       <w:tblStyleColBandSize w:val="1"/>
@@ -8501,6 +8563,9 @@
     <w:pPr>
       <w:spacing w:after="0" w:line="240" w:lineRule="auto"/>
     </w:pPr>
+    <w:rPr>
+      <w:rFonts w:ascii="微软雅黑" w:hAnsi="微软雅黑" w:eastAsia="微软雅黑" w:cs="微软雅黑"/>
+    </w:rPr>
     <w:tblPr>
       <w:tblStyleRowBandSize w:val="1"/>
       <w:tblStyleColBandSize w:val="1"/>
@@ -8593,6 +8658,9 @@
     <w:pPr>
       <w:spacing w:after="0" w:line="240" w:lineRule="auto"/>
     </w:pPr>
+    <w:rPr>
+      <w:rFonts w:ascii="微软雅黑" w:hAnsi="微软雅黑" w:eastAsia="微软雅黑" w:cs="微软雅黑"/>
+    </w:rPr>
     <w:tblPr>
       <w:tblStyleRowBandSize w:val="1"/>
       <w:tblStyleColBandSize w:val="1"/>
@@ -8685,6 +8753,9 @@
     <w:pPr>
       <w:spacing w:after="0" w:line="240" w:lineRule="auto"/>
     </w:pPr>
+    <w:rPr>
+      <w:rFonts w:ascii="微软雅黑" w:hAnsi="微软雅黑" w:eastAsia="微软雅黑" w:cs="微软雅黑"/>
+    </w:rPr>
     <w:tblPr>
       <w:tblStyleRowBandSize w:val="1"/>
       <w:tblStyleColBandSize w:val="1"/>
@@ -8709,7 +8780,7 @@
         <w:spacing w:before="0" w:after="0" w:line="240" w:lineRule="auto"/>
       </w:pPr>
       <w:rPr>
-        <w:rFonts w:asciiTheme="majorHAnsi" w:eastAsiaTheme="majorEastAsia" w:hAnsiTheme="majorHAnsi" w:cstheme="majorBidi"/>
+        <w:rFonts w:ascii="微软雅黑" w:hAnsi="微软雅黑" w:eastAsia="微软雅黑" w:cs="微软雅黑"/>
         <w:b/>
         <w:bCs/>
       </w:rPr>
@@ -8730,7 +8801,7 @@
         <w:spacing w:before="0" w:after="0" w:line="240" w:lineRule="auto"/>
       </w:pPr>
       <w:rPr>
-        <w:rFonts w:asciiTheme="majorHAnsi" w:eastAsiaTheme="majorEastAsia" w:hAnsiTheme="majorHAnsi" w:cstheme="majorBidi"/>
+        <w:rFonts w:ascii="微软雅黑" w:hAnsi="微软雅黑" w:eastAsia="微软雅黑" w:cs="微软雅黑"/>
         <w:b/>
         <w:bCs/>
       </w:rPr>
@@ -8748,14 +8819,14 @@
     </w:tblStylePr>
     <w:tblStylePr w:type="firstCol">
       <w:rPr>
-        <w:rFonts w:asciiTheme="majorHAnsi" w:eastAsiaTheme="majorEastAsia" w:hAnsiTheme="majorHAnsi" w:cstheme="majorBidi"/>
+        <w:rFonts w:ascii="微软雅黑" w:hAnsi="微软雅黑" w:eastAsia="微软雅黑" w:cs="微软雅黑"/>
         <w:b/>
         <w:bCs/>
       </w:rPr>
     </w:tblStylePr>
     <w:tblStylePr w:type="lastCol">
       <w:rPr>
-        <w:rFonts w:asciiTheme="majorHAnsi" w:eastAsiaTheme="majorEastAsia" w:hAnsiTheme="majorHAnsi" w:cstheme="majorBidi"/>
+        <w:rFonts w:ascii="微软雅黑" w:hAnsi="微软雅黑" w:eastAsia="微软雅黑" w:cs="微软雅黑"/>
         <w:b/>
         <w:bCs/>
       </w:rPr>
@@ -8815,6 +8886,9 @@
     <w:pPr>
       <w:spacing w:after="0" w:line="240" w:lineRule="auto"/>
     </w:pPr>
+    <w:rPr>
+      <w:rFonts w:ascii="微软雅黑" w:hAnsi="微软雅黑" w:eastAsia="微软雅黑" w:cs="微软雅黑"/>
+    </w:rPr>
     <w:tblPr>
       <w:tblStyleRowBandSize w:val="1"/>
       <w:tblStyleColBandSize w:val="1"/>
@@ -8839,7 +8913,7 @@
         <w:spacing w:before="0" w:after="0" w:line="240" w:lineRule="auto"/>
       </w:pPr>
       <w:rPr>
-        <w:rFonts w:asciiTheme="majorHAnsi" w:eastAsiaTheme="majorEastAsia" w:hAnsiTheme="majorHAnsi" w:cstheme="majorBidi"/>
+        <w:rFonts w:ascii="微软雅黑" w:hAnsi="微软雅黑" w:eastAsia="微软雅黑" w:cs="微软雅黑"/>
         <w:b/>
         <w:bCs/>
       </w:rPr>
@@ -8860,7 +8934,7 @@
         <w:spacing w:before="0" w:after="0" w:line="240" w:lineRule="auto"/>
       </w:pPr>
       <w:rPr>
-        <w:rFonts w:asciiTheme="majorHAnsi" w:eastAsiaTheme="majorEastAsia" w:hAnsiTheme="majorHAnsi" w:cstheme="majorBidi"/>
+        <w:rFonts w:ascii="微软雅黑" w:hAnsi="微软雅黑" w:eastAsia="微软雅黑" w:cs="微软雅黑"/>
         <w:b/>
         <w:bCs/>
       </w:rPr>
@@ -8878,14 +8952,14 @@
     </w:tblStylePr>
     <w:tblStylePr w:type="firstCol">
       <w:rPr>
-        <w:rFonts w:asciiTheme="majorHAnsi" w:eastAsiaTheme="majorEastAsia" w:hAnsiTheme="majorHAnsi" w:cstheme="majorBidi"/>
+        <w:rFonts w:ascii="微软雅黑" w:hAnsi="微软雅黑" w:eastAsia="微软雅黑" w:cs="微软雅黑"/>
         <w:b/>
         <w:bCs/>
       </w:rPr>
     </w:tblStylePr>
     <w:tblStylePr w:type="lastCol">
       <w:rPr>
-        <w:rFonts w:asciiTheme="majorHAnsi" w:eastAsiaTheme="majorEastAsia" w:hAnsiTheme="majorHAnsi" w:cstheme="majorBidi"/>
+        <w:rFonts w:ascii="微软雅黑" w:hAnsi="微软雅黑" w:eastAsia="微软雅黑" w:cs="微软雅黑"/>
         <w:b/>
         <w:bCs/>
       </w:rPr>
@@ -8945,6 +9019,9 @@
     <w:pPr>
       <w:spacing w:after="0" w:line="240" w:lineRule="auto"/>
     </w:pPr>
+    <w:rPr>
+      <w:rFonts w:ascii="微软雅黑" w:hAnsi="微软雅黑" w:eastAsia="微软雅黑" w:cs="微软雅黑"/>
+    </w:rPr>
     <w:tblPr>
       <w:tblStyleRowBandSize w:val="1"/>
       <w:tblStyleColBandSize w:val="1"/>
@@ -8969,7 +9046,7 @@
         <w:spacing w:before="0" w:after="0" w:line="240" w:lineRule="auto"/>
       </w:pPr>
       <w:rPr>
-        <w:rFonts w:asciiTheme="majorHAnsi" w:eastAsiaTheme="majorEastAsia" w:hAnsiTheme="majorHAnsi" w:cstheme="majorBidi"/>
+        <w:rFonts w:ascii="微软雅黑" w:hAnsi="微软雅黑" w:eastAsia="微软雅黑" w:cs="微软雅黑"/>
         <w:b/>
         <w:bCs/>
       </w:rPr>
@@ -8990,7 +9067,7 @@
         <w:spacing w:before="0" w:after="0" w:line="240" w:lineRule="auto"/>
       </w:pPr>
       <w:rPr>
-        <w:rFonts w:asciiTheme="majorHAnsi" w:eastAsiaTheme="majorEastAsia" w:hAnsiTheme="majorHAnsi" w:cstheme="majorBidi"/>
+        <w:rFonts w:ascii="微软雅黑" w:hAnsi="微软雅黑" w:eastAsia="微软雅黑" w:cs="微软雅黑"/>
         <w:b/>
         <w:bCs/>
       </w:rPr>
@@ -9008,14 +9085,14 @@
     </w:tblStylePr>
     <w:tblStylePr w:type="firstCol">
       <w:rPr>
-        <w:rFonts w:asciiTheme="majorHAnsi" w:eastAsiaTheme="majorEastAsia" w:hAnsiTheme="majorHAnsi" w:cstheme="majorBidi"/>
+        <w:rFonts w:ascii="微软雅黑" w:hAnsi="微软雅黑" w:eastAsia="微软雅黑" w:cs="微软雅黑"/>
         <w:b/>
         <w:bCs/>
       </w:rPr>
     </w:tblStylePr>
     <w:tblStylePr w:type="lastCol">
       <w:rPr>
-        <w:rFonts w:asciiTheme="majorHAnsi" w:eastAsiaTheme="majorEastAsia" w:hAnsiTheme="majorHAnsi" w:cstheme="majorBidi"/>
+        <w:rFonts w:ascii="微软雅黑" w:hAnsi="微软雅黑" w:eastAsia="微软雅黑" w:cs="微软雅黑"/>
         <w:b/>
         <w:bCs/>
       </w:rPr>
@@ -9075,6 +9152,9 @@
     <w:pPr>
       <w:spacing w:after="0" w:line="240" w:lineRule="auto"/>
     </w:pPr>
+    <w:rPr>
+      <w:rFonts w:ascii="微软雅黑" w:hAnsi="微软雅黑" w:eastAsia="微软雅黑" w:cs="微软雅黑"/>
+    </w:rPr>
     <w:tblPr>
       <w:tblStyleRowBandSize w:val="1"/>
       <w:tblStyleColBandSize w:val="1"/>
@@ -9099,7 +9179,7 @@
         <w:spacing w:before="0" w:after="0" w:line="240" w:lineRule="auto"/>
       </w:pPr>
       <w:rPr>
-        <w:rFonts w:asciiTheme="majorHAnsi" w:eastAsiaTheme="majorEastAsia" w:hAnsiTheme="majorHAnsi" w:cstheme="majorBidi"/>
+        <w:rFonts w:ascii="微软雅黑" w:hAnsi="微软雅黑" w:eastAsia="微软雅黑" w:cs="微软雅黑"/>
         <w:b/>
         <w:bCs/>
       </w:rPr>
@@ -9120,7 +9200,7 @@
         <w:spacing w:before="0" w:after="0" w:line="240" w:lineRule="auto"/>
       </w:pPr>
       <w:rPr>
-        <w:rFonts w:asciiTheme="majorHAnsi" w:eastAsiaTheme="majorEastAsia" w:hAnsiTheme="majorHAnsi" w:cstheme="majorBidi"/>
+        <w:rFonts w:ascii="微软雅黑" w:hAnsi="微软雅黑" w:eastAsia="微软雅黑" w:cs="微软雅黑"/>
         <w:b/>
         <w:bCs/>
       </w:rPr>
@@ -9138,14 +9218,14 @@
     </w:tblStylePr>
     <w:tblStylePr w:type="firstCol">
       <w:rPr>
-        <w:rFonts w:asciiTheme="majorHAnsi" w:eastAsiaTheme="majorEastAsia" w:hAnsiTheme="majorHAnsi" w:cstheme="majorBidi"/>
+        <w:rFonts w:ascii="微软雅黑" w:hAnsi="微软雅黑" w:eastAsia="微软雅黑" w:cs="微软雅黑"/>
         <w:b/>
         <w:bCs/>
       </w:rPr>
     </w:tblStylePr>
     <w:tblStylePr w:type="lastCol">
       <w:rPr>
-        <w:rFonts w:asciiTheme="majorHAnsi" w:eastAsiaTheme="majorEastAsia" w:hAnsiTheme="majorHAnsi" w:cstheme="majorBidi"/>
+        <w:rFonts w:ascii="微软雅黑" w:hAnsi="微软雅黑" w:eastAsia="微软雅黑" w:cs="微软雅黑"/>
         <w:b/>
         <w:bCs/>
       </w:rPr>
@@ -9205,6 +9285,9 @@
     <w:pPr>
       <w:spacing w:after="0" w:line="240" w:lineRule="auto"/>
     </w:pPr>
+    <w:rPr>
+      <w:rFonts w:ascii="微软雅黑" w:hAnsi="微软雅黑" w:eastAsia="微软雅黑" w:cs="微软雅黑"/>
+    </w:rPr>
     <w:tblPr>
       <w:tblStyleRowBandSize w:val="1"/>
       <w:tblStyleColBandSize w:val="1"/>
@@ -9229,7 +9312,7 @@
         <w:spacing w:before="0" w:after="0" w:line="240" w:lineRule="auto"/>
       </w:pPr>
       <w:rPr>
-        <w:rFonts w:asciiTheme="majorHAnsi" w:eastAsiaTheme="majorEastAsia" w:hAnsiTheme="majorHAnsi" w:cstheme="majorBidi"/>
+        <w:rFonts w:ascii="微软雅黑" w:hAnsi="微软雅黑" w:eastAsia="微软雅黑" w:cs="微软雅黑"/>
         <w:b/>
         <w:bCs/>
       </w:rPr>
@@ -9250,7 +9333,7 @@
         <w:spacing w:before="0" w:after="0" w:line="240" w:lineRule="auto"/>
       </w:pPr>
       <w:rPr>
-        <w:rFonts w:asciiTheme="majorHAnsi" w:eastAsiaTheme="majorEastAsia" w:hAnsiTheme="majorHAnsi" w:cstheme="majorBidi"/>
+        <w:rFonts w:ascii="微软雅黑" w:hAnsi="微软雅黑" w:eastAsia="微软雅黑" w:cs="微软雅黑"/>
         <w:b/>
         <w:bCs/>
       </w:rPr>
@@ -9268,14 +9351,14 @@
     </w:tblStylePr>
     <w:tblStylePr w:type="firstCol">
       <w:rPr>
-        <w:rFonts w:asciiTheme="majorHAnsi" w:eastAsiaTheme="majorEastAsia" w:hAnsiTheme="majorHAnsi" w:cstheme="majorBidi"/>
+        <w:rFonts w:ascii="微软雅黑" w:hAnsi="微软雅黑" w:eastAsia="微软雅黑" w:cs="微软雅黑"/>
         <w:b/>
         <w:bCs/>
       </w:rPr>
     </w:tblStylePr>
     <w:tblStylePr w:type="lastCol">
       <w:rPr>
-        <w:rFonts w:asciiTheme="majorHAnsi" w:eastAsiaTheme="majorEastAsia" w:hAnsiTheme="majorHAnsi" w:cstheme="majorBidi"/>
+        <w:rFonts w:ascii="微软雅黑" w:hAnsi="微软雅黑" w:eastAsia="微软雅黑" w:cs="微软雅黑"/>
         <w:b/>
         <w:bCs/>
       </w:rPr>
@@ -9335,6 +9418,9 @@
     <w:pPr>
       <w:spacing w:after="0" w:line="240" w:lineRule="auto"/>
     </w:pPr>
+    <w:rPr>
+      <w:rFonts w:ascii="微软雅黑" w:hAnsi="微软雅黑" w:eastAsia="微软雅黑" w:cs="微软雅黑"/>
+    </w:rPr>
     <w:tblPr>
       <w:tblStyleRowBandSize w:val="1"/>
       <w:tblStyleColBandSize w:val="1"/>
@@ -9359,7 +9445,7 @@
         <w:spacing w:before="0" w:after="0" w:line="240" w:lineRule="auto"/>
       </w:pPr>
       <w:rPr>
-        <w:rFonts w:asciiTheme="majorHAnsi" w:eastAsiaTheme="majorEastAsia" w:hAnsiTheme="majorHAnsi" w:cstheme="majorBidi"/>
+        <w:rFonts w:ascii="微软雅黑" w:hAnsi="微软雅黑" w:eastAsia="微软雅黑" w:cs="微软雅黑"/>
         <w:b/>
         <w:bCs/>
       </w:rPr>
@@ -9380,7 +9466,7 @@
         <w:spacing w:before="0" w:after="0" w:line="240" w:lineRule="auto"/>
       </w:pPr>
       <w:rPr>
-        <w:rFonts w:asciiTheme="majorHAnsi" w:eastAsiaTheme="majorEastAsia" w:hAnsiTheme="majorHAnsi" w:cstheme="majorBidi"/>
+        <w:rFonts w:ascii="微软雅黑" w:hAnsi="微软雅黑" w:eastAsia="微软雅黑" w:cs="微软雅黑"/>
         <w:b/>
         <w:bCs/>
       </w:rPr>
@@ -9398,14 +9484,14 @@
     </w:tblStylePr>
     <w:tblStylePr w:type="firstCol">
       <w:rPr>
-        <w:rFonts w:asciiTheme="majorHAnsi" w:eastAsiaTheme="majorEastAsia" w:hAnsiTheme="majorHAnsi" w:cstheme="majorBidi"/>
+        <w:rFonts w:ascii="微软雅黑" w:hAnsi="微软雅黑" w:eastAsia="微软雅黑" w:cs="微软雅黑"/>
         <w:b/>
         <w:bCs/>
       </w:rPr>
     </w:tblStylePr>
     <w:tblStylePr w:type="lastCol">
       <w:rPr>
-        <w:rFonts w:asciiTheme="majorHAnsi" w:eastAsiaTheme="majorEastAsia" w:hAnsiTheme="majorHAnsi" w:cstheme="majorBidi"/>
+        <w:rFonts w:ascii="微软雅黑" w:hAnsi="微软雅黑" w:eastAsia="微软雅黑" w:cs="微软雅黑"/>
         <w:b/>
         <w:bCs/>
       </w:rPr>
@@ -9465,6 +9551,9 @@
     <w:pPr>
       <w:spacing w:after="0" w:line="240" w:lineRule="auto"/>
     </w:pPr>
+    <w:rPr>
+      <w:rFonts w:ascii="微软雅黑" w:hAnsi="微软雅黑" w:eastAsia="微软雅黑" w:cs="微软雅黑"/>
+    </w:rPr>
     <w:tblPr>
       <w:tblStyleRowBandSize w:val="1"/>
       <w:tblStyleColBandSize w:val="1"/>
@@ -9489,7 +9578,7 @@
         <w:spacing w:before="0" w:after="0" w:line="240" w:lineRule="auto"/>
       </w:pPr>
       <w:rPr>
-        <w:rFonts w:asciiTheme="majorHAnsi" w:eastAsiaTheme="majorEastAsia" w:hAnsiTheme="majorHAnsi" w:cstheme="majorBidi"/>
+        <w:rFonts w:ascii="微软雅黑" w:hAnsi="微软雅黑" w:eastAsia="微软雅黑" w:cs="微软雅黑"/>
         <w:b/>
         <w:bCs/>
       </w:rPr>
@@ -9510,7 +9599,7 @@
         <w:spacing w:before="0" w:after="0" w:line="240" w:lineRule="auto"/>
       </w:pPr>
       <w:rPr>
-        <w:rFonts w:asciiTheme="majorHAnsi" w:eastAsiaTheme="majorEastAsia" w:hAnsiTheme="majorHAnsi" w:cstheme="majorBidi"/>
+        <w:rFonts w:ascii="微软雅黑" w:hAnsi="微软雅黑" w:eastAsia="微软雅黑" w:cs="微软雅黑"/>
         <w:b/>
         <w:bCs/>
       </w:rPr>
@@ -9528,14 +9617,14 @@
     </w:tblStylePr>
     <w:tblStylePr w:type="firstCol">
       <w:rPr>
-        <w:rFonts w:asciiTheme="majorHAnsi" w:eastAsiaTheme="majorEastAsia" w:hAnsiTheme="majorHAnsi" w:cstheme="majorBidi"/>
+        <w:rFonts w:ascii="微软雅黑" w:hAnsi="微软雅黑" w:eastAsia="微软雅黑" w:cs="微软雅黑"/>
         <w:b/>
         <w:bCs/>
       </w:rPr>
     </w:tblStylePr>
     <w:tblStylePr w:type="lastCol">
       <w:rPr>
-        <w:rFonts w:asciiTheme="majorHAnsi" w:eastAsiaTheme="majorEastAsia" w:hAnsiTheme="majorHAnsi" w:cstheme="majorBidi"/>
+        <w:rFonts w:ascii="微软雅黑" w:hAnsi="微软雅黑" w:eastAsia="微软雅黑" w:cs="微软雅黑"/>
         <w:b/>
         <w:bCs/>
       </w:rPr>
@@ -9595,6 +9684,9 @@
     <w:pPr>
       <w:spacing w:after="0" w:line="240" w:lineRule="auto"/>
     </w:pPr>
+    <w:rPr>
+      <w:rFonts w:ascii="微软雅黑" w:hAnsi="微软雅黑" w:eastAsia="微软雅黑" w:cs="微软雅黑"/>
+    </w:rPr>
     <w:tblPr>
       <w:tblStyleRowBandSize w:val="1"/>
       <w:tblStyleColBandSize w:val="1"/>
@@ -9701,6 +9793,9 @@
     <w:pPr>
       <w:spacing w:after="0" w:line="240" w:lineRule="auto"/>
     </w:pPr>
+    <w:rPr>
+      <w:rFonts w:ascii="微软雅黑" w:hAnsi="微软雅黑" w:eastAsia="微软雅黑" w:cs="微软雅黑"/>
+    </w:rPr>
     <w:tblPr>
       <w:tblStyleRowBandSize w:val="1"/>
       <w:tblStyleColBandSize w:val="1"/>
@@ -9807,6 +9902,9 @@
     <w:pPr>
       <w:spacing w:after="0" w:line="240" w:lineRule="auto"/>
     </w:pPr>
+    <w:rPr>
+      <w:rFonts w:ascii="微软雅黑" w:hAnsi="微软雅黑" w:eastAsia="微软雅黑" w:cs="微软雅黑"/>
+    </w:rPr>
     <w:tblPr>
       <w:tblStyleRowBandSize w:val="1"/>
       <w:tblStyleColBandSize w:val="1"/>
@@ -9913,6 +10011,9 @@
     <w:pPr>
       <w:spacing w:after="0" w:line="240" w:lineRule="auto"/>
     </w:pPr>
+    <w:rPr>
+      <w:rFonts w:ascii="微软雅黑" w:hAnsi="微软雅黑" w:eastAsia="微软雅黑" w:cs="微软雅黑"/>
+    </w:rPr>
     <w:tblPr>
       <w:tblStyleRowBandSize w:val="1"/>
       <w:tblStyleColBandSize w:val="1"/>
@@ -10019,6 +10120,9 @@
     <w:pPr>
       <w:spacing w:after="0" w:line="240" w:lineRule="auto"/>
     </w:pPr>
+    <w:rPr>
+      <w:rFonts w:ascii="微软雅黑" w:hAnsi="微软雅黑" w:eastAsia="微软雅黑" w:cs="微软雅黑"/>
+    </w:rPr>
     <w:tblPr>
       <w:tblStyleRowBandSize w:val="1"/>
       <w:tblStyleColBandSize w:val="1"/>
@@ -10125,6 +10229,9 @@
     <w:pPr>
       <w:spacing w:after="0" w:line="240" w:lineRule="auto"/>
     </w:pPr>
+    <w:rPr>
+      <w:rFonts w:ascii="微软雅黑" w:hAnsi="微软雅黑" w:eastAsia="微软雅黑" w:cs="微软雅黑"/>
+    </w:rPr>
     <w:tblPr>
       <w:tblStyleRowBandSize w:val="1"/>
       <w:tblStyleColBandSize w:val="1"/>
@@ -10231,6 +10338,9 @@
     <w:pPr>
       <w:spacing w:after="0" w:line="240" w:lineRule="auto"/>
     </w:pPr>
+    <w:rPr>
+      <w:rFonts w:ascii="微软雅黑" w:hAnsi="微软雅黑" w:eastAsia="微软雅黑" w:cs="微软雅黑"/>
+    </w:rPr>
     <w:tblPr>
       <w:tblStyleRowBandSize w:val="1"/>
       <w:tblStyleColBandSize w:val="1"/>
@@ -10337,6 +10447,9 @@
     <w:pPr>
       <w:spacing w:after="0" w:line="240" w:lineRule="auto"/>
     </w:pPr>
+    <w:rPr>
+      <w:rFonts w:ascii="微软雅黑" w:hAnsi="微软雅黑" w:eastAsia="微软雅黑" w:cs="微软雅黑"/>
+    </w:rPr>
     <w:tblPr>
       <w:tblStyleRowBandSize w:val="1"/>
       <w:tblStyleColBandSize w:val="1"/>
@@ -10486,6 +10599,9 @@
     <w:pPr>
       <w:spacing w:after="0" w:line="240" w:lineRule="auto"/>
     </w:pPr>
+    <w:rPr>
+      <w:rFonts w:ascii="微软雅黑" w:hAnsi="微软雅黑" w:eastAsia="微软雅黑" w:cs="微软雅黑"/>
+    </w:rPr>
     <w:tblPr>
       <w:tblStyleRowBandSize w:val="1"/>
       <w:tblStyleColBandSize w:val="1"/>
@@ -10635,6 +10751,9 @@
     <w:pPr>
       <w:spacing w:after="0" w:line="240" w:lineRule="auto"/>
     </w:pPr>
+    <w:rPr>
+      <w:rFonts w:ascii="微软雅黑" w:hAnsi="微软雅黑" w:eastAsia="微软雅黑" w:cs="微软雅黑"/>
+    </w:rPr>
     <w:tblPr>
       <w:tblStyleRowBandSize w:val="1"/>
       <w:tblStyleColBandSize w:val="1"/>
@@ -10784,6 +10903,9 @@
     <w:pPr>
       <w:spacing w:after="0" w:line="240" w:lineRule="auto"/>
     </w:pPr>
+    <w:rPr>
+      <w:rFonts w:ascii="微软雅黑" w:hAnsi="微软雅黑" w:eastAsia="微软雅黑" w:cs="微软雅黑"/>
+    </w:rPr>
     <w:tblPr>
       <w:tblStyleRowBandSize w:val="1"/>
       <w:tblStyleColBandSize w:val="1"/>
@@ -10933,6 +11055,9 @@
     <w:pPr>
       <w:spacing w:after="0" w:line="240" w:lineRule="auto"/>
     </w:pPr>
+    <w:rPr>
+      <w:rFonts w:ascii="微软雅黑" w:hAnsi="微软雅黑" w:eastAsia="微软雅黑" w:cs="微软雅黑"/>
+    </w:rPr>
     <w:tblPr>
       <w:tblStyleRowBandSize w:val="1"/>
       <w:tblStyleColBandSize w:val="1"/>
@@ -11082,6 +11207,9 @@
     <w:pPr>
       <w:spacing w:after="0" w:line="240" w:lineRule="auto"/>
     </w:pPr>
+    <w:rPr>
+      <w:rFonts w:ascii="微软雅黑" w:hAnsi="微软雅黑" w:eastAsia="微软雅黑" w:cs="微软雅黑"/>
+    </w:rPr>
     <w:tblPr>
       <w:tblStyleRowBandSize w:val="1"/>
       <w:tblStyleColBandSize w:val="1"/>
@@ -11231,6 +11359,9 @@
     <w:pPr>
       <w:spacing w:after="0" w:line="240" w:lineRule="auto"/>
     </w:pPr>
+    <w:rPr>
+      <w:rFonts w:ascii="微软雅黑" w:hAnsi="微软雅黑" w:eastAsia="微软雅黑" w:cs="微软雅黑"/>
+    </w:rPr>
     <w:tblPr>
       <w:tblStyleRowBandSize w:val="1"/>
       <w:tblStyleColBandSize w:val="1"/>
@@ -11381,6 +11512,7 @@
       <w:spacing w:after="0" w:line="240" w:lineRule="auto"/>
     </w:pPr>
     <w:rPr>
+      <w:rFonts w:ascii="微软雅黑" w:hAnsi="微软雅黑" w:eastAsia="微软雅黑" w:cs="微软雅黑"/>
       <w:color w:val="000000" w:themeColor="text1"/>
     </w:rPr>
     <w:tblPr>
@@ -11400,7 +11532,7 @@
     </w:tblPr>
     <w:tblStylePr w:type="firstRow">
       <w:rPr>
-        <w:rFonts w:asciiTheme="majorHAnsi" w:eastAsiaTheme="majorEastAsia" w:hAnsiTheme="majorHAnsi" w:cstheme="majorBidi"/>
+        <w:rFonts w:ascii="微软雅黑" w:hAnsi="微软雅黑" w:eastAsia="微软雅黑" w:cs="微软雅黑"/>
       </w:rPr>
       <w:tblPr/>
       <w:tcPr>
@@ -11465,6 +11597,7 @@
       <w:spacing w:after="0" w:line="240" w:lineRule="auto"/>
     </w:pPr>
     <w:rPr>
+      <w:rFonts w:ascii="微软雅黑" w:hAnsi="微软雅黑" w:eastAsia="微软雅黑" w:cs="微软雅黑"/>
       <w:color w:val="000000" w:themeColor="text1"/>
     </w:rPr>
     <w:tblPr>
@@ -11484,7 +11617,7 @@
     </w:tblPr>
     <w:tblStylePr w:type="firstRow">
       <w:rPr>
-        <w:rFonts w:asciiTheme="majorHAnsi" w:eastAsiaTheme="majorEastAsia" w:hAnsiTheme="majorHAnsi" w:cstheme="majorBidi"/>
+        <w:rFonts w:ascii="微软雅黑" w:hAnsi="微软雅黑" w:eastAsia="微软雅黑" w:cs="微软雅黑"/>
       </w:rPr>
       <w:tblPr/>
       <w:tcPr>
@@ -11549,6 +11682,7 @@
       <w:spacing w:after="0" w:line="240" w:lineRule="auto"/>
     </w:pPr>
     <w:rPr>
+      <w:rFonts w:ascii="微软雅黑" w:hAnsi="微软雅黑" w:eastAsia="微软雅黑" w:cs="微软雅黑"/>
       <w:color w:val="000000" w:themeColor="text1"/>
     </w:rPr>
     <w:tblPr>
@@ -11568,7 +11702,7 @@
     </w:tblPr>
     <w:tblStylePr w:type="firstRow">
       <w:rPr>
-        <w:rFonts w:asciiTheme="majorHAnsi" w:eastAsiaTheme="majorEastAsia" w:hAnsiTheme="majorHAnsi" w:cstheme="majorBidi"/>
+        <w:rFonts w:ascii="微软雅黑" w:hAnsi="微软雅黑" w:eastAsia="微软雅黑" w:cs="微软雅黑"/>
       </w:rPr>
       <w:tblPr/>
       <w:tcPr>
@@ -11633,6 +11767,7 @@
       <w:spacing w:after="0" w:line="240" w:lineRule="auto"/>
     </w:pPr>
     <w:rPr>
+      <w:rFonts w:ascii="微软雅黑" w:hAnsi="微软雅黑" w:eastAsia="微软雅黑" w:cs="微软雅黑"/>
       <w:color w:val="000000" w:themeColor="text1"/>
     </w:rPr>
     <w:tblPr>
@@ -11652,7 +11787,7 @@
     </w:tblPr>
     <w:tblStylePr w:type="firstRow">
       <w:rPr>
-        <w:rFonts w:asciiTheme="majorHAnsi" w:eastAsiaTheme="majorEastAsia" w:hAnsiTheme="majorHAnsi" w:cstheme="majorBidi"/>
+        <w:rFonts w:ascii="微软雅黑" w:hAnsi="微软雅黑" w:eastAsia="微软雅黑" w:cs="微软雅黑"/>
       </w:rPr>
       <w:tblPr/>
       <w:tcPr>
@@ -11717,6 +11852,7 @@
       <w:spacing w:after="0" w:line="240" w:lineRule="auto"/>
     </w:pPr>
     <w:rPr>
+      <w:rFonts w:ascii="微软雅黑" w:hAnsi="微软雅黑" w:eastAsia="微软雅黑" w:cs="微软雅黑"/>
       <w:color w:val="000000" w:themeColor="text1"/>
     </w:rPr>
     <w:tblPr>
@@ -11736,7 +11872,7 @@
     </w:tblPr>
     <w:tblStylePr w:type="firstRow">
       <w:rPr>
-        <w:rFonts w:asciiTheme="majorHAnsi" w:eastAsiaTheme="majorEastAsia" w:hAnsiTheme="majorHAnsi" w:cstheme="majorBidi"/>
+        <w:rFonts w:ascii="微软雅黑" w:hAnsi="微软雅黑" w:eastAsia="微软雅黑" w:cs="微软雅黑"/>
       </w:rPr>
       <w:tblPr/>
       <w:tcPr>
@@ -11801,6 +11937,7 @@
       <w:spacing w:after="0" w:line="240" w:lineRule="auto"/>
     </w:pPr>
     <w:rPr>
+      <w:rFonts w:ascii="微软雅黑" w:hAnsi="微软雅黑" w:eastAsia="微软雅黑" w:cs="微软雅黑"/>
       <w:color w:val="000000" w:themeColor="text1"/>
     </w:rPr>
     <w:tblPr>
@@ -11820,7 +11957,7 @@
     </w:tblPr>
     <w:tblStylePr w:type="firstRow">
       <w:rPr>
-        <w:rFonts w:asciiTheme="majorHAnsi" w:eastAsiaTheme="majorEastAsia" w:hAnsiTheme="majorHAnsi" w:cstheme="majorBidi"/>
+        <w:rFonts w:ascii="微软雅黑" w:hAnsi="微软雅黑" w:eastAsia="微软雅黑" w:cs="微软雅黑"/>
       </w:rPr>
       <w:tblPr/>
       <w:tcPr>
@@ -11885,6 +12022,7 @@
       <w:spacing w:after="0" w:line="240" w:lineRule="auto"/>
     </w:pPr>
     <w:rPr>
+      <w:rFonts w:ascii="微软雅黑" w:hAnsi="微软雅黑" w:eastAsia="微软雅黑" w:cs="微软雅黑"/>
       <w:color w:val="000000" w:themeColor="text1"/>
     </w:rPr>
     <w:tblPr>
@@ -11904,7 +12042,7 @@
     </w:tblPr>
     <w:tblStylePr w:type="firstRow">
       <w:rPr>
-        <w:rFonts w:asciiTheme="majorHAnsi" w:eastAsiaTheme="majorEastAsia" w:hAnsiTheme="majorHAnsi" w:cstheme="majorBidi"/>
+        <w:rFonts w:ascii="微软雅黑" w:hAnsi="微软雅黑" w:eastAsia="微软雅黑" w:cs="微软雅黑"/>
       </w:rPr>
       <w:tblPr/>
       <w:tcPr>
@@ -11969,7 +12107,7 @@
       <w:spacing w:after="0" w:line="240" w:lineRule="auto"/>
     </w:pPr>
     <w:rPr>
-      <w:rFonts w:asciiTheme="majorHAnsi" w:eastAsiaTheme="majorEastAsia" w:hAnsiTheme="majorHAnsi" w:cstheme="majorBidi"/>
+      <w:rFonts w:ascii="微软雅黑" w:hAnsi="微软雅黑" w:eastAsia="微软雅黑" w:cs="微软雅黑"/>
       <w:color w:val="000000" w:themeColor="text1"/>
     </w:rPr>
     <w:tblPr>
@@ -12097,7 +12235,7 @@
       <w:spacing w:after="0" w:line="240" w:lineRule="auto"/>
     </w:pPr>
     <w:rPr>
-      <w:rFonts w:asciiTheme="majorHAnsi" w:eastAsiaTheme="majorEastAsia" w:hAnsiTheme="majorHAnsi" w:cstheme="majorBidi"/>
+      <w:rFonts w:ascii="微软雅黑" w:hAnsi="微软雅黑" w:eastAsia="微软雅黑" w:cs="微软雅黑"/>
       <w:color w:val="000000" w:themeColor="text1"/>
     </w:rPr>
     <w:tblPr>
@@ -12225,7 +12363,7 @@
       <w:spacing w:after="0" w:line="240" w:lineRule="auto"/>
     </w:pPr>
     <w:rPr>
-      <w:rFonts w:asciiTheme="majorHAnsi" w:eastAsiaTheme="majorEastAsia" w:hAnsiTheme="majorHAnsi" w:cstheme="majorBidi"/>
+      <w:rFonts w:ascii="微软雅黑" w:hAnsi="微软雅黑" w:eastAsia="微软雅黑" w:cs="微软雅黑"/>
       <w:color w:val="000000" w:themeColor="text1"/>
     </w:rPr>
     <w:tblPr>
@@ -12353,7 +12491,7 @@
       <w:spacing w:after="0" w:line="240" w:lineRule="auto"/>
     </w:pPr>
     <w:rPr>
-      <w:rFonts w:asciiTheme="majorHAnsi" w:eastAsiaTheme="majorEastAsia" w:hAnsiTheme="majorHAnsi" w:cstheme="majorBidi"/>
+      <w:rFonts w:ascii="微软雅黑" w:hAnsi="微软雅黑" w:eastAsia="微软雅黑" w:cs="微软雅黑"/>
       <w:color w:val="000000" w:themeColor="text1"/>
     </w:rPr>
     <w:tblPr>
@@ -12481,7 +12619,7 @@
       <w:spacing w:after="0" w:line="240" w:lineRule="auto"/>
     </w:pPr>
     <w:rPr>
-      <w:rFonts w:asciiTheme="majorHAnsi" w:eastAsiaTheme="majorEastAsia" w:hAnsiTheme="majorHAnsi" w:cstheme="majorBidi"/>
+      <w:rFonts w:ascii="微软雅黑" w:hAnsi="微软雅黑" w:eastAsia="微软雅黑" w:cs="微软雅黑"/>
       <w:color w:val="000000" w:themeColor="text1"/>
     </w:rPr>
     <w:tblPr>
@@ -12609,7 +12747,7 @@
       <w:spacing w:after="0" w:line="240" w:lineRule="auto"/>
     </w:pPr>
     <w:rPr>
-      <w:rFonts w:asciiTheme="majorHAnsi" w:eastAsiaTheme="majorEastAsia" w:hAnsiTheme="majorHAnsi" w:cstheme="majorBidi"/>
+      <w:rFonts w:ascii="微软雅黑" w:hAnsi="微软雅黑" w:eastAsia="微软雅黑" w:cs="微软雅黑"/>
       <w:color w:val="000000" w:themeColor="text1"/>
     </w:rPr>
     <w:tblPr>
@@ -12737,7 +12875,7 @@
       <w:spacing w:after="0" w:line="240" w:lineRule="auto"/>
     </w:pPr>
     <w:rPr>
-      <w:rFonts w:asciiTheme="majorHAnsi" w:eastAsiaTheme="majorEastAsia" w:hAnsiTheme="majorHAnsi" w:cstheme="majorBidi"/>
+      <w:rFonts w:ascii="微软雅黑" w:hAnsi="微软雅黑" w:eastAsia="微软雅黑" w:cs="微软雅黑"/>
       <w:color w:val="000000" w:themeColor="text1"/>
     </w:rPr>
     <w:tblPr>
@@ -12864,6 +13002,9 @@
     <w:pPr>
       <w:spacing w:after="0" w:line="240" w:lineRule="auto"/>
     </w:pPr>
+    <w:rPr>
+      <w:rFonts w:ascii="微软雅黑" w:hAnsi="微软雅黑" w:eastAsia="微软雅黑" w:cs="微软雅黑"/>
+    </w:rPr>
     <w:tblPr>
       <w:tblStyleRowBandSize w:val="1"/>
       <w:tblStyleColBandSize w:val="1"/>
@@ -12937,6 +13078,9 @@
     <w:pPr>
       <w:spacing w:after="0" w:line="240" w:lineRule="auto"/>
     </w:pPr>
+    <w:rPr>
+      <w:rFonts w:ascii="微软雅黑" w:hAnsi="微软雅黑" w:eastAsia="微软雅黑" w:cs="微软雅黑"/>
+    </w:rPr>
     <w:tblPr>
       <w:tblStyleRowBandSize w:val="1"/>
       <w:tblStyleColBandSize w:val="1"/>
@@ -13010,6 +13154,9 @@
     <w:pPr>
       <w:spacing w:after="0" w:line="240" w:lineRule="auto"/>
     </w:pPr>
+    <w:rPr>
+      <w:rFonts w:ascii="微软雅黑" w:hAnsi="微软雅黑" w:eastAsia="微软雅黑" w:cs="微软雅黑"/>
+    </w:rPr>
     <w:tblPr>
       <w:tblStyleRowBandSize w:val="1"/>
       <w:tblStyleColBandSize w:val="1"/>
@@ -13083,6 +13230,9 @@
     <w:pPr>
       <w:spacing w:after="0" w:line="240" w:lineRule="auto"/>
     </w:pPr>
+    <w:rPr>
+      <w:rFonts w:ascii="微软雅黑" w:hAnsi="微软雅黑" w:eastAsia="微软雅黑" w:cs="微软雅黑"/>
+    </w:rPr>
     <w:tblPr>
       <w:tblStyleRowBandSize w:val="1"/>
       <w:tblStyleColBandSize w:val="1"/>
@@ -13156,6 +13306,9 @@
     <w:pPr>
       <w:spacing w:after="0" w:line="240" w:lineRule="auto"/>
     </w:pPr>
+    <w:rPr>
+      <w:rFonts w:ascii="微软雅黑" w:hAnsi="微软雅黑" w:eastAsia="微软雅黑" w:cs="微软雅黑"/>
+    </w:rPr>
     <w:tblPr>
       <w:tblStyleRowBandSize w:val="1"/>
       <w:tblStyleColBandSize w:val="1"/>
@@ -13229,6 +13382,9 @@
     <w:pPr>
       <w:spacing w:after="0" w:line="240" w:lineRule="auto"/>
     </w:pPr>
+    <w:rPr>
+      <w:rFonts w:ascii="微软雅黑" w:hAnsi="微软雅黑" w:eastAsia="微软雅黑" w:cs="微软雅黑"/>
+    </w:rPr>
     <w:tblPr>
       <w:tblStyleRowBandSize w:val="1"/>
       <w:tblStyleColBandSize w:val="1"/>
@@ -13302,6 +13458,9 @@
     <w:pPr>
       <w:spacing w:after="0" w:line="240" w:lineRule="auto"/>
     </w:pPr>
+    <w:rPr>
+      <w:rFonts w:ascii="微软雅黑" w:hAnsi="微软雅黑" w:eastAsia="微软雅黑" w:cs="微软雅黑"/>
+    </w:rPr>
     <w:tblPr>
       <w:tblStyleRowBandSize w:val="1"/>
       <w:tblStyleColBandSize w:val="1"/>
@@ -13376,7 +13535,7 @@
       <w:spacing w:after="0" w:line="240" w:lineRule="auto"/>
     </w:pPr>
     <w:rPr>
-      <w:rFonts w:asciiTheme="majorHAnsi" w:eastAsiaTheme="majorEastAsia" w:hAnsiTheme="majorHAnsi" w:cstheme="majorBidi"/>
+      <w:rFonts w:ascii="微软雅黑" w:hAnsi="微软雅黑" w:eastAsia="微软雅黑" w:cs="微软雅黑"/>
       <w:color w:val="000000" w:themeColor="text1"/>
     </w:rPr>
     <w:tblPr>
@@ -13501,7 +13660,7 @@
       <w:spacing w:after="0" w:line="240" w:lineRule="auto"/>
     </w:pPr>
     <w:rPr>
-      <w:rFonts w:asciiTheme="majorHAnsi" w:eastAsiaTheme="majorEastAsia" w:hAnsiTheme="majorHAnsi" w:cstheme="majorBidi"/>
+      <w:rFonts w:ascii="微软雅黑" w:hAnsi="微软雅黑" w:eastAsia="微软雅黑" w:cs="微软雅黑"/>
       <w:color w:val="000000" w:themeColor="text1"/>
     </w:rPr>
     <w:tblPr>
@@ -13626,7 +13785,7 @@
       <w:spacing w:after="0" w:line="240" w:lineRule="auto"/>
     </w:pPr>
     <w:rPr>
-      <w:rFonts w:asciiTheme="majorHAnsi" w:eastAsiaTheme="majorEastAsia" w:hAnsiTheme="majorHAnsi" w:cstheme="majorBidi"/>
+      <w:rFonts w:ascii="微软雅黑" w:hAnsi="微软雅黑" w:eastAsia="微软雅黑" w:cs="微软雅黑"/>
       <w:color w:val="000000" w:themeColor="text1"/>
     </w:rPr>
     <w:tblPr>
@@ -13751,7 +13910,7 @@
       <w:spacing w:after="0" w:line="240" w:lineRule="auto"/>
     </w:pPr>
     <w:rPr>
-      <w:rFonts w:asciiTheme="majorHAnsi" w:eastAsiaTheme="majorEastAsia" w:hAnsiTheme="majorHAnsi" w:cstheme="majorBidi"/>
+      <w:rFonts w:ascii="微软雅黑" w:hAnsi="微软雅黑" w:eastAsia="微软雅黑" w:cs="微软雅黑"/>
       <w:color w:val="000000" w:themeColor="text1"/>
     </w:rPr>
     <w:tblPr>
@@ -13876,7 +14035,7 @@
       <w:spacing w:after="0" w:line="240" w:lineRule="auto"/>
     </w:pPr>
     <w:rPr>
-      <w:rFonts w:asciiTheme="majorHAnsi" w:eastAsiaTheme="majorEastAsia" w:hAnsiTheme="majorHAnsi" w:cstheme="majorBidi"/>
+      <w:rFonts w:ascii="微软雅黑" w:hAnsi="微软雅黑" w:eastAsia="微软雅黑" w:cs="微软雅黑"/>
       <w:color w:val="000000" w:themeColor="text1"/>
     </w:rPr>
     <w:tblPr>
@@ -14001,7 +14160,7 @@
       <w:spacing w:after="0" w:line="240" w:lineRule="auto"/>
     </w:pPr>
     <w:rPr>
-      <w:rFonts w:asciiTheme="majorHAnsi" w:eastAsiaTheme="majorEastAsia" w:hAnsiTheme="majorHAnsi" w:cstheme="majorBidi"/>
+      <w:rFonts w:ascii="微软雅黑" w:hAnsi="微软雅黑" w:eastAsia="微软雅黑" w:cs="微软雅黑"/>
       <w:color w:val="000000" w:themeColor="text1"/>
     </w:rPr>
     <w:tblPr>
@@ -14126,7 +14285,7 @@
       <w:spacing w:after="0" w:line="240" w:lineRule="auto"/>
     </w:pPr>
     <w:rPr>
-      <w:rFonts w:asciiTheme="majorHAnsi" w:eastAsiaTheme="majorEastAsia" w:hAnsiTheme="majorHAnsi" w:cstheme="majorBidi"/>
+      <w:rFonts w:ascii="微软雅黑" w:hAnsi="微软雅黑" w:eastAsia="微软雅黑" w:cs="微软雅黑"/>
       <w:color w:val="000000" w:themeColor="text1"/>
     </w:rPr>
     <w:tblPr>
@@ -14250,6 +14409,9 @@
     <w:pPr>
       <w:spacing w:after="0" w:line="240" w:lineRule="auto"/>
     </w:pPr>
+    <w:rPr>
+      <w:rFonts w:ascii="微软雅黑" w:hAnsi="微软雅黑" w:eastAsia="微软雅黑" w:cs="微软雅黑"/>
+    </w:rPr>
     <w:tblPr>
       <w:tblStyleRowBandSize w:val="1"/>
       <w:tblStyleColBandSize w:val="1"/>
@@ -14391,6 +14553,9 @@
     <w:pPr>
       <w:spacing w:after="0" w:line="240" w:lineRule="auto"/>
     </w:pPr>
+    <w:rPr>
+      <w:rFonts w:ascii="微软雅黑" w:hAnsi="微软雅黑" w:eastAsia="微软雅黑" w:cs="微软雅黑"/>
+    </w:rPr>
     <w:tblPr>
       <w:tblStyleRowBandSize w:val="1"/>
       <w:tblStyleColBandSize w:val="1"/>
@@ -14532,6 +14697,9 @@
     <w:pPr>
       <w:spacing w:after="0" w:line="240" w:lineRule="auto"/>
     </w:pPr>
+    <w:rPr>
+      <w:rFonts w:ascii="微软雅黑" w:hAnsi="微软雅黑" w:eastAsia="微软雅黑" w:cs="微软雅黑"/>
+    </w:rPr>
     <w:tblPr>
       <w:tblStyleRowBandSize w:val="1"/>
       <w:tblStyleColBandSize w:val="1"/>
@@ -14673,6 +14841,9 @@
     <w:pPr>
       <w:spacing w:after="0" w:line="240" w:lineRule="auto"/>
     </w:pPr>
+    <w:rPr>
+      <w:rFonts w:ascii="微软雅黑" w:hAnsi="微软雅黑" w:eastAsia="微软雅黑" w:cs="微软雅黑"/>
+    </w:rPr>
     <w:tblPr>
       <w:tblStyleRowBandSize w:val="1"/>
       <w:tblStyleColBandSize w:val="1"/>
@@ -14814,6 +14985,9 @@
     <w:pPr>
       <w:spacing w:after="0" w:line="240" w:lineRule="auto"/>
     </w:pPr>
+    <w:rPr>
+      <w:rFonts w:ascii="微软雅黑" w:hAnsi="微软雅黑" w:eastAsia="微软雅黑" w:cs="微软雅黑"/>
+    </w:rPr>
     <w:tblPr>
       <w:tblStyleRowBandSize w:val="1"/>
       <w:tblStyleColBandSize w:val="1"/>
@@ -14955,6 +15129,9 @@
     <w:pPr>
       <w:spacing w:after="0" w:line="240" w:lineRule="auto"/>
     </w:pPr>
+    <w:rPr>
+      <w:rFonts w:ascii="微软雅黑" w:hAnsi="微软雅黑" w:eastAsia="微软雅黑" w:cs="微软雅黑"/>
+    </w:rPr>
     <w:tblPr>
       <w:tblStyleRowBandSize w:val="1"/>
       <w:tblStyleColBandSize w:val="1"/>
@@ -15096,6 +15273,9 @@
     <w:pPr>
       <w:spacing w:after="0" w:line="240" w:lineRule="auto"/>
     </w:pPr>
+    <w:rPr>
+      <w:rFonts w:ascii="微软雅黑" w:hAnsi="微软雅黑" w:eastAsia="微软雅黑" w:cs="微软雅黑"/>
+    </w:rPr>
     <w:tblPr>
       <w:tblStyleRowBandSize w:val="1"/>
       <w:tblStyleColBandSize w:val="1"/>
@@ -15238,6 +15418,7 @@
       <w:spacing w:after="0" w:line="240" w:lineRule="auto"/>
     </w:pPr>
     <w:rPr>
+      <w:rFonts w:ascii="微软雅黑" w:hAnsi="微软雅黑" w:eastAsia="微软雅黑" w:cs="微软雅黑"/>
       <w:color w:val="FFFFFF" w:themeColor="background1"/>
     </w:rPr>
     <w:tblPr>
@@ -15352,6 +15533,7 @@
       <w:spacing w:after="0" w:line="240" w:lineRule="auto"/>
     </w:pPr>
     <w:rPr>
+      <w:rFonts w:ascii="微软雅黑" w:hAnsi="微软雅黑" w:eastAsia="微软雅黑" w:cs="微软雅黑"/>
       <w:color w:val="FFFFFF" w:themeColor="background1"/>
     </w:rPr>
     <w:tblPr>
@@ -15466,6 +15648,7 @@
       <w:spacing w:after="0" w:line="240" w:lineRule="auto"/>
     </w:pPr>
     <w:rPr>
+      <w:rFonts w:ascii="微软雅黑" w:hAnsi="微软雅黑" w:eastAsia="微软雅黑" w:cs="微软雅黑"/>
       <w:color w:val="FFFFFF" w:themeColor="background1"/>
     </w:rPr>
     <w:tblPr>
@@ -15580,6 +15763,7 @@
       <w:spacing w:after="0" w:line="240" w:lineRule="auto"/>
     </w:pPr>
     <w:rPr>
+      <w:rFonts w:ascii="微软雅黑" w:hAnsi="微软雅黑" w:eastAsia="微软雅黑" w:cs="微软雅黑"/>
       <w:color w:val="FFFFFF" w:themeColor="background1"/>
     </w:rPr>
     <w:tblPr>
@@ -15694,6 +15878,7 @@
       <w:spacing w:after="0" w:line="240" w:lineRule="auto"/>
     </w:pPr>
     <w:rPr>
+      <w:rFonts w:ascii="微软雅黑" w:hAnsi="微软雅黑" w:eastAsia="微软雅黑" w:cs="微软雅黑"/>
       <w:color w:val="FFFFFF" w:themeColor="background1"/>
     </w:rPr>
     <w:tblPr>
@@ -15808,6 +15993,7 @@
       <w:spacing w:after="0" w:line="240" w:lineRule="auto"/>
     </w:pPr>
     <w:rPr>
+      <w:rFonts w:ascii="微软雅黑" w:hAnsi="微软雅黑" w:eastAsia="微软雅黑" w:cs="微软雅黑"/>
       <w:color w:val="FFFFFF" w:themeColor="background1"/>
     </w:rPr>
     <w:tblPr>
@@ -15922,6 +16108,7 @@
       <w:spacing w:after="0" w:line="240" w:lineRule="auto"/>
     </w:pPr>
     <w:rPr>
+      <w:rFonts w:ascii="微软雅黑" w:hAnsi="微软雅黑" w:eastAsia="微软雅黑" w:cs="微软雅黑"/>
       <w:color w:val="FFFFFF" w:themeColor="background1"/>
     </w:rPr>
     <w:tblPr>
@@ -16036,6 +16223,7 @@
       <w:spacing w:after="0" w:line="240" w:lineRule="auto"/>
     </w:pPr>
     <w:rPr>
+      <w:rFonts w:ascii="微软雅黑" w:hAnsi="微软雅黑" w:eastAsia="微软雅黑" w:cs="微软雅黑"/>
       <w:color w:val="000000" w:themeColor="text1"/>
     </w:rPr>
     <w:tblPr>
@@ -16158,6 +16346,7 @@
       <w:spacing w:after="0" w:line="240" w:lineRule="auto"/>
     </w:pPr>
     <w:rPr>
+      <w:rFonts w:ascii="微软雅黑" w:hAnsi="微软雅黑" w:eastAsia="微软雅黑" w:cs="微软雅黑"/>
       <w:color w:val="000000" w:themeColor="text1"/>
     </w:rPr>
     <w:tblPr>
@@ -16280,6 +16469,7 @@
       <w:spacing w:after="0" w:line="240" w:lineRule="auto"/>
     </w:pPr>
     <w:rPr>
+      <w:rFonts w:ascii="微软雅黑" w:hAnsi="微软雅黑" w:eastAsia="微软雅黑" w:cs="微软雅黑"/>
       <w:color w:val="000000" w:themeColor="text1"/>
     </w:rPr>
     <w:tblPr>
@@ -16402,6 +16592,7 @@
       <w:spacing w:after="0" w:line="240" w:lineRule="auto"/>
     </w:pPr>
     <w:rPr>
+      <w:rFonts w:ascii="微软雅黑" w:hAnsi="微软雅黑" w:eastAsia="微软雅黑" w:cs="微软雅黑"/>
       <w:color w:val="000000" w:themeColor="text1"/>
     </w:rPr>
     <w:tblPr>
@@ -16514,6 +16705,7 @@
       <w:spacing w:after="0" w:line="240" w:lineRule="auto"/>
     </w:pPr>
     <w:rPr>
+      <w:rFonts w:ascii="微软雅黑" w:hAnsi="微软雅黑" w:eastAsia="微软雅黑" w:cs="微软雅黑"/>
       <w:color w:val="000000" w:themeColor="text1"/>
     </w:rPr>
     <w:tblPr>
@@ -16636,6 +16828,7 @@
       <w:spacing w:after="0" w:line="240" w:lineRule="auto"/>
     </w:pPr>
     <w:rPr>
+      <w:rFonts w:ascii="微软雅黑" w:hAnsi="微软雅黑" w:eastAsia="微软雅黑" w:cs="微软雅黑"/>
       <w:color w:val="000000" w:themeColor="text1"/>
     </w:rPr>
     <w:tblPr>
@@ -16758,6 +16951,7 @@
       <w:spacing w:after="0" w:line="240" w:lineRule="auto"/>
     </w:pPr>
     <w:rPr>
+      <w:rFonts w:ascii="微软雅黑" w:hAnsi="微软雅黑" w:eastAsia="微软雅黑" w:cs="微软雅黑"/>
       <w:color w:val="000000" w:themeColor="text1"/>
     </w:rPr>
     <w:tblPr>
@@ -16880,6 +17074,7 @@
       <w:spacing w:after="0" w:line="240" w:lineRule="auto"/>
     </w:pPr>
     <w:rPr>
+      <w:rFonts w:ascii="微软雅黑" w:hAnsi="微软雅黑" w:eastAsia="微软雅黑" w:cs="微软雅黑"/>
       <w:color w:val="000000" w:themeColor="text1"/>
     </w:rPr>
     <w:tblPr>
@@ -16966,6 +17161,7 @@
       <w:spacing w:after="0" w:line="240" w:lineRule="auto"/>
     </w:pPr>
     <w:rPr>
+      <w:rFonts w:ascii="微软雅黑" w:hAnsi="微软雅黑" w:eastAsia="微软雅黑" w:cs="微软雅黑"/>
       <w:color w:val="000000" w:themeColor="text1"/>
     </w:rPr>
     <w:tblPr>
@@ -17052,6 +17248,7 @@
       <w:spacing w:after="0" w:line="240" w:lineRule="auto"/>
     </w:pPr>
     <w:rPr>
+      <w:rFonts w:ascii="微软雅黑" w:hAnsi="微软雅黑" w:eastAsia="微软雅黑" w:cs="微软雅黑"/>
       <w:color w:val="000000" w:themeColor="text1"/>
     </w:rPr>
     <w:tblPr>
@@ -17138,6 +17335,7 @@
       <w:spacing w:after="0" w:line="240" w:lineRule="auto"/>
     </w:pPr>
     <w:rPr>
+      <w:rFonts w:ascii="微软雅黑" w:hAnsi="微软雅黑" w:eastAsia="微软雅黑" w:cs="微软雅黑"/>
       <w:color w:val="000000" w:themeColor="text1"/>
     </w:rPr>
     <w:tblPr>
@@ -17224,6 +17422,7 @@
       <w:spacing w:after="0" w:line="240" w:lineRule="auto"/>
     </w:pPr>
     <w:rPr>
+      <w:rFonts w:ascii="微软雅黑" w:hAnsi="微软雅黑" w:eastAsia="微软雅黑" w:cs="微软雅黑"/>
       <w:color w:val="000000" w:themeColor="text1"/>
     </w:rPr>
     <w:tblPr>
@@ -17310,6 +17509,7 @@
       <w:spacing w:after="0" w:line="240" w:lineRule="auto"/>
     </w:pPr>
     <w:rPr>
+      <w:rFonts w:ascii="微软雅黑" w:hAnsi="微软雅黑" w:eastAsia="微软雅黑" w:cs="微软雅黑"/>
       <w:color w:val="000000" w:themeColor="text1"/>
     </w:rPr>
     <w:tblPr>
@@ -17396,6 +17596,7 @@
       <w:spacing w:after="0" w:line="240" w:lineRule="auto"/>
     </w:pPr>
     <w:rPr>
+      <w:rFonts w:ascii="微软雅黑" w:hAnsi="微软雅黑" w:eastAsia="微软雅黑" w:cs="微软雅黑"/>
       <w:color w:val="000000" w:themeColor="text1"/>
     </w:rPr>
     <w:tblPr>
@@ -17482,6 +17683,7 @@
       <w:spacing w:after="0" w:line="240" w:lineRule="auto"/>
     </w:pPr>
     <w:rPr>
+      <w:rFonts w:ascii="微软雅黑" w:hAnsi="微软雅黑" w:eastAsia="微软雅黑" w:cs="微软雅黑"/>
       <w:color w:val="000000" w:themeColor="text1"/>
     </w:rPr>
     <w:tblPr>
@@ -17562,6 +17764,7 @@
       <w:spacing w:after="0" w:line="240" w:lineRule="auto"/>
     </w:pPr>
     <w:rPr>
+      <w:rFonts w:ascii="微软雅黑" w:hAnsi="微软雅黑" w:eastAsia="微软雅黑" w:cs="微软雅黑"/>
       <w:color w:val="000000" w:themeColor="text1"/>
     </w:rPr>
     <w:tblPr>
@@ -17642,6 +17845,7 @@
       <w:spacing w:after="0" w:line="240" w:lineRule="auto"/>
     </w:pPr>
     <w:rPr>
+      <w:rFonts w:ascii="微软雅黑" w:hAnsi="微软雅黑" w:eastAsia="微软雅黑" w:cs="微软雅黑"/>
       <w:color w:val="000000" w:themeColor="text1"/>
     </w:rPr>
     <w:tblPr>
@@ -17722,6 +17926,7 @@
       <w:spacing w:after="0" w:line="240" w:lineRule="auto"/>
     </w:pPr>
     <w:rPr>
+      <w:rFonts w:ascii="微软雅黑" w:hAnsi="微软雅黑" w:eastAsia="微软雅黑" w:cs="微软雅黑"/>
       <w:color w:val="000000" w:themeColor="text1"/>
     </w:rPr>
     <w:tblPr>
@@ -17802,6 +18007,7 @@
       <w:spacing w:after="0" w:line="240" w:lineRule="auto"/>
     </w:pPr>
     <w:rPr>
+      <w:rFonts w:ascii="微软雅黑" w:hAnsi="微软雅黑" w:eastAsia="微软雅黑" w:cs="微软雅黑"/>
       <w:color w:val="000000" w:themeColor="text1"/>
     </w:rPr>
     <w:tblPr>
@@ -17882,6 +18088,7 @@
       <w:spacing w:after="0" w:line="240" w:lineRule="auto"/>
     </w:pPr>
     <w:rPr>
+      <w:rFonts w:ascii="微软雅黑" w:hAnsi="微软雅黑" w:eastAsia="微软雅黑" w:cs="微软雅黑"/>
       <w:color w:val="000000" w:themeColor="text1"/>
     </w:rPr>
     <w:tblPr>
@@ -17962,6 +18169,7 @@
       <w:spacing w:after="0" w:line="240" w:lineRule="auto"/>
     </w:pPr>
     <w:rPr>
+      <w:rFonts w:ascii="微软雅黑" w:hAnsi="微软雅黑" w:eastAsia="微软雅黑" w:cs="微软雅黑"/>
       <w:color w:val="000000" w:themeColor="text1"/>
     </w:rPr>
     <w:tblPr>

</xml_diff>

<commit_message>
Add platform-specific inspiration and publishing preview
</commit_message>
<xml_diff>
--- a/项目说明书.docx
+++ b/项目说明书.docx
@@ -1071,11 +1071,7 @@
     </w:p>
     <w:p>
       <w:r>
-        <w:rPr>
-          <w:rFonts w:ascii="微软雅黑" w:hAnsi="微软雅黑" w:eastAsia="微软雅黑" w:cs="微软雅黑"/>
-          <w:b w:val="0"/>
-        </w:rPr>
-        <w:t>平台 Skills 把“发到哪里”转化为具体写法。产品事实保持一致，内容角度、段落结构、语气、配图计划和行动引导随平台变化，减少员工拿到稿件后再手工改成平台风格的工作。</w:t>
+        <w:t>平台 Skills 从选题开始：小红书分享生活经验或姿态，公众号提出有理由的判断。灵感先搜索核源，事件要相关，表达可跨场景；按来源时间和传播证据区分表达参考与热门梗，用户选定后再创作。成稿可在“发布预览”检查平台效果。</w:t>
       </w:r>
     </w:p>
     <w:tbl>

</xml_diff>